<commit_message>
Proofcheck Flour Play Polish: SIGNIFICANT (38 edits)
Co-Authored-By: Claude Opus 5.5 <noreply@anthropic.com>
Claude-Session: https://claude.ai/code/session_012Cm8JxdqzjuttdUSdkQCUg
</commit_message>
<xml_diff>
--- a/translated/corrected/Flour Play - ASSEMBLED - FORMATTED_Polish.docx
+++ b/translated/corrected/Flour Play - ASSEMBLED - FORMATTED_Polish.docx
@@ -114,13 +114,13 @@
     <w:p/>
     <w:p>
       <w:r>
-        <w:t>Greta piekła dokładnie tę samą bułeczkę cynamonową przez czterdzieści lat. Zrobiła ją rankiem po pogrzebie męża, ponieważ nie wiedziała, co innego począć z rękami. W tym tygodniu wyciąga je z pieca kwaśne, kolejna partia jest taka sama, i ta następna również.</w:t>
-      </w:r>
-    </w:p>
-    <w:p/>
-    <w:p>
-      <w:r>
-        <w:t>Nowa mąka. Nowa woda. Pożyczona waga. Wciąż kwaśne. Do czwartku Greta stoi we własnej piekarni, mówiąc Jessice Claus, że jej dłonie wreszcie zapomniały jak.</w:t>
+        <w:t xml:space="preserve">Greta od czterdziestu lat piecze dokładnie tę samą bułeczkę cynamonową. Zrobiła ją rankiem po pogrzebie męża, ponieważ nie wiedziała, co innego począć z rękami. W tym tygodniu wychodzi jej z pieca kwaśna, kolejna partia też, i ta następna również.</w:t>
+      </w:r>
+    </w:p>
+    <w:p/>
+    <w:p>
+      <w:r>
+        <w:t xml:space="preserve">Nowa mąka. Nowa woda. Pożyczona waga. Wciąż kwaśne. W czwartek Greta stoi już we własnej piekarni, mówiąc Jessice Claus, że jej dłonie wreszcie zapomniały jak.</w:t>
       </w:r>
     </w:p>
     <w:p/>
@@ -132,7 +132,7 @@
     <w:p/>
     <w:p>
       <w:r>
-        <w:t>Miasteczko sięga po łatwe wyjaśnienia: rzeźnik, który zablokował bramę ładunkową, rodzina zalegająca z rachunkami za olej, nudzący się chłopak z kradzioną puszką. Jessica szuka tego, co pasuje — ponieważ ktokolwiek to zrobił, kupił proszek, znał dawkę i złożył skargę powołującą się na odpowiedni podpunkt przepisów sanitarnych. To nie jest wybuch złości. To fachowa robota.</w:t>
+        <w:t xml:space="preserve">Miasteczko sięga po łatwe wyjaśnienia: rzeźnik, który zablokował bramę ładunkową, rodzina zalegająca z rachunkami za olej opałowy, nudzący się chłopak z kradzioną puszką. Jessica szuka tego, co pasuje — ponieważ ktokolwiek to zrobił, kupił proszek, znał dawkę i złożył skargę powołującą się na odpowiedni podpunkt przepisów sanitarnych. To nie jest wybuch złości. To fachowa robota.</w:t>
       </w:r>
     </w:p>
     <w:p/>
@@ -290,7 +290,7 @@
     <w:p/>
     <w:p>
       <w:r>
-        <w:t xml:space="preserve">— Niech nikt nie wstaje — oznajmiła, choć nikt nie przejawiał najmniejszego zamiaru zrobienia tego. Położyła na stole pudło cukiernicze wielkości pudełka na kapelusz, pomiędzy szyszkami a wstążką, i opierając dłonie na biodrach, omiotła nas wzrokiem. Greta była właścicielką </w:t>
+        <w:t xml:space="preserve">— Niech nikt nie wstaje — oznajmiła, choć nikt nie przejawiał najmniejszego zamiaru zrobienia tego. Położyła na stole pudło z piekarni wielkości pudełka na kapelusz, pomiędzy szyszkami a wstążką, i opierając dłonie na biodrach, omiotła nas wzrokiem. Greta była właścicielką </w:t>
       </w:r>
       <w:r>
         <w:t xml:space="preserve"/>
@@ -302,7 +302,7 @@
         <w:t xml:space="preserve"/>
       </w:r>
       <w:r>
-        <w:t xml:space="preserve"> przy alei i zbudowana była niczym własne pączki — okrągła i cała oprószona. Tego ranka miała fartuch tak zaznaczony mąką, że nawet nie zadała sobie trudu, by ją otrzepać. — Blacha czekoladowo-orzechowych babeczek wyszła mi z pieca niespełna godzinę temu i pomyślałam sobie: „Greta, kto tam siedzi w zimnym sklepie i robi pożyteczną robotę o poranku?”, a odpowiedź brzmiała, że wy wszystkie, więc proszę bardzo.</w:t>
+        <w:t xml:space="preserve"> przy alei i zbudowana była niczym własne pączki — okrągła i cała oprószona. Tego ranka cały fartuch miała w mące, której nawet nie zadała sobie trudu otrzepać. — Blacha czekoladowo-pekanowych babeczek wyszła mi z pieca niespełna godzinę temu i pomyślałam sobie: „Greta, kto tam siedzi w zimnym sklepie i robi pożyteczną robotę o poranku?”, a odpowiedź brzmiała, że wy wszystkie, więc proszę bardzo.</w:t>
       </w:r>
     </w:p>
     <w:p/>
@@ -415,7 +415,7 @@
     <w:p/>
     <w:p>
       <w:r>
-        <w:t>— Cóż, cokolwiek to będzie — powiedziała Greta swobodnie, zbierając serwetki — też będą musieli coś jeść jak każdy inny. Zaniosę im placek w dniu otwarcia.</w:t>
+        <w:t xml:space="preserve">— Cóż, kimkolwiek oni są — powiedziała Greta swobodnie, zbierając serwetki — też będą musieli coś jeść jak każdy inny. Zaniosę im placek w dniu otwarcia.</w:t>
       </w:r>
     </w:p>
     <w:p/>
@@ -499,7 +499,7 @@
     <w:p/>
     <w:p>
       <w:r>
-        <w:t>Bo ja znałam tę różnicę. Żyłam już wystarczająco długo obok magii Bożego Narodzenia. Wystarczająco długo, by czuć ją w kościach, tak wyraźnie jak krok na schodach. To nie było dziecko z zesztywniałymi palcami. Magia krążyła swobodnie po Frost Falls. Błąkała się tak od naszego przybycia, szukając domu. Mój mąż budował dla niej jeden. Powoli i cierpliwie w swoim warsztacie — ognisko, w którym mogłaby się rozgościć — a ona zbliżała się do tego ognia z każdym dniem ociupinkę bardziej. Ale nie osiadła jeszcze na dobre. Inaczej mówiąc, wciąż wałęsała się nocami po miasteczku, niezgrabna i pozbawiona jakiejkolwiek złośliwości, czyniąc małe, niemożliwe rzeczy, które magia robi wtedy, gdy ma w sobie więcej uczucia niż rozsądku. Zmieniając świąteczne światełka z pomarańczowych na złote. A teraz, najwyraźniej, spacerując nocą z dziecięcym bałwanem, by spojrzeć na to wszystko, co przykuło jej błądzącą uwagę.</w:t>
+        <w:t xml:space="preserve">Bo ja znałam tę różnicę. Żyłam już wystarczająco długo obok magii Bożego Narodzenia. Wystarczająco długo, by czuć ją w kościach, tak wyraźnie jak krok na schodach. To nie było dziecko z zesztywniałymi palcami. Magia krążyła swobodnie po Frost Falls. Błąkała się tak od naszego przybycia, szukając domu. Mój mąż budował dla niej jeden. Powoli i cierpliwie w swoim warsztacie — ognisko, w którym mogłaby się rozgościć — a ona zbliżała się do tego ognia z każdym dniem ociupinkę bardziej. Ale nie osiadła jeszcze na dobre. Inaczej mówiąc, wciąż wałęsała się nocami po miasteczku, niezgrabna i pozbawiona jakiejkolwiek złośliwości, czyniąc małe, niemożliwe rzeczy, które magia robi wtedy, gdy ma w sobie więcej uczucia niż rozsądku. Zmieniając świąteczne światełka z pomarańczowych na złote. A teraz, najwyraźniej, obracając nocą dziecięcego bałwana przodem do tego, co akurat przykuło jej błądzącą uwagę.</w:t>
       </w:r>
     </w:p>
     <w:p/>
@@ -2082,7 +2082,7 @@
     <w:p/>
     <w:p>
       <w:r>
-        <w:t xml:space="preserve">Nie spojrzałam na nią wprost, odkąd wszedłam. Niełatwo było patrzeć na to pudło wprost, zważywszy na to, co skrywało i co znaczyło dla tego miasteczka po jesieni, jaką wszyscy przeżyliśmy, kiedy pod koniec października wydobyto je z zimnej ziemi spod skweru, po ponad stu latach spędzonych w zamknięciu. Nikt nie rozerwał jej w przypływie surowego żalu okresu, w którym ją odnaleziono. Zamiast tego ustawiono ją tutaj, za czystą szybą, aż do nowego roku. Oparte o nią było ręcznie wypisany kartonik. </w:t>
+        <w:t xml:space="preserve">Nie spojrzałam na nią wprost, odkąd wszedłam. Niełatwo było patrzeć na to pudło wprost, zważywszy na to, co skrywało i co znaczyło dla tego miasteczka po jesieni, jaką wszyscy przeżyliśmy, kiedy pod koniec października wydobyto je z zimnej ziemi spod skweru, po ponad stu latach spędzonych w zamknięciu. Nikt nie rozerwał jej w przypływie surowego żalu okresu, w którym ją odnaleziono. Zamiast tego ustawiono ją tutaj, za czystą szybą, aż do nowego roku. Oparty o nią był ręcznie wypisany kartonik. </w:t>
       </w:r>
       <w:r>
         <w:rPr>
@@ -2703,7 +2703,7 @@
         <w:t>HOLLY JOLLY BAKERY</w:t>
       </w:r>
       <w:r>
-        <w:t xml:space="preserve"> nad wejściem. Tego samego ranka otworzyła drzwi dla klientów, a ich napływ niemal wycisnął jej łzy z oczu. Piece sprawowały się tak samo cudownie, jak wcześniej kaprysiły. Od czasu zdarzenia z cegłą trzymała tylne drzwi zaryglowane na czas wypieków, bez względu na upał w kuchni, a każda kolejna partia wypieków wychodziła słodka i udana. Stała za naprawioną ladą, oprószona mąką i rozpromieniona jak lampka. Sprzedawała pierniczki kolejce stojącej aż na zewnątrz i głośno powtarzała wszystkim, że ani przez chwilę nie wątpiła w magię tego sezonu. To było kłamstwo. Piękne kłamstwo, na które wszyscy na ulicy jej pozwolili.</w:t>
+        <w:t xml:space="preserve"> nad wejściem. Tego samego ranka otworzyła drzwi dla klientów, a ich napływ niemal wycisnął jej łzy z oczu. Piece wróciły do formy równie zagadkowo, jak wcześniej zaczęły kaprysić. Od czasu zdarzenia z cegłą trzymała tylne drzwi zaryglowane na czas wypieków, bez względu na upał w kuchni, a każda kolejna partia wypieków wychodziła słodka i udana. Stała za naprawioną ladą, oprószona mąką i rozpromieniona jak lampka. Sprzedawała pierniczki kolejce stojącej aż na zewnątrz i głośno powtarzała wszystkim, że ani przez chwilę nie wątpiła w magię tego sezonu. To było kłamstwo. Piękne kłamstwo, na które wszyscy na ulicy jej pozwolili.</w:t>
       </w:r>
     </w:p>
     <w:p>
@@ -3589,7 +3589,7 @@
     <w:p/>
     <w:p>
       <w:r>
-        <w:t xml:space="preserve">A Pete Garcia był rzeźnikiem. Znał się na ćwiartkach wołowych co do joty, a odróżnienie kwaśnej bazy od odrobiny kredy sprawiałoby mu taką samą trudność jak mnie rozebranie tuszy na elementy pierwsze. Mógł stać w każdym czarnym poranku swojego życia pod jej otwartymi drzwiami i wciąż brakowałoby mu tej jednej rzeczy, bez której zbrodnia by się nie dokonała. Wiedzy, co ze sobą przynieść.</w:t>
+        <w:t xml:space="preserve">A Pete Garcia był rzeźnikiem. Znał się na ćwiartkach wołowych co do joty, a odróżnienie kwaśnej bazy od odrobiny kredy sprawiałoby mu taką samą trudność jak mnie rozebranie tuszy na elementy pierwsze. Mógł stać pod jej otwartymi drzwiami każdego czarnego poranka swojego życia i wciąż brakowałoby mu tej jednej rzeczy, bez której zbrodnia by się nie dokonała. Wiedzy, co ze sobą przynieść.</w:t>
       </w:r>
     </w:p>
     <w:p/>
@@ -3619,13 +3619,13 @@
     <w:p/>
     <w:p>
       <w:r>
-        <w:t xml:space="preserve">Zastałam go przy pniaku, kiedy sklep był jeszcze zamknięty; rozbijał poranną ćwiartkę. Wyprostował się, gdy zadzwonił dzwonek, odłożył nóż płasko i zesztywniał, tak jak wtedy za pierwszym razem — mężczyzna nauczony spodziewać się po każdym gościu jednego.</w:t>
-      </w:r>
-    </w:p>
-    <w:p/>
-    <w:p>
-      <w:r>
-        <w:t xml:space="preserve">— Nie będę panu przerywać pracy — rzekłam. — Przyszłam panu powiedzieć, że brałam pana pod uwagę. Z powodu kłopotów Grety. Z tego prostego faktu, że o świcie jest pan na tym podwórku i nikt inny nie ma prawa tam przebywać. — Przekonałam się, że najlepiej jest wyłożyć człowiekowi całą tę brzydką sprawę od razu i pozwolić mu się jej przyjrzeć. — Oraz przyszłam panu powiedzieć, że wykreśliłam pana z powrotem. Cokolwiek za tym stoi, wymagało mroku w duszy i piekarskiego fachu do proszku, a pan nie ma ani jednego, ani drugiego. Kłóci się pan w samo południe i rąbie mięso. To do pana nie pasuje.</w:t>
+        <w:t xml:space="preserve">Zastałam go przy pniaku, kiedy sklep był jeszcze zamknięty; rozbierał poranną ćwiartkę. Wyprostował się, gdy zadzwonił dzwonek, odłożył nóż płasko i zesztywniał, tak jak wtedy za pierwszym razem — mężczyzna nauczony spodziewać się po każdym gościu jednego.</w:t>
+      </w:r>
+    </w:p>
+    <w:p/>
+    <w:p>
+      <w:r>
+        <w:t xml:space="preserve">— Nie będę panu przerywać pracy — rzekłam. — Przyszłam panu powiedzieć, że brałam pana pod uwagę. Z powodu kłopotów Grety. Z tego prostego faktu, że o świcie jest pan na tym podwórku i nikt inny nie ma prawa tam przebywać. — Przekonałam się, że najlepiej jest wyłożyć człowiekowi całą tę brzydką sprawę od razu i pozwolić mu się jej przyjrzeć. — Oraz przyszłam panu powiedzieć, że skreśliłam pana z tej listy. Cokolwiek za tym stoi, wymagało usposobienia do działania po ciemku i piekarskiego fachu do proszku, a pan nie ma ani jednego, ani drugiego. Kłóci się pan w samo południe i rąbie mięso. To do pana nie pasuje.</w:t>
       </w:r>
     </w:p>
     <w:p/>
@@ -3667,7 +3667,7 @@
     <w:p/>
     <w:p>
       <w:r>
-        <w:t xml:space="preserve">— Ta sylwetka, o której pani mówiłem — zaczął, pakując kotlet, o który nie prosiłam. — Przy jej tylnych drzwiach w ciemności. Pewnie będzie pani chciała wiedzieć o tym wszystko, skoro mi pani uwierzyła. — Oparł swoje wielkie dłonie płasko na pniaku i spojrzał przez okno na sklepiki Evergreen rozciągające się po drugiej stronie skweru, jakby mógł wzrokiem przebić ich mury i dostrzec podwórko. — Dorosły człowiek. Żaden gówniarz, bez względu na to, co miasto chciałoby przypisać jakiemuś chłopakowi z puszką farby. Wyższy od Grety i poruszający się z wyraźnym celem. Żadnego ociągania się. Żadnego ogrzewania rąk. Wiedział, po co tam przyszedł. I zamaskowany. Długi płaszcz albo fartuch, luźny, taki, w jakim pracuje się, żeby się nie pobrudzić, blady wręcz, powiedziałbym, choć ciemność odjęła mu barwę. Trzymał się blisko jej ściany, tam, gdzie idą dostawy, a żaden uczciwy interes nie prowadzi. A kiedy moje reflektory padły na to miejsce, zniknął — szybko i cicho, nie uciekał w popłochu, po prostu sobie poszedł. Bez pośpiechu. Zrobione i po wszystkim. — Pokręcił siwą głową. — Bez twarzy. Nigdy nie było tam twarzy. Tylko robocza sylwetka, uważająca, by jej nie widziano, która znała godziny Grety lepiej, niż powinien to robić obcy. — Związał sznurkiem papier. — Tamta furgonetka, znowu pewnego ranka. Zaparkowana przy aptece, silnik tykał. Wysoka w dachu, wyższa niż potrzeba furgonetce, z paskiem czerwonej taśmy odblaskowej na tylnych drzwiach. Rozświetlona jak choinka, kiedy trafiły ją moje reflektory.</w:t>
+        <w:t xml:space="preserve">— Ta sylwetka, o której pani mówiłem — zaczął, pakując kotlet, o który nie prosiłam. — Przy jej tylnych drzwiach w ciemności. Pewnie będzie pani chciała wiedzieć o tym wszystko, skoro mi pani uwierzyła. — Oparł swoje wielkie dłonie płasko na pniaku i spojrzał przez okno na sklepiki Evergreen rozciągające się po drugiej stronie skweru, jakby mógł wzrokiem przebić ich mury i dostrzec podwórko. — Dorosły człowiek. Żaden gówniarz, bez względu na to, co miasto chciałoby przypisać jakiemuś chłopakowi z puszką farby. Wyższy od Grety i poruszający się z wyraźnym celem. Żadnego ociągania się. Żadnego ogrzewania rąk. Wiedział, po co tam przyszedł. I okryty. Długi płaszcz albo fartuch, luźny, taki, w jakim pracuje się, żeby się nie pobrudzić, blady wręcz, powiedziałbym, choć ciemność odjęła mu barwę. Trzymał się blisko jej ściany, tam, gdzie idą dostawy, a żaden uczciwy interes nie prowadzi. A kiedy moje reflektory padły na to miejsce, zniknął — szybko i cicho, nie uciekał w popłochu, po prostu sobie poszedł. Bez pośpiechu. Zrobione i po wszystkim. — Pokręcił siwą głową. — Bez twarzy. Nigdy nie było tam twarzy. Tylko robocza sylwetka, uważająca, by jej nie widziano, która znała godziny Grety lepiej, niż powinien to robić obcy. — Związał sznurkiem papier. — Tamta furgonetka, znowu pewnego ranka. Zaparkowana przy aptece, silnik tykał. Wysoka w dachu, wyższa niż potrzeba furgonetce, z paskiem czerwonej taśmy odblaskowej na tylnych drzwiach. Rozświetlona jak choinka, kiedy trafiły ją moje reflektory.</w:t>
       </w:r>
     </w:p>
     <w:p/>
@@ -3691,7 +3691,7 @@
     <w:p/>
     <w:p>
       <w:r>
-        <w:t>Oto cały człowiek, zamknięty w zdaniu, przed wypowiedzeniem którego wolałby chyba umrzeć, niż nazwać je życzliwością. Uraza noszona dumnie w samo południe, a pod nią szorstka dłoń przepędzająca intruza sprzed drzwi kobiety, z którą nie zamieni słowa, bez słowa wyjaśnienia, bo pod chmurą nikt mu nie podziękuje za dobro uczynione w mroku.</w:t>
+        <w:t xml:space="preserve">Oto cały człowiek, zamknięty w zdaniu, które prędzej by umarł, niż nazwał życzliwością. Uraza noszona dumnie w samo południe, a pod nią szorstka dłoń przepędzająca intruza sprzed drzwi kobiety, z którą nie zamieni słowa, bez słowa wyjaśnienia, bo pod chmurą nikt mu nie podziękuje za dobro uczynione w mroku.</w:t>
       </w:r>
     </w:p>
     <w:p/>
@@ -4641,7 +4641,7 @@
     </w:p>
     <w:p>
       <w:r>
-        <w:t>— Dobrze — powiedział. — Ona zawsze była wobec mnie w porządku. Jeśli to jej pomoże, wolę to, niż żeby po prostu uszło mi to na sucho.</w:t>
+        <w:t xml:space="preserve">— Dobrze — powiedział. — Ona zawsze była wobec mnie w porządku. Jeśli to jej pomoże, wolę to, niż tylko to, że przestali mnie podejrzewać.</w:t>
       </w:r>
     </w:p>
     <w:p>
@@ -5229,7 +5229,7 @@
     <w:p/>
     <w:p>
       <w:r>
-        <w:t xml:space="preserve">— Nie przypisywałam temu znaczenia. Kierowca zatrzymał się na drzemkę. Ale Pete zna każdą ciężarówkę, która wjeżdża na ten plac, i powiedział, że to nie dostawca mięsa, a ja nie słyszałam niczyjej. — Przesunęłam palec w górę łyżki ku pieprzniczce. — I postać Danny'ego. Szczupła i szybka, pod progiem Grety, zanim zapaliły się jej piece, a potem w górę ku dalekiemu końcowi. Usłyszałam w tym złoty sklep. Nigdy nie powiedział, że wszedł do Sugarplum. Powiedział: ku dalekiemu końcowi. Sama ulokowałam tam ten sklep.</w:t>
+        <w:t xml:space="preserve">— Nie przypisywałam temu znaczenia. Kierowca zatrzymał się na drzemkę. Ale Pete zna każdą ciężarówkę, która wjeżdża na ten plac, i powiedział, że to nie dostawca mięsa, a ja usłyszałam w tym tylko „niczyja”. — Przesunęłam palec w górę łyżki ku pieprzniczce. — I postać Danny'ego. Szczupła i szybka, pod progiem Grety, zanim zapaliły się jej piece, a potem w górę ku dalekiemu końcowi. W jego słowach usłyszałam złoty sklep. Nigdy nie powiedział, że ta postać weszła do Sugarplum. Powiedział: ku dalekiemu końcowi. Sama ulokowałam tam ten sklep.</w:t>
       </w:r>
     </w:p>
     <w:p/>
@@ -5301,19 +5301,19 @@
     <w:p/>
     <w:p>
       <w:r>
-        <w:t xml:space="preserve">— Ta się nie zmieniła. Jej otwarcie, wydrukowane akurat w tygodniu, kiedy Greta zgasła, i wydrukowane, zanim Varney w ogóle się pojawił. — Odsunęłam miskę. — Przeczytałam to w świetlicy jako znak, że wiedziała o nadchodzącym zamknięciu. Nie możesz wydrukować otwarcia na zamknięcie, które jeszcze się nie wydarzyło.</w:t>
-      </w:r>
-    </w:p>
-    <w:p/>
-    <w:p>
-      <w:r>
-        <w:t>— Greta mogła zgasnąć w tym tygodniu z czystego pecha.</w:t>
-      </w:r>
-    </w:p>
-    <w:p/>
-    <w:p>
-      <w:r>
-        <w:t>— Nie zgasła. Varney nie przychodzi z pecha. Przychodzi, kiedy go wołają, a ktoś go zawołał. — Postawiłam solniczkę i pieprzniczkę obok siebie. — Są tu dwie daty. Otwarcie sklepu ustala się tygodnie wcześniej, zależnie od tego, kiedy przyjdą piece, ułożą marmur i wydrukują pudełka. Skargę można złożyć w dowolnym dniu. Tylko jedną z tych dat można było przesunąć, żeby pasowała do drugiej.</w:t>
+        <w:t xml:space="preserve">— Ta się nie zmieniła. Jej otwarcie, wydrukowane akurat na tydzień, w którym u Grety zgasły światła, i wydrukowane, zanim Varney w ogóle się pojawił. — Odsunęłam miskę. — Przeczytałam to w świetlicy jako znak, że wiedziała o nadchodzącym zamknięciu. Nie możesz wydrukować otwarcia na zamknięcie, które jeszcze się nie wydarzyło.</w:t>
+      </w:r>
+    </w:p>
+    <w:p/>
+    <w:p>
+      <w:r>
+        <w:t xml:space="preserve">— U Grety mogły zgasnąć światła w tym tygodniu z czystego pecha.</w:t>
+      </w:r>
+    </w:p>
+    <w:p/>
+    <w:p>
+      <w:r>
+        <w:t xml:space="preserve">— Nie z pecha. Varney nie przychodzi przypadkiem. Przychodzi, kiedy go wołają, a ktoś go zawołał. — Postawiłam solniczkę i pieprzniczkę obok siebie. — Są tu dwie daty. Otwarcie sklepu ustala się tygodnie wcześniej, zależnie od tego, kiedy przyjdą piece, ułożą marmur i wydrukują pudełka. Skargę można złożyć w dowolnym dniu. Tylko jedną z tych dat można było przesunąć, żeby pasowała do drugiej.</w:t>
       </w:r>
     </w:p>
     <w:p/>
@@ -5337,7 +5337,7 @@
     <w:p/>
     <w:p>
       <w:r>
-        <w:t>— W to wierzyłam. Wtedy Doktor przeszukał w czwartek jej magazyn i nie było tam ani śladu kwaśnej bazy, a ona mi powiedziała, kto jej opowiadał o fugach Grety. — Nie szłam dalej w tym kierunku, skoro zarzekałam się, że dzisiejszej nocy odcinam się od twarzy. — Więc zostaje mi papier. Ulotka jest dowodem na czyjejś ladzie na długo przed tym, jak stanie się ulotką na tablicy. Ktoś ją tam widział. Ktoś wyczytał z niej ten tydzień i napisał skargę do hrabstwa, żeby w niego uderzyła.</w:t>
+        <w:t xml:space="preserve">— W to wierzyłam. Wtedy Doktor przeszukał w czwartek jej magazyn i nie było tam ani śladu kwaśnej bazy, a ona mi powiedziała, kto jej opowiadał o fugach Grety. — Nie szłam dalej w tym kierunku, skoro zarzekałam się, że dzisiejszej nocy odcinam się od twarzy. — Więc zostaje mi papier. Ulotka leży jako próbny wydruk na czyjejś ladzie na długo przed tym, jak zawiśnie na tablicy. Ktoś ją tam widział. Ktoś wyczytał z niej ten tydzień i napisał skargę do hrabstwa, żeby w niego uderzyła.</w:t>
       </w:r>
     </w:p>
     <w:p/>
@@ -5636,7 +5636,7 @@
     <w:p/>
     <w:p>
       <w:r>
-        <w:t xml:space="preserve">— Przyszła z miotłą — powiedziała Greta. — Tamtego ranka, kiedy wybito szybę. Weszła w moje drzwi, przeszła prosto na zaplecze i wyszła z moją miotłą, a ja pomyślałam, że ona nadal wie, gdzie ona wisi. Dwadzieścia pięć lat i wiedziała, który to gwoźdź. — Jej głos zrobił się cienki. — Stałam tam za ladą i pomyślałam, że to najmilsza rzecz, jaką ktokolwiek dla mnie zrobił od miesiąca. Pomyślałam, że to jej sposób, żeby to wyrazić.</w:t>
+        <w:t xml:space="preserve">— Przyszła z miotłą — powiedziała Greta. — Tamtego ranka, kiedy wybito szybę. Weszła w moje drzwi, przeszła prosto na zaplecze i wyszła z moją miotłą, a ja pomyślałam, że ona nadal wie, gdzie ta miotła wisi. Dwadzieścia pięć lat i wiedziała, który to gwoźdź. — Jej głos zrobił się cienki. — Stałam tam za ladą i pomyślałam, że to najmilsza rzecz, jaką ktokolwiek dla mnie zrobił od miesiąca. Pomyślałam, że to jej sposób, żeby to wyrazić.</w:t>
       </w:r>
     </w:p>
     <w:p/>
@@ -5960,7 +5960,7 @@
     </w:p>
     <w:p>
       <w:r>
-        <w:t xml:space="preserve">— Doktor znalazł kwaśną bazę w mące Grety — powiedziałam. — Taki, jaki piekarnia kupuje do chleba żytniego. Piekarnia w Bridgton dzwoniła do klientów Grety po imieniu, oferując realizację ich zamówień z Holly Jolly. A firma, która pisała w sierpniu w sprawie odkupienia Grety, jest zarejestrowana na kobietę, która jest właścicielką tamtej piekarni. — Wzięłam oddech przed zadaniem pytania, dla którego zadzwoniłam. — Czy możesz sprawdzić, czy Pelkey z Lewiston dostarczył tej jesieni kwaśną bazę do Wendt's Bakehouse?</w:t>
+        <w:t xml:space="preserve">— Doktor znalazł kwaśną bazę w mące Grety — powiedziałam. — Taką, jaką piekarnia chleba kupuje do żytniego. Piekarnia w Bridgton dzwoniła do klientów Grety po imieniu, oferując realizację ich zamówień z Holly Jolly. A firma, która pisała w sierpniu w sprawie odkupienia jej sklepu, jest zarejestrowana na kobietę, która jest właścicielką tamtej piekarni. — Wzięłam oddech przed zadaniem pytania, dla którego zadzwoniłam. — Czy możesz sprawdzić, czy Pelkey z Lewiston dostarczył tej jesieni kwaśną bazę do Wendt's Bakehouse?</w:t>
       </w:r>
     </w:p>
     <w:p>
@@ -6034,7 +6034,7 @@
     </w:p>
     <w:p>
       <w:r>
-        <w:t>U doktora Mitchella paliła się tylko lampa nad stołem warsztatowym, a kardigan miał zapięte guziki nałożone na to, w czym zamierzał spać. Specyfikacja produktu leżała pod lampą z podkreślonymi ołówkiem składnikami: mąka pszenna, dioctan sodu, kwas mlekowy.</w:t>
+        <w:t xml:space="preserve">U doktora Mitchella paliła się tylko lampa nad stołem warsztatowym, a na to, w czym zamierzał spać, narzucił zapięty kardigan. Specyfikacja produktu leżała pod lampą z podkreślonymi ołówkiem składnikami: mąka pszenna, dioctan sodu, kwas mlekowy.</w:t>
       </w:r>
     </w:p>
     <w:p>
@@ -6170,7 +6170,7 @@
     </w:p>
     <w:p>
       <w:r>
-        <w:t xml:space="preserve">— W skardze chłodnię nazwano zimnym pokojem, a zlew umywalkowy zlewem Hobarta. Greta twierdzi, że nikt tak na nie nie mówił od czasów Joyce. Kłódki na bramie podwórka nigdy nie wymieniono, a Pete twierdzi, że ciągle spada z łańcucha. I kwaszenie ustało dokładnie tego ranka, kiedy Greta zaczęła ryglować tylne drzwi po incydencie z cegłą, więc sprawca wchodził właśnie tędy. Pete widział furgonetkę koło apteki przed świtem, bez włączonych świateł, i nie należała ona do dostawcy mięsa. Wczoraj spojrzał na wydruk przesłany przez Claire z furgonetką Wendtów i powiedział: „To ta”.</w:t>
+        <w:t xml:space="preserve">— W skardze chłodnię nazwano zimnym pokojem, a zlew umywalkowy zlewem Hobarta. Greta twierdzi, że nikt tak na nie nie mówił od czasów Joyce. Kłódki na bramie podwórka nigdy nie wymieniono, a Pete twierdzi, że ciągle spada z łańcucha. I kwaszenie ustało dokładnie tego ranka, kiedy Greta zaczęła ryglować tylne drzwi po incydencie z cegłą, więc sprawca wchodził właśnie tędy. Pete widział furgonetkę koło apteki przed świtem, bez włączonych świateł, i nie należała ona do dostawcy mięsa. Wczoraj spojrzał na wydruk przesłany przez Claire z furgonetką Wendt's Bakehouse i powiedział: „To ta”.</w:t>
       </w:r>
     </w:p>
     <w:p>
@@ -6195,7 +6195,7 @@
     </w:p>
     <w:p>
       <w:r>
-        <w:t>— Sama w sobie to po prostu piekarz kupujący to, co piekarze kupują — stwierdziła. — Mogłabym to znaleźć w połowie hurtowych kuchni w stanie. — Położyła obok kartkę od Claire. — To cała reszta sprawia, że mamy do czynienia ze sprawą.</w:t>
+        <w:t xml:space="preserve">— Samo w sobie to po prostu piekarz kupujący to, co piekarze kupują — stwierdziła. — Mogłabym to znaleźć w połowie hurtowych kuchni w stanie. — Położyła obok kartkę od Claire. — To cała reszta sprawia, że mamy do czynienia ze sprawą.</w:t>
       </w:r>
     </w:p>
     <w:p>
@@ -6245,7 +6245,7 @@
     </w:p>
     <w:p>
       <w:r>
-        <w:t>— Tak samo jak ostatnio. Żadnych zasadzek. — Stuknęła raz w faktury. — Nikt nie siedzi w zaułku w ciemności, czekając, aż ona wróci z workiem. Nie muszę jej na tym przyłapać. Poproszę ją, żeby przyszła po południu, wyłożę jej wszystko prosto w oczy i będzie musiała się wytłumaczyć.</w:t>
+        <w:t xml:space="preserve">— Tak samo jak ostatnio. Żadnych zasadzek. — Stuknęła raz w faktury. — Nikt nie siedzi w zaułku w ciemności, czekając, aż ona wróci z workiem. Nie muszę jej na tym przyłapać. Poproszę ją, żeby przyszła po południu, wyłożę jej wszystko prosto w oczy a ona będzie mogła na to odpowiedzieć.</w:t>
       </w:r>
     </w:p>
     <w:p>
@@ -6270,7 +6270,7 @@
     </w:p>
     <w:p>
       <w:r>
-        <w:t>— Wie kto. Wymyśliła to wczoraj przy swojej ladzie. Nie wie, że możemy to udowodnić.</w:t>
+        <w:t xml:space="preserve">— Wie kto. Domyśliła się tego wczoraj przy swojej ladzie. Nie wie, że możemy to udowodnić.</w:t>
       </w:r>
     </w:p>
     <w:p>
@@ -6557,7 +6557,7 @@
     <w:p/>
     <w:p>
       <w:r>
-        <w:t>— Dwadzieścia pięć lat — powiedziała do Grety. — Nigdy go nie zmieniłaś. O rany, Gret.</w:t>
+        <w:t xml:space="preserve">— Dwadzieścia pięć lat — powiedziała do Grety. — Nigdy jej nie zmieniłaś. O rany, Gret.</w:t>
       </w:r>
     </w:p>
     <w:p/>
@@ -6719,7 +6719,7 @@
     <w:p/>
     <w:p>
       <w:r>
-        <w:t xml:space="preserve">— Będzie pani potrzebować prawnika, pani Wendt — powiedziała, nie bez życzliwości. — To pani prawo i na pani miejscu bym z niego skorzystała. Chcę jednak postawić sprawę jasno, żeby nikt później nie był w błędzie. Dysponuję rejestrem dostaw z pani podpisem, ekspertyzą chemiczną, rejestrem państwowym, mężczyzną, który zna pani furgonetkę, oraz dwiema kobietami, do których pani piekarnia dzwoniła z zamówieniami z zeszytu, do którego nie miała pani prawa zaglądać. Wszystko to jest spisane. Nic z tego nie wymaga, żeby przyznała się pani do czegokolwiek. — Odłożyła pióro. — Czegokolwiek by pani dziś po południu nie żałowała — a sądzę, że czegoś żałuje — to nie zmienia ani słowa na tej stronie. Dziś postawimy pani zarzuty. Proszę zadzwonić do swojego prawnika, wrócić z nim do szóstej, a resztę załatwimy spokojnie.</w:t>
+        <w:t xml:space="preserve">— Będzie pani potrzebować prawnika, pani Wendt — powiedziała, nie bez życzliwości. — To pani prawo i na pani miejscu bym z niego skorzystała. Chcę jednak postawić sprawę jasno, żeby nikt później nie był w błędzie. Dysponuję rejestrem dostaw z pani podpisem, ekspertyzą chemiczną, rejestrem państwowym, mężczyzną, który zna pani furgonetkę, oraz dwiema kobietami, do których pani piekarnia dzwoniła z zamówieniami z zeszytu, do którego nie miała pani prawa zaglądać. Wszystko to jest spisane. Nic z tego nie wymaga, żeby przyznała się pani do czegokolwiek. — Odłożyła pióro. — Czegokolwiek by pani dziś po południu nie żałowała — a sądzę, że czegoś pani żałuje — to nie zmienia ani słowa na tej stronie. Dziś postawimy pani zarzuty. Proszę zadzwonić do swojego prawnika, wrócić z nim do szóstej, a resztę załatwimy spokojnie.</w:t>
       </w:r>
     </w:p>
     <w:p/>
@@ -6796,13 +6796,13 @@
     <w:p/>
     <w:p>
       <w:r>
-        <w:t>Wszystko załatwiono po cichu, tak jak zapowiadała. Żadnej sali. Żadnego tłumu. Sama przyniosła z zamkniętej szafki doktora mój słoik z mąką, z jego podpisaną karteczką leżącą obok, i wzięła Danny'ego na stronę, po dobroci, zapisując każdy krok po kolei.</w:t>
-      </w:r>
-    </w:p>
-    <w:p/>
-    <w:p>
-      <w:r>
-        <w:t>W jej małym gabinecie było ciepło od piecyka. Pip minęła go w poszukiwaniu czegoś błyszczącego i wsunęła głowę do kosza na śmieci stojącego przy drzwiach.</w:t>
+        <w:t xml:space="preserve">Wszystko załatwiono po cichu, tak jak zapowiadała. Żadnej sali. Żadnego tłumu. Sama przyniosła z zamkniętej szafki doktora mój słoik z mąką, z jego podpisaną karteczką leżącą obok, i na osobności spokojnie przyjęła zeznanie Danny'ego, zapisując każdy krok po kolei.</w:t>
+      </w:r>
+    </w:p>
+    <w:p/>
+    <w:p>
+      <w:r>
+        <w:t xml:space="preserve">W jej małym gabinecie było ciepło od piecyka. Pip zlekceważyła piecyk na rzecz kosza na śmieci przy drzwiach i wsunęła do niego głowę w poszukiwaniu czegoś błyszczącego.</w:t>
       </w:r>
     </w:p>
     <w:p/>
@@ -7914,7 +7914,7 @@
     <w:p/>
     <w:p>
       <w:r>
-        <w:t>Mark Redfern szedł aleją tuż za nimi swoim stałym krokiem, z kołnierzem podniesionym przeciwko zimnu. Uniosłam rękę na powitanie. Odpowiedział tym samym.</w:t>
+        <w:t xml:space="preserve">Mark Redfern szedł aleją tuż za nimi swoim stałym krokiem, z kołnierzem podniesionym przeciwko zimnu. Uniósł rękę na powitanie. Odpowiedziałam tym samym.</w:t>
       </w:r>
     </w:p>
     <w:p/>
@@ -8162,7 +8162,7 @@
     <w:p>
       <w:r>
         <w:rPr/>
-        <w:t xml:space="preserve">Nie chciałam dziedzictwa. Chciałam czystej księgi rachunkowej. Chciałam zinwentaryzować, wycenić i zlikwidować. Chciałam podpisać papiery, wręcić ten absurdalny klucz pośrednikowi nieruchomości i odjechać z powrotem do świata betonu i logiki, świata, w którym wszystko miało sens.</w:t>
+        <w:t xml:space="preserve">Nie chciałam dziedzictwa. Chciałam czystej księgi rachunkowej. Chciałam zinwentaryzować, wycenić i zlikwidować. Chciałam podpisać papiery, wręczyć ten absurdalny klucz pośrednikowi nieruchomości i odjechać z powrotem do świata betonu i logiki, świata, w którym wszystko miało sens.</w:t>
       </w:r>
     </w:p>
     <w:p>

</xml_diff>

<commit_message>
WIP checkpoint: full proofcheck in progress (Flour Play Polish)
Co-Authored-By: Claude Opus 5.5 <noreply@anthropic.com>
Claude-Session: https://claude.ai/code/session_012Cm8JxdqzjuttdUSdkQCUg
</commit_message>
<xml_diff>
--- a/translated/corrected/Flour Play - ASSEMBLED - FORMATTED_Polish.docx
+++ b/translated/corrected/Flour Play - ASSEMBLED - FORMATTED_Polish.docx
@@ -120,7 +120,7 @@
     <w:p/>
     <w:p>
       <w:r>
-        <w:t xml:space="preserve">Nowa mąka. Nowa woda. Pożyczona waga. Wciąż kwaśne. W czwartek Greta stoi już we własnej piekarni, mówiąc Jessice Claus, że jej dłonie wreszcie zapomniały jak.</w:t>
+        <w:t xml:space="preserve">Nowa mąka. Nowa woda. Pożyczona waga. Wciąż kwaśna. W czwartek Greta stoi już we własnej piekarni, mówiąc Jessice Claus, że jej dłonie wreszcie zapomniały jak.</w:t>
       </w:r>
     </w:p>
     <w:p/>
@@ -132,7 +132,7 @@
     <w:p/>
     <w:p>
       <w:r>
-        <w:t xml:space="preserve">Miasteczko sięga po łatwe wyjaśnienia: rzeźnik, który zablokował bramę ładunkową, rodzina zalegająca z rachunkami za olej opałowy, nudzący się chłopak z kradzioną puszką. Jessica szuka tego, co pasuje — ponieważ ktokolwiek to zrobił, kupił proszek, znał dawkę i złożył skargę powołującą się na odpowiedni podpunkt przepisów sanitarnych. To nie jest wybuch złości. To fachowa robota.</w:t>
+        <w:t xml:space="preserve">Miasteczko sięga po łatwe wyjaśnienia: rzeźnik, który zablokował bramę ładunkową, rodzina zalegająca z rachunkami za olej opałowy, nudzący się chłopak z kradzioną puszką. Jessica szuka tego, co pasuje — ponieważ tu proszek kupiono, dawkę znano, a w złożonej skardze powołano się na odpowiedni podpunkt przepisów sanitarnych. To nie jest wybuch złości. To fachowa robota.</w:t>
       </w:r>
     </w:p>
     <w:p/>
@@ -242,7 +242,7 @@
     <w:p/>
     <w:p>
       <w:r>
-        <w:t>I Pip, która wprawdzie nie należała do kręgu, ale poczułaby się śmiertelnie urażona, gdyby pominięto ją w jakimkolwiek liczeniu obecnych. Usadowiła się pod przednim oknem w jedynej plamie niskiego listopadowego słońca, w gnieździe uknutym z upadłego motka czerwonej wełny, którego Olivia — jak zauważyłam — nie próbowała zbytnio odzyskać. Leżała tam lśniąca i zadowolona, z jednym okiem przymkniętym na pół — pilnując całego przebiegu spraw i wszystkiego, co błyszczało. A błyszczało sporo rzeczy. Olivia trzymała na stole słoik ze złoconymi szyszkami, a obok niego szpulę złotej wstążki. Z Pip rozmawiano już na temat obu tych rzeczy. Dwukrotnie.</w:t>
+        <w:t>I Pip, która wprawdzie nie należała do kręgu, ale poczułaby się śmiertelnie urażona, gdyby pominięto ją w jakimkolwiek liczeniu obecnych. Usadowiła się pod przednim oknem w jedynej plamie niskiego listopadowego słońca, w gnieździe uwitym ze spadłego motka czerwonej wełny, którego Olivia — jak zauważyłam — nie próbowała zbytnio odzyskać. Leżała tam lśniąca i zadowolona, z jednym okiem przymkniętym na pół — pilnując całego przebiegu spraw i wszystkiego, co błyszczało. A błyszczało sporo rzeczy. Olivia trzymała na stole słoik ze złoconymi szyszkami, a obok niego szpulę złotej wstążki. Z Pip rozmawiano już na temat obu tych rzeczy. Dwukrotnie.</w:t>
       </w:r>
     </w:p>
     <w:p/>
@@ -278,7 +278,7 @@
     <w:p/>
     <w:p>
       <w:r>
-        <w:t xml:space="preserve">Wtedy dotarło do mnie, gdy tak układałam gałązkę na gałązce, jak daleko zaszłam, żeby tu siedzieć. Nie chodziło o kilometry. Było ich całkiem sporo, ale nie o nie mi szło. Niedawno byłam w Frost Falls nowicjuszką. Kobietą z Bieguna Północnego ze sławnym mężem i dziwaczniejszym pingwinem. Ludzie byli dla mnie życzliwi tak, jak miasto bywa życzliwe wobec gościa — to znaczy zrobili miejsce i obserwowali, co z tym miejscem zrobię. A teraz Olivia próbowała ukraść mój sposób wiązania wieńca. Pies Marthy spał przy moim krześle równie spokojnie co przy jej. Nikt mi już niczego nie tłumaczył. Zakładano, że wiem. Zapracowałam na to szybko, przez ciężką jesień, zagubionego psa i kapsułę czasu.</w:t>
+        <w:t xml:space="preserve">Wtedy dotarło do mnie, gdy tak układałam gałązkę na gałązce, jak daleko zaszłam, żeby tu siedzieć. Nie chodziło o kilometry. Było ich całkiem sporo, ale nie o nie mi szło. Niedawno byłam w Frost Falls nowicjuszką. Kobietą z Bieguna Północnego ze sławnym mężem i dziwaczniejszym pingwinem. Ludzie byli dla mnie życzliwi tak, jak miasteczko bywa życzliwe wobec gościa — to znaczy zrobili miejsce i obserwowali, co z tym miejscem zrobię. A teraz Olivia próbowała ukraść mój sposób wiązania wieńca. Pies Marthy spał przy moim krześle równie spokojnie co przy jej. Nikt mi już niczego nie tłumaczył. Zakładano, że wiem. Zapracowałam na to szybko, przez ciężką jesień, zagubionego psa i kapsułę czasu.</w:t>
       </w:r>
     </w:p>
     <w:p/>
@@ -391,7 +391,7 @@
     <w:p/>
     <w:p>
       <w:r>
-        <w:t>— Brązowym papierem, od środka szkła. Tak się robi, kiedy urządzasz wnętrze i nie chcesz, żeby miasto ci się gapiło na ręce. — Claire wzruszyła ramionami. — Z przodu jeszcze nie ma żadnego szyldu. Ale w zaułku stoi kontener na śmieci, a w sobotę stała tam furgonetka, a człowiek nie wynajmuje kontenera, jeśli nie sprząta przestrzeni.</w:t>
+        <w:t>— Brązowym papierem, od środka szkła. Tak się robi, kiedy urządzasz wnętrze i nie chcesz, żeby miasteczko ci się gapiło na ręce. — Claire wzruszyła ramionami. — Z przodu jeszcze nie ma żadnego szyldu. Ale w zaułku stoi kontener na śmieci, a w sobotę stała tam furgonetka, a człowiek nie wynajmuje kontenera, jeśli nie sprząta przestrzeni.</w:t>
       </w:r>
     </w:p>
     <w:p/>
@@ -445,7 +445,7 @@
         <w:t xml:space="preserve"/>
       </w:r>
       <w:r>
-        <w:t xml:space="preserve"> weteranów w górnej części i wielkim wiązem na samym końcu. Uczniowie szkoły zbudowali wzdłuż niego rzędami bałwany podczas halloweenowego śniegu. Trzy sztuki, grube i przekrzywione, ukoronowane tym, co dzieciaki zdołały wyszperać. Wczoraj, jak zauważyła Ellie, stały zwrócone w stronę ulicy, z oczami z węgielków i towarzyskim wyrazem, odprowadzając wzrokiem ruch uliczny, jak to bałwany mają w zwyczaju. Sama przechodziłam obok nich poprzedniego wieczoru. Zwrócone były ku ulicy.</w:t>
+        <w:t xml:space="preserve"> weteranów w górnej części i wielkim wiązem na samym końcu. Uczniowie szkoły zbudowali wzdłuż niego rząd bałwanów podczas halloweenowego śniegu. Trzy sztuki, grube i przekrzywione, ukoronowane tym, co dzieciaki zdołały wyszperać. Wczoraj, jak zauważyła Ellie, stały zwrócone w stronę ulicy, z oczami z węgielków i towarzyskim wyrazem, odprowadzając wzrokiem ruch uliczny, jak to bałwany mają w zwyczaju. Sama przechodziłam obok nich poprzedniego wieczoru. Zwrócone były ku ulicy.</w:t>
       </w:r>
     </w:p>
     <w:p/>
@@ -499,7 +499,7 @@
     <w:p/>
     <w:p>
       <w:r>
-        <w:t xml:space="preserve">Bo ja znałam tę różnicę. Żyłam już wystarczająco długo obok magii Bożego Narodzenia. Wystarczająco długo, by czuć ją w kościach, tak wyraźnie jak krok na schodach. To nie było dziecko z zesztywniałymi palcami. Magia krążyła swobodnie po Frost Falls. Błąkała się tak od naszego przybycia, szukając domu. Mój mąż budował dla niej jeden. Powoli i cierpliwie w swoim warsztacie — ognisko, w którym mogłaby się rozgościć — a ona zbliżała się do tego ognia z każdym dniem ociupinkę bardziej. Ale nie osiadła jeszcze na dobre. Inaczej mówiąc, wciąż wałęsała się nocami po miasteczku, niezgrabna i pozbawiona jakiejkolwiek złośliwości, czyniąc małe, niemożliwe rzeczy, które magia robi wtedy, gdy ma w sobie więcej uczucia niż rozsądku. Zmieniając świąteczne światełka z pomarańczowych na złote. A teraz, najwyraźniej, obracając nocą dziecięcego bałwana przodem do tego, co akurat przykuło jej błądzącą uwagę.</w:t>
+        <w:t xml:space="preserve">Bo ja znałam tę różnicę. Żyłam już wystarczająco długo obok magii Bożego Narodzenia. Wystarczająco długo, by czuć ją w kościach, tak wyraźnie jak krok na schodach. To nie było dziecko z zesztywniałymi palcami. Magia krążyła swobodnie po Frost Falls. Błąkała się tak od naszego przybycia, szukając domu. Mój mąż budował dla niej jeden. Powoli i cierpliwie w swoim warsztacie — ognisko, w którym mogłaby się rozgościć — a ona zbliżała się do tego ognia z każdym dniem ociupinkę bardziej. Ale nie osiadła jeszcze na dobre. Wciąż wałęsała się nocami po miasteczku, niezgrabna i pozbawiona jakiejkolwiek złośliwości, czyniąc małe, niemożliwe rzeczy, które magia robi wtedy, gdy ma w sobie więcej uczucia niż rozsądku. Zmieniając świąteczne światełka z pomarańczowych na złote. A teraz, najwyraźniej, obracając nocą dziecięcego bałwana przodem do tego, co akurat przykuło jej błądzącą uwagę.</w:t>
       </w:r>
     </w:p>
     <w:p/>

</xml_diff>

<commit_message>
Full proofcheck Flour Play Polish: SIGNIFICANT (205 edits)
Co-Authored-By: Claude Opus 5.5 <noreply@anthropic.com>
Claude-Session: https://claude.ai/code/session_012Cm8JxdqzjuttdUSdkQCUg
</commit_message>
<xml_diff>
--- a/translated/corrected/Flour Play - ASSEMBLED - FORMATTED_Polish.docx
+++ b/translated/corrected/Flour Play - ASSEMBLED - FORMATTED_Polish.docx
@@ -611,7 +611,7 @@
     <w:p/>
     <w:p>
       <w:r>
-        <w:t>Posadziłam ją na krześle na końcu lady. Dała się posadzić, co od razu pokazało mi, jak bardzo była wstrząśnięta, bo przecież Greta nikomu nie słuchała rozkazów.</w:t>
+        <w:t>Posadziłam ją na krześle na końcu lady. Dała się posadzić, co od razu pokazało mi, jak bardzo była wstrząśnięta, bo przecież Greta od nikogo nie przyjmowała rozkazów.</w:t>
       </w:r>
     </w:p>
     <w:p/>
@@ -623,7 +623,7 @@
     <w:p/>
     <w:p>
       <w:r>
-        <w:t xml:space="preserve">— Moje przepisy nie zawodzą — rzuciła Greta w podłogę. — Upiekłam te cynamonki dziesięć tysięcy razy, jeśli raz. Nauczyłam się tego w kuchni mojej matki. Mogłabym je robić z zamkniętymi oczami i jedną ręką powiązaną za plecami. Robiłam je na kacu, robiłam je, gdy zaczynał się poród, robiłam je następnego ranka po pogrzebie Harolda, bo nie wiedziałam, co innego zrobić z rękami, i przez czterdzieści lat z mojego pieca nigdy nie wyszło nic innego niż coś dobrego. — Jej głos się załamał, ale mówiła dalej. — A teraz, gdy zbliża się Święto Dziękczynienia, a ja nie potrafię upiec zdatnego do jedzenia bochenka chleba. Sprawdziłam wszystko. Piece trzymają temperaturę, powiesiłam w każdym termometr. Otworzyłam nową paczkę drożdży. Wczoraj wyszorowałam całe miejsce na wypadek, gdyby do powietrza dostało się coś zepsutego. A dziś rano zagniotłam czystą partię, ostrożnie jak przy chrzcie, i wyszło to co tam. — Wskazała ręką na kubeł.</w:t>
+        <w:t xml:space="preserve">— Moje przepisy nie zawodzą — rzuciła Greta w podłogę. — Upiekłam te cynamonki dziesięć tysięcy razy, jeśli raz. Nauczyłam się tego w kuchni mojej matki. Mogłabym je robić z zamkniętymi oczami i jedną ręką związaną za plecami. Robiłam je na kacu, robiłam je, gdy zaczynał się poród, robiłam je następnego ranka po pogrzebie Harolda, bo nie wiedziałam, co innego zrobić z rękami, i przez czterdzieści lat z mojego pieca nigdy nie wyszło nic innego niż coś dobrego. — Jej głos się załamał, ale mówiła dalej. — A teraz, gdy zbliża się Święto Dziękczynienia, nie potrafię upiec zdatnego do jedzenia bochenka chleba. Sprawdziłam wszystko. Piece trzymają temperaturę, powiesiłam w każdym termometr. Otworzyłam nową paczkę drożdży. Wczoraj wyszorowałam całe miejsce na wypadek, gdyby do powietrza dostało się coś zepsutego. A dziś rano zagniotłam czystą partię, ostrożnie jak przy chrzcie, i wyszło to, co widzisz. — Wskazała ręką na kubeł.</w:t>
       </w:r>
     </w:p>
     <w:p/>
@@ -635,7 +635,7 @@
     <w:p/>
     <w:p>
       <w:r>
-        <w:t xml:space="preserve">— Wczoraj w połowie dnia. Wyszła pierwsza zła taca i pomyślałam sobie: no proszę, Greto, byłaś nieostrożna, każdemu zdarza się pomylić. Wyrzuciłam to i zaczęłam od nowa, a potem stało się to samo. Od tamtej pory biegam jak w kółko, a zamówienia na Święto Dziękczynienia czekają w tym zeszycie.</w:t>
+        <w:t xml:space="preserve">— Wczoraj w połowie dnia. Wyszła pierwsza zła taca i pomyślałam sobie: no proszę, Greto, byłaś nieostrożna, każdemu zdarza się pomylić. Wyrzuciłam to i zaczęłam od nowa, a potem stało się to samo. Od tamtej pory kręcę się w kółko, a zamówienia na Święto Dziękczynienia czekają w tym zeszycie.</w:t>
       </w:r>
     </w:p>
     <w:p/>
@@ -659,7 +659,7 @@
     <w:p/>
     <w:p>
       <w:r>
-        <w:t xml:space="preserve">Cała produkcja Grety legła w gruzach. Jedna taca mogła się nie udać pechowego ranka przez poślizgnięcie ręki albo przeciąg. Ale tu mieliśmy bułki, pączki i chleb, trzy różne ciasta pieczone przez dobę w piecach, które sprawdzała, na drożdżach, które dopiero co otworzyła. Każde z nich miało ten sam kwaśny posmak. Niedbalstwo nie wyszłoby tak samo w trzech różnych ciastach. Wyglądało to na robotę celową.</w:t>
+        <w:t xml:space="preserve">Cała produkcja Grety legła w gruzach. Jedna taca mogła się nie udać pechowego ranka przez poślizgnięcie ręki albo przeciąg. Ale tu chodziło o bułki, pączki i chleb, trzy różne ciasta pieczone przez dobę w piecach, które sprawdzała, na drożdżach, które dopiero co otworzyła. Każde z nich miało ten sam kwaśny posmak. Niedbalstwo nie wyszłoby tak samo w trzech różnych ciastach. Wyglądało to na robotę celową.</w:t>
       </w:r>
     </w:p>
     <w:p/>
@@ -746,7 +746,7 @@
     </w:p>
     <w:p>
       <w:r>
-        <w:t>Brązowy papier zniknął z szyb dawnego sklepu Fenwicka wieczorem, kiedy odbywało się wiązanie wianuszków. Do rana wszyscy na alei wiedzieli, że otworzyła się tam nowa piekarnia, Sugarplum Patisserie.</w:t>
+        <w:t>Brązowy papier zniknął z szyb dawnego sklepu Fenwicka wieczorem tego dnia, kiedy krąg wiązał wieńce. Do rana wszyscy na alei wiedzieli, że otworzyła się tam nowa piekarnia, Sugarplum Patisserie.</w:t>
       </w:r>
     </w:p>
     <w:p>
@@ -766,7 +766,7 @@
     </w:p>
     <w:p>
       <w:r>
-        <w:t>— Cóż, zechcesz pójść. — Przetarła ladę, która wcale tego nie wymagała. — Pâtisserie, Jessica. Nie piekarnia. Pâtisserie. Podobno jest różnica i domyślam się, że wszyscy usłyszymy o tym jeszcze nie raz. — Powiedziała to lekko, ale w ogóle się nie uśmiechnęła.</w:t>
+        <w:t>— Cóż, zechcesz pójść. — Przetarła ladę, która wcale tego nie wymagała. — Pâtisserie, Jessico. Nie piekarnia. Pâtisserie. Podobno jest różnica i domyślam się, że wszyscy usłyszymy o tym jeszcze nie raz. — Powiedziała to lekko, ale w ogóle się nie uśmiechnęła.</w:t>
       </w:r>
     </w:p>
     <w:p>
@@ -776,7 +776,7 @@
     </w:p>
     <w:p>
       <w:r>
-        <w:t xml:space="preserve">Dawny lokal Fenwicka zmienił się nie do poznania. Tam, gdzie wcześniej były ciemne szyby i brązowy papier, teraz widniała witryna urządzona z tak wielką dbałością, że zatrzymałam się na chodniku. Stolarkę okienną pomalowano na świeżo na szaro, w kolorze gołębiej piersi. Nad drzwiami wisiała girlanda z gałązek, lśniąca i profesjonalna, zupełnie niepodobna do wianuszków, które robiłyśmy w Yarn Tales; wpleciono w nią maleńkie białe światełka, jeszcze niezapalone. W poprzek szyby, złotą kaligrafią tak cienką, jakby napisano ją piórem, widniało jedno słowo </w:t>
+        <w:t xml:space="preserve">Dawny lokal Fenwicka zmienił się nie do poznania. Tam, gdzie wcześniej były ciemne szyby i brązowy papier, teraz widniała witryna urządzona z tak wielką dbałością, że zatrzymałam się na chodniku. Stolarkę okienną pomalowano na świeżo na szaro, w kolorze gołębiej piersi. Nad drzwiami wisiała girlanda z gałązek, lśniąca i profesjonalna, zupełnie niepodobna do wieńców, które robiłyśmy w Yarn Tales; wpleciono w nią maleńkie białe światełka, jeszcze niezapalone. W poprzek szyby, złotą kaligrafią tak cienką, jakby napisano ją piórem, widniało jedno słowo </w:t>
       </w:r>
       <w:r>
         <w:rPr>
@@ -899,7 +899,7 @@
     </w:p>
     <w:p>
       <w:r>
-        <w:t xml:space="preserve">Mimo to przez cały ten czas nie potrafiłam odnaleźć spokoju. Pod tą całą serdecznością krył się chłód i precyzja. Przywitała mnie i ugościła, a w tym samym tchu, bez żadnej mojej prośby, zasiała małą, staranną wątpliwość co do jedynej piekarki na alei, której cały rok zależał od nadchodzących sześciu tygodni. Zrobiła to tak delikatnie, z takim współczuciem, że każdy, kto by nie uważał, podziękowałby jej za troskę.</w:t>
+        <w:t xml:space="preserve">Mimo to przez cały ten czas nie potrafiłam odnaleźć spokoju. Pod tą całą serdecznością krył się chłód i precyzja. Przywitała mnie i ugościła, a zarazem, bez żadnej mojej prośby, zasiała małą, staranną wątpliwość co do jedynej piekarki na alei, której cały rok zależał od nadchodzących sześciu tygodni. Zrobiła to tak delikatnie, z takim współczuciem, że każdy, kto by nie uważał, podziękowałby jej za troskę.</w:t>
       </w:r>
     </w:p>
     <w:p>
@@ -909,7 +909,7 @@
     </w:p>
     <w:p>
       <w:r>
-        <w:t>Zaniosłam resztę financiers z powrotem do Starlight, ponieważ Kelly zasługiwała na coś za cynk. Zastałam ją wciąż przy ladzie, a Hal Thompson opierał się o nią, nachylając się wspólnie nad kartką papieru, którą Hal ze sobą przyniósł.</w:t>
+        <w:t>Zaniosłam resztę financiers z powrotem do Starlight, ponieważ Kelly zasługiwała na coś za cynk. Zastałam ją wciąż przy ladzie, a Hal Thompson opierał się o nią; oboje nachylali się nad kartką papieru, którą Hal ze sobą przyniósł.</w:t>
       </w:r>
     </w:p>
     <w:p>
@@ -959,7 +959,7 @@
     </w:p>
     <w:p>
       <w:r>
-        <w:t xml:space="preserve">— To tylko taki pomysł — zaczął. — Ale zima przyszła w tym roku wcześnie i mówią, że będzie długa. Dla niektórych ludzi w tym mieście długa zima oznacza coś więcej niż miły ogień w kominku i wianek na drzwiach. — Puknął palcem w papier, na którym starannym charakterem pisma narysował kolumny: artykuły spożywcze, w puszkach, ciepłe rzeczy. — Zbiórka żywności. Przez cały sezon. Nic wielkiego. Beczka z przodu mojego sklepu, jedna tutaj, jeśli Kelly pozwoli, i jedna w kościele. Ludzie wrzucają to, co mogą, a w styczniu, kiedy zrobi się ciężko, będziemy mieli coś odłożonego dla każdego, kto tego potrzebuje. — Spojrzał w górę, znów zawstydzony, jak człowiek bojący się, że jego dobry pomysł zostanie uznany za miękkość. — Kiedyś miałem ciężką zimę, zanim jeszcze otworzyłem sklep. Wciąż pamiętam, kto zostawił mi paczkę na progu. Chciałbym być kimś takim dla kogoś w tym roku.</w:t>
+        <w:t xml:space="preserve">— To tylko taki pomysł — zaczął. — Ale zima przyszła w tym roku wcześnie i mówią, że będzie długa. Dla niektórych ludzi w tym miasteczku długa zima oznacza coś więcej niż miły ogień w kominku i wieniec na drzwiach. — Puknął palcem w papier, na którym starannym charakterem pisma narysował kolumny: produkty suche, konserwy, ciepłe rzeczy. — Zbiórka żywności. Przez cały sezon. Nic wielkiego. Beczka z przodu mojego sklepu, jedna tutaj, jeśli Kelly pozwoli, i jedna w kościele. Ludzie wrzucają to, co mogą, a w styczniu, kiedy zrobi się ciężko, będziemy mieli coś odłożonego dla każdego, kto tego potrzebuje. — Spojrzał w górę, znów zawstydzony, jak człowiek bojący się, że jego dobry pomysł zostanie uznany za miękkość. — Kiedyś miałem ciężką zimę, zanim jeszcze otworzyłem sklep. Wciąż pamiętam, kto zostawił mi paczkę na progu. Chciałbym być kimś takim dla kogoś w tym roku.</w:t>
       </w:r>
     </w:p>
     <w:p>
@@ -969,12 +969,12 @@
     </w:p>
     <w:p>
       <w:r>
-        <w:t>— Pomagasz więc?</w:t>
-      </w:r>
-    </w:p>
-    <w:p>
-      <w:r>
-        <w:t xml:space="preserve">— Będę dziergać do kolumny z ciepłymi rzeczami — odparłam — i zaciągnę Nicka do noszenia beczek, dopilnujemy, żeby to doszło do skutku. — Pomyślałam o Grecie, która jeszcze tydzień temu oddałaby temu cały swój sklep, a teraz mogła nie mieć nic do zaoferowania. — Miasto mogłoby tego potrzebować w tym roku.</w:t>
+        <w:t>— Pomożesz więc?</w:t>
+      </w:r>
+    </w:p>
+    <w:p>
+      <w:r>
+        <w:t xml:space="preserve">— Będę dziergać do kolumny z ciepłymi rzeczami — odparłam — i zaciągnę Nicka do noszenia beczek, dopilnujemy, żeby to doszło do skutku. — Pomyślałam o Grecie, która jeszcze tydzień temu oddałaby temu cały swój sklep, a teraz mogła nie mieć nic do zaoferowania. — Miasteczku by się to w tym roku przydało.</w:t>
       </w:r>
     </w:p>
     <w:p>
@@ -1009,7 +1009,7 @@
     </w:p>
     <w:p>
       <w:r>
-        <w:t xml:space="preserve">Na rogu, gdzie skręcałam w Evergreen, odwróciłam się. Wyżej w alei nowa witryna Sugarplum lśniła złotem, jaśniej niż jakikolwiek sklep na ulicy. Niżej, na dolnym końcu, Holly Jolly pogrążony był w mroku.</w:t>
+        <w:t xml:space="preserve">Na rogu, gdzie skręcałam w Evergreen, odwróciłam się. Wyżej w alei nowa witryna Sugarplum lśniła złotem, jaśniej niż jakikolwiek sklep na ulicy. Niżej, na dolnym końcu, Holly Jolly pogrążona była w mroku.</w:t>
       </w:r>
     </w:p>
     <w:p>
@@ -1026,7 +1026,7 @@
     <w:p/>
     <w:p>
       <w:r>
-        <w:t>— Jeszcze jedna partia — rzuciła, zanim zdążyłam zatrzasnąć drzwi. — Zrobiłam to powoli. Wszystko zważyłam dwukrotnie na wadze, którą pożyczyłam od Hala, w razie gdyby moja kłamała. Nowa mąka z worka, który otworzyłam o czwartej i zostawiłam przy tylnych drzwiach, kiedy piece się nagrzewały. Nie z pojemnika. Jeśli to wyjdzie dobrze, to znaczy, że przez ostatnie kilka dni w powietrzu wisiał jakiś zły czar, odzyskam mój sezon i nigdy więcej o tym nie wspominamy.</w:t>
+        <w:t>— Jeszcze jedna partia — rzuciła, zanim zdążyłam zatrzasnąć drzwi. — Zrobiłam to powoli. Wszystko zważyłam dwukrotnie na wadze, którą pożyczyłam od Hala, w razie gdyby moja kłamała. Nowa mąka z worka, który otworzyłam o czwartej i zostawiłam przy tylnych drzwiach, kiedy piece się nagrzewały. Nie z pojemnika. Jeśli to wyjdzie dobrze, to znaczy, że przez ostatnie kilka dni w powietrzu wisiał jakiś zły czar, odzyskam mój sezon i nigdy więcej o tym nie wspomnimy.</w:t>
       </w:r>
     </w:p>
     <w:p/>
@@ -1098,7 +1098,7 @@
     <w:p/>
     <w:p>
       <w:r>
-        <w:t>— Jessica. Zejdź do Holly Jolly. Ktoś rozbił przednią szybę.</w:t>
+        <w:t>— Jessico. Zejdź do Holly Jolly. Ktoś rozbił przednią szybę.</w:t>
       </w:r>
     </w:p>
     <w:p/>
@@ -1140,7 +1140,7 @@
     <w:p/>
     <w:p>
       <w:r>
-        <w:t xml:space="preserve">Obok rozbitej szyby, na jasnych deskach szalunku elewacji, ktoś natrysnął sprayem dwa słowa w kolorze czerwonym, wysokie na trzydzieści centymetrów. Farba spłynęła zbyt grubo na dole liter. Pierwszym słowem było BRUDNE. Drugim NIEBEZPIECZNE.</w:t>
+        <w:t xml:space="preserve">Obok rozbitej szyby, na jasnych deskach szalówki elewacji, ktoś natrysnął sprayem dwa słowa w kolorze czerwonym, wysokie na trzydzieści centymetrów. Farba spłynęła zbyt grubo na dole liter. Pierwszym słowem było BRUDNE. Drugim NIEBEZPIECZNE.</w:t>
       </w:r>
       <w:r>
         <w:t xml:space="preserve"/>
@@ -1212,7 +1212,7 @@
         <w:t xml:space="preserve"/>
       </w:r>
       <w:r>
-        <w:t xml:space="preserve"> na szalunku, który szorowała każdej wiosny. Twarz miała obnażoną, z tą dumą kobiety zmuszonej stanąć publicznie obok kłamstwa na swój temat.</w:t>
+        <w:t xml:space="preserve"> na szalówce, którą szorowała każdej wiosny. Twarz miała obnażoną, z tą dumą kobiety zmuszonej stanąć publicznie obok kłamstwa na swój temat.</w:t>
       </w:r>
     </w:p>
     <w:p/>
@@ -1284,19 +1284,19 @@
     <w:p/>
     <w:p>
       <w:r>
-        <w:t>Hal Thompson nadszedł od strony bloku niemal truchtem, wciąż w swoim fartuchu sklepiarza. Rzucił jedno spojrzenie na szybę, drugie na Gretę i nie marnował słów. Wrócił po swoją ciężarówkę i zjawił się z powrotem z arkuszem sklejki, którą trzymał na wypadek sezonu burzowego, oraz swoją poręczną wiertarką.</w:t>
-      </w:r>
-    </w:p>
-    <w:p/>
-    <w:p>
-      <w:r>
-        <w:t>W ciągu dziesięciu minut zbił dziurę na równo i szczelnie zabezpieczył ją przed wiatrem. Potem cofnął się o krok, spojrzał na czerwone słowo ponad swoją robotą, a jego szczęka się zacisnęła.</w:t>
-      </w:r>
-    </w:p>
-    <w:p/>
-    <w:p>
-      <w:r>
-        <w:t xml:space="preserve">— To zejdzie — oświadczył. — Nie zostanie tu na widoku dla dzieci idących do szkoły. Niech ktoś znajdzie Toma z żelaznego. Będzie miał coś, co zmywa spray, nie niszcząc farby na szalunku.</w:t>
+        <w:t>Hal Thompson nadszedł od strony bloku niemal truchtem, wciąż w swoim fartuchu sklepiarza. Rzucił jedno spojrzenie na szybę, drugie na Gretę i nie marnował słów. Wrócił po swoją ciężarówkę i zjawił się z powrotem z arkuszem sklejki, którą trzymał na wypadek sezonu burzowego, oraz swoją dobrą wiertarką.</w:t>
+      </w:r>
+    </w:p>
+    <w:p/>
+    <w:p>
+      <w:r>
+        <w:t>W ciągu dziesięciu minut zabił otwór sklejką na równo i szczelnie zabezpieczył go przed wiatrem. Potem cofnął się o krok, spojrzał na czerwone słowo ponad swoją robotą, a jego szczęka się zacisnęła.</w:t>
+      </w:r>
+    </w:p>
+    <w:p/>
+    <w:p>
+      <w:r>
+        <w:t xml:space="preserve">— To zejdzie — oświadczył. — Nie zostanie tu na widoku dla dzieci idących do szkoły. Niech ktoś znajdzie Toma z żelaznego. Będzie miał coś, co zmywa spray, nie niszcząc farby na szalówce.</w:t>
       </w:r>
     </w:p>
     <w:p/>
@@ -1416,13 +1416,13 @@
     <w:p/>
     <w:p>
       <w:r>
-        <w:t>— Greta.</w:t>
-      </w:r>
-    </w:p>
-    <w:p/>
-    <w:p>
-      <w:r>
-        <w:t>To wszystko, co obie z siebie wydały. Za plecami Grety Olivia oderwała wzrok od kaloryferów, spojrzała na Ellie, a Ellie odwzajemniła to spojrzenie.</w:t>
+        <w:t>— Greto.</w:t>
+      </w:r>
+    </w:p>
+    <w:p/>
+    <w:p>
+      <w:r>
+        <w:t>To wszystko, co obie z siebie wydały. Za plecami Grety Olivia oderwała wzrok od kaloryfera, spojrzała na Ellie, a Ellie odwzajemniła to spojrzenie.</w:t>
       </w:r>
     </w:p>
     <w:p/>
@@ -1493,7 +1493,7 @@
     <w:p/>
     <w:p>
       <w:r>
-        <w:t>— Odpisuję kierowcy — rzuciła, wstukując wiadomość kciukiem. — Do tej pory pomyli mu się cała trasa.</w:t>
+        <w:t>— Odpisuję kierowcy — rzuciła, wstukując wiadomość kciukiem. — Pewnie już mu się pomyliła cała trasa.</w:t>
       </w:r>
     </w:p>
     <w:p/>
@@ -1523,7 +1523,7 @@
     <w:p/>
     <w:p>
       <w:r>
-        <w:t xml:space="preserve">— Zmuś ją do jedzenia czegoś. Zapomina o tym, kiedy jest wzburzona. — Odłożyła telefon i wyciągnęła wizytówkę z nazwą piekarni, odwróciła ją i dopisała na odwrocie numer kanciastymi, starannymi cyframi. — Facet od szkła, z którego usług korzystam. Dotnie szybę o tym wymiarze do piątku, jeśli zadzwonisz przed dziesiątą. Powiedz mu, że cię posłałam, a nie zawyży rachunku. — Oparła wizytówkę o kasę fiskalną.</w:t>
+        <w:t xml:space="preserve">— Zmuś ją, żeby coś zjadła. Zapomina o tym, kiedy jest wzburzona. — Odłożyła telefon i wyciągnęła wizytówkę z nazwą piekarni, odwróciła ją i dopisała na odwrocie numer kanciastymi, starannymi cyframi. — Facet od szkła, z którego usług korzystam. Dotnie szybę o tym wymiarze do piątku, jeśli zadzwonisz przed dziesiątą. Powiedz mu, że cię posłałam, a nie zawyży rachunku. — Oparła wizytówkę o kasę fiskalną.</w:t>
       </w:r>
     </w:p>
     <w:p/>
@@ -1535,7 +1535,7 @@
     <w:p/>
     <w:p>
       <w:r>
-        <w:t xml:space="preserve">Została przez jakąś godzinę, dopóki Tom nie zmył większości czerwonej farby z szalunku, a kobiety z kręgu zaczęły rozchodzić się do swoich porannych zajęć, po czym zapięła parkę na biały fartuch i ruszyła ku swojemu furgonowi. Dopadłam ją przy krawężniku.</w:t>
+        <w:t xml:space="preserve">Została przez jakąś godzinę, dopóki Tom nie zmył większości czerwonej farby z szalówki, a kobiety z kręgu zaczęły rozchodzić się do swoich porannych zajęć, po czym zapięła parkę na biały fartuch i ruszyła ku swojemu furgonowi. Dopadłam ją przy krawężniku.</w:t>
       </w:r>
     </w:p>
     <w:p/>
@@ -1559,7 +1559,7 @@
     <w:p/>
     <w:p>
       <w:r>
-        <w:t xml:space="preserve">W samo południe szalunek był już czysty. Wciąż dało się dostrzec miejsce, w którym widniało BRUDNE</w:t>
+        <w:t xml:space="preserve">Do południa szalówka była już czysta. Wciąż dało się dostrzec miejsce, w którym widniało BRUDNE</w:t>
       </w:r>
       <w:r>
         <w:t xml:space="preserve"/>
@@ -1598,22 +1598,22 @@
     </w:p>
     <w:p>
       <w:r>
-        <w:t xml:space="preserve">Wiedziałam o tym w tej samej sekundzie, gdy weszłam, tupiąc nogami. Szóstka z nich była pochylona nad swoimi stelażami jak wcześniej, z gałązkami jodły i tym samym słoikiem złoconych szyszek, ale w sklepie zapanowała cisza innego rodzaju. Był to spokój kobiet, które rozmawiały o poważnych rzeczach i zamierzały kontynuować tę rozmowę, gdy tylko drzwi przestaną się poruszać. Olivia podniosła wzrok ze swojego krzesła na czele kręgu. — Usiądź, Jessica. Wszystkie jesteśmy tym wstrząśnięte.</w:t>
-      </w:r>
-    </w:p>
-    <w:p>
-      <w:r>
-        <w:t>— I okno, i ściana — rzuciła Dot, odgryzając kawałek drutu z cichym, ostrym trzaskiem. — Tom zdarł farbę.</w:t>
-      </w:r>
-    </w:p>
-    <w:p>
-      <w:r>
-        <w:t xml:space="preserve">Zajęłam krzesło, które dla mnie zostawiły, w ciepłym środku kręgu zamiast na zimnym końcu przy drzwiach. Olivia bez słowa położyła mi na kolanach świeży stelaż, a obok niego garść gałązek jodły. Zabrałam się za układanie igliwia, jedno na drugim, wszystkie zwrócone w tę samą stronę, i nasłuchiwałam.</w:t>
-      </w:r>
-    </w:p>
-    <w:p>
-      <w:r>
-        <w:t xml:space="preserve">Pip powędrowała prosto do swojego gniazda z czerwonej wełny w oknie, stwierdziła, że poduszka została podbita pod jej nieobecność, i przyjęła to jako coś należnego jej z urzędu. Snowball spał pod krzesłem Marthy. Zanim rozmowa zdążyła się na dobre rozkręcić, Martha pochyliła się przez wolną przestrzeń między naszymi krzesłami i na chwilę położyła swoją suchą, ciepłą dłoń na mojej na drucie.</w:t>
+        <w:t xml:space="preserve">Wiedziałam o tym w tej samej sekundzie, gdy weszłam, tupiąc nogami. Szóstka z nich była pochylona nad swoimi stelażami jak wcześniej, z gałązkami jodły i tym samym słoikiem złoconych szyszek, ale w sklepie zapanowała cisza innego rodzaju. Był to spokój kobiet, które rozmawiały o poważnych rzeczach i zamierzały kontynuować tę rozmowę, gdy tylko drzwi przestaną się poruszać. Olivia podniosła wzrok ze swojego krzesła na czele kręgu. — Usiądź, Jessico. Wszystkie jesteśmy tym wstrząśnięte.</w:t>
+      </w:r>
+    </w:p>
+    <w:p>
+      <w:r>
+        <w:t>— I okno, i ściana — rzuciła Dot, odgryzając kawałek drutu z cichym, ostrym trzaskiem. — Tom zmył farbę.</w:t>
+      </w:r>
+    </w:p>
+    <w:p>
+      <w:r>
+        <w:t xml:space="preserve">Zajęłam krzesło, które dla mnie zostawiły, w ciepłym środku kręgu zamiast na zimnym końcu przy drzwiach. Olivia bez słowa położyła mi na kolanach świeży stelaż, a obok niego garść gałązek jodły. Zabrałam się za układanie gałązek, jedną na drugiej, wszystkie skierowane do domu, i nasłuchiwałam.</w:t>
+      </w:r>
+    </w:p>
+    <w:p>
+      <w:r>
+        <w:t xml:space="preserve">Pip powędrowała prosto do swojego gniazda z czerwonej wełny w oknie, stwierdziła, że pod jej nieobecność ktoś je spulchnił, i przyjęła to jako coś należnego jej z urzędu. Snowball spał pod krzesłem Marthy. Zanim rozmowa zdążyła się na dobre rozkręcić, Martha pochyliła się przez wolną przestrzeń między naszymi krzesłami i na chwilę położyła swoją suchą, ciepłą dłoń na mojej na drucie.</w:t>
       </w:r>
     </w:p>
     <w:p>
@@ -1742,12 +1742,12 @@
     </w:p>
     <w:p>
       <w:r>
-        <w:t xml:space="preserve">— W lipcu zakuł ją łańcuchem, żeby jej mąka nie mogła dojechać — przypomniała Dot. — Nasłała na niego miasto. On nasłał je na nią w sprawie szczurów przy jej koszach. — Cięła drut. — Paskudna rzecz do powiedzenia o piekarce. I dobrze o tym wiedział. A Tom mówi, że Pete kręcił się w tej alejce o każdej porze ostatnio. Przed świtem. Po zamknięciu.</w:t>
-      </w:r>
-    </w:p>
-    <w:p>
-      <w:r>
-        <w:t>— Kręci się — przyznała Ivy, wcale nie zadowolona z tego faktu. — Tom sam mi mówił. Pete kupił u niego drugą kłódkę nie dalej jak tydzień temu. Powiedział, że kłódka Grety ciągle spada z łańcucha. — Obróciła wianek w dłoniach. — Ale to chłop zamykający bramę, pomyślałam sobie. Nie chłop rzucający cegłą.</w:t>
+        <w:t xml:space="preserve">— W lipcu zakuł ją łańcuchem, żeby jej mąka nie mogła dojechać — przypomniała Dot. — Nasłała na niego gminę. On nasłał ją na nią w sprawie szczurów przy jej koszach. — Cięła drut. — Paskudna rzecz do powiedzenia o piekarce. I dobrze o tym wiedział. A Tom mówi, że Pete kręcił się w tej alejce o każdej porze ostatnio. Przed świtem. Po zamknięciu.</w:t>
+      </w:r>
+    </w:p>
+    <w:p>
+      <w:r>
+        <w:t>— Kręci się — przyznała Ivy, wcale nie zadowolona z tego faktu. — Tom sam mi mówił. Pete kupił u niego drugą kłódkę nie dalej jak tydzień temu. Powiedział, że kłódka Grety ciągle spada z łańcucha. — Obróciła wieniec w dłoniach. — Ale to chłop zamykający bramę, pomyślałam sobie. Nie chłop rzucający cegłą.</w:t>
       </w:r>
     </w:p>
     <w:p>
@@ -1792,7 +1792,7 @@
     </w:p>
     <w:p>
       <w:r>
-        <w:t xml:space="preserve">— Uznajmy, że zostało powiedziane i zawstydzone — stwierdziła Dot, i na tym temat w kręgu się skończył.</w:t>
+        <w:t xml:space="preserve">— Uznajmy, że zostało powiedziane i że się wstydzimy — stwierdziła Dot, i na tym temat w kręgu się skończył.</w:t>
       </w:r>
     </w:p>
     <w:p>
@@ -1817,7 +1817,7 @@
     </w:p>
     <w:p>
       <w:r>
-        <w:t xml:space="preserve">Obróciłam wianek. Rozmywająca się farba oznaczała dla mnie pośpiech bardziej niż młodość. Ktoś, kto to zrobił, chciał oznaczyć ścianę i zniknąć przed świtem. Chłopak chcący się popisać zostałby, żeby to podziwiać. Mimo to farba i zniszczone wypieki nie musiały być dziełem tej samej osoby: mogła to być jedna osoba uderzająca dwa razy albo nudzący się dzieciak, który słyszał, jak wszyscy gadają o </w:t>
+        <w:t xml:space="preserve">Obróciłam wieniec. Rozmywająca się farba oznaczała dla mnie pośpiech bardziej niż młodość. Ktoś, kto to zrobił, chciał oznaczyć ścianę i zniknąć przed świtem. Chłopak chcący się popisać zostałby, żeby to podziwiać. Mimo to farba i zniszczone wypieki nie musiały być dziełem tej samej osoby: mogła to być jedna osoba uderzająca dwa razy albo nudzący się dzieciak, który słyszał, jak wszyscy gadają o </w:t>
       </w:r>
       <w:r>
         <w:t xml:space="preserve"/>
@@ -1844,7 +1844,7 @@
     </w:p>
     <w:p>
       <w:r>
-        <w:t>— Zdarzało mi się już wymieniać ludzi na podstawie mniejszych dowodów niż to — odparłam — i myliłam się, a potem musiałam żyć z nimi ulica w ulicę. — Uniosłam skończony wianek, na którym każda gałązka była zwrócona we właściwą stronę. — Greta zasłużyła na coś lepszego niż moje zgadywanki. Zasłużyła na to od nas wszystkich.</w:t>
+        <w:t>— Zdarzało mi się już wymieniać ludzi na podstawie mniejszych dowodów niż to — odparłam — i myliłam się, a potem musiałam żyć z nimi ulica w ulicę. — Uniosłam skończony wieniec, na którym każda gałązka była zwrócona we właściwą stronę. — Greta zasłużyła na coś lepszego niż moje zgadywanki. Zasłużyła na to od nas wszystkich.</w:t>
       </w:r>
     </w:p>
     <w:p>
@@ -1998,7 +1998,7 @@
     <w:p/>
     <w:p>
       <w:r>
-        <w:t>— Wcale tego nie szukałem — rzekł, uwalniając ostatni gwoździk i odchylając tylną ściankę. — Przegląda się listy podatkowe, protokoły z posiedzeń kościoła i akty notarialne, te suche kości miasta. Nie szuka się niczego poza porządkiem. A potem… — Obrócił rysunek w stronę lampy. — A potem odwracasz coś na drugą stronę.</w:t>
+        <w:t>— Wcale tego nie szukałem — rzekł, uwalniając ostatni gwoździk i odchylając tylną ściankę. — Przegląda się listy podatkowe, protokoły z posiedzeń kościoła i akty notarialne, te suche kości miasteczka. Nie szuka się niczego poza porządkiem. A potem… — Obrócił rysunek w stronę lampy. — A potem odwraca się coś na drugą stronę.</w:t>
       </w:r>
     </w:p>
     <w:p/>
@@ -2016,7 +2016,7 @@
     <w:p/>
     <w:p>
       <w:r>
-        <w:t xml:space="preserve">Przeczytałam to dwa razy. To rzadka rzecz — odwrócić strzęp historii założenia miasta i odnaleźć tam nie przechwałkę pisaną ręką założycielki, lecz zwykłe, niespodziewane dziękczynienie. Nie </w:t>
+        <w:t xml:space="preserve">Przeczytałam to dwa razy. To rzadka rzecz — odwrócić strzęp historii założenia miasteczka i odnaleźć tam nie przechwałkę pisaną ręką założycielki, lecz zwykłe, niespodziewane dziękczynienie. Nie </w:t>
       </w:r>
       <w:r>
         <w:rPr>
@@ -2040,7 +2040,7 @@
     <w:p/>
     <w:p>
       <w:r>
-        <w:t xml:space="preserve">— Eliza Frost — powiedział Theo, a w jego głosie brzmiała cisza, gdy wypowiadał to imię. — Mamy jej nazwisko w aktach, jej kamień na cmentarzu i ani trzech zdań od niej, które nie byłyby prawem lub księgą rachunkową. A tu proszę, mówi nam wprost, do czego jej zdaniem miasto miało służyć. — Położył kartkę na bezkwasowym papierze obiema rękami. — </w:t>
+        <w:t xml:space="preserve">— Eliza Frost — powiedział Theo, a w jego głosie brzmiała cisza, gdy wypowiadał to imię. — Mamy jej nazwisko w aktach, jej kamień na cmentarzu i ani trzech zdań od niej, które nie byłyby prawem lub księgą rachunkową. A tu proszę, mówi nam wprost, do czego jej zdaniem miasteczko miało służyć. — Położył kartkę na bezkwasowym papierze obiema rękami. — </w:t>
       </w:r>
       <w:r>
         <w:rPr>
@@ -2064,7 +2064,7 @@
     <w:p/>
     <w:p>
       <w:r>
-        <w:t>— W roku, w którym miasto niemal nie przetrwało — powiedziałam. — Musiała doskonale wiedzieć, ile to słowo kosztowało.</w:t>
+        <w:t>— W roku, w którym miasteczko niemal nie przetrwało — powiedziałam. — Musiała doskonale wiedzieć, ile to słowo kosztowało.</w:t>
       </w:r>
     </w:p>
     <w:p/>
@@ -2076,7 +2076,7 @@
     <w:p/>
     <w:p>
       <w:r>
-        <w:t>Odłożył rysunek do tacki i przez chwilę oboje milczeliśmy, a w tej ciszy znów dotarło do mnie, jak mroźny jest cały ten frontowy pokój wokół nas. Za naszymi plecami, w przednim oknie, któremu Towarzystwo przyznało honorowe miejsce, spoczywała miedziana kapsuła czasu.</w:t>
+        <w:t>Odłożył rysunek do tacki i przez chwilę oboje milczeliśmy, a w tej ciszy znów dotarło do mnie, jak mroźny jest cały ten frontowy pokój wokół nas. Za naszymi plecami, w przednim oknie, gdzie Towarzystwo wyznaczyło jej honorowe miejsce, spoczywała miedziana kapsuła czasu.</w:t>
       </w:r>
     </w:p>
     <w:p/>
@@ -2109,13 +2109,13 @@
     <w:p/>
     <w:p>
       <w:r>
-        <w:t>— Ja nic nie zrobiłem. Po prostu odwróciłem rysunek. — Powiedział to płasko, odrzucając zasługi, a ja zrozumiałam, że to odmówienie przyjęcia pochwały stanowiło część jego pokuty. Zasada, którą narzucił sobie wbrew dziękowaniu, i zamierzał jej przestrzegać, bez względu na to, jak bardzo go to uwierało. — Niezależnie od tego, kto wcisnął ten rysunek w ramę z ukrytymi w środku słowami założycielki, to oni to zrobili. Ja po prostu akurat sortowałem pudło w dniu, w którym wymagało ono odwrócenia.</w:t>
-      </w:r>
-    </w:p>
-    <w:p/>
-    <w:p>
-      <w:r>
-        <w:t xml:space="preserve">Pozwoliłam mu na tę pokorę, ponieważ była prawdziwa. Ale widziałam też, że nie zamierzał przywłaszczyć sobie ani skrawka gruntu, który nie należał do niego w sposób oczywisty. W październiku Theo Hussein sięgnął po coś, co nie było jego, i wziął to pod wpływem niemal słusznego powodu, posługując się całkowicie niewłaściwymi metodami. Kosztowało go to stanowisko szefa Towarzystwa, które kochał, i niemal cały szacunek miasteczka. Teraz nie chciał przyjąć nawet skromnej, uczciwej pochwały za szczęśliwe znalezisko. Wiedział aż nazbyt dobrze, jak daleko może zawieźć człowieka jeden fałszywy krok, i właśnie dlatego stąpał ostrożnie. Przepuściłam to bez słowa uznania. Poprosił — nie prosząc wprost — żebym tego nie robiła.</w:t>
+        <w:t>— Ja nic nie zrobiłem. Po prostu odwróciłem rysunek. — Powiedział to płasko, odrzucając zasługi, a ja zrozumiałam, że to odmówienie przyjęcia pochwały stanowiło część jego pokuty. Zasada, którą sobie narzucił, by nie przyjmować podziękowań, i zamierzał jej przestrzegać, bez względu na to, jak bardzo go to uwierało. — Niezależnie od tego, kto wcisnął ten rysunek w ramę z ukrytymi w środku słowami założycielki, to oni to zrobili. Ja po prostu akurat sortowałem pudło w dniu, w którym wymagało ono odwrócenia.</w:t>
+      </w:r>
+    </w:p>
+    <w:p/>
+    <w:p>
+      <w:r>
+        <w:t xml:space="preserve">Pozwoliłam mu na tę pokorę, ponieważ była prawdziwa. Ale widziałam też, że nie zamierzał przywłaszczyć sobie ani skrawka gruntu, który nie należał do niego w sposób oczywisty. W październiku Theo Hussein sięgnął po coś, co nie było jego, i wziął to pod wpływem niemal słusznego powodu, posługując się całkowicie niewłaściwymi metodami. Kosztowało go to stanowisko szefa Towarzystwa, które kochał, i niemal cały szacunek miasteczka. Teraz nie chciał przyjąć nawet skromnej, uczciwej pochwały za szczęśliwe znalezisko. Wiedział aż nazbyt dobrze, jak daleko może zaprowadzić człowieka jeden fałszywy krok, i właśnie dlatego stąpał ostrożnie. Przepuściłam to bez słowa uznania. Poprosił — nie prosząc wprost — żebym tego nie robiła.</w:t>
       </w:r>
     </w:p>
     <w:p/>
@@ -2133,7 +2133,7 @@
     <w:p/>
     <w:p>
       <w:r>
-        <w:t xml:space="preserve">Claire wiedziała o tym przed kolacją. Dwa dni później fotografia rysunku trafiła do Gazette — po obu stronach, sztywni ołówkowi założyciele oraz delikatne, brązowe pismo. Nagłówek głosił SŁOWA SAMEJ ZAŁOŻYCIELKI, a pod nim, mniejszą czcionką: </w:t>
+        <w:t xml:space="preserve">Claire wiedziała o tym przed kolacją. Dwa dni później fotografia rysunku trafiła do Gazette — obie strony, sztywni ołówkowi założyciele oraz delikatne, brązowe pismo. Nagłówek głosił SŁOWA SAMEJ ZAŁOŻYCIELKI, a pod nim, mniejszą czcionką: </w:t>
       </w:r>
       <w:r>
         <w:rPr>
@@ -2178,7 +2178,7 @@
     <w:p/>
     <w:p>
       <w:r>
-        <w:t xml:space="preserve">— Chodzi o dach i piec naraz — oznajmił. — Miasto o tym wie. Nikt nie chce spojrzeć prawdzie w oczy, bo w kasie pustki. Ale… — Puknął palcem w kolumny. — Ludzie zaczęli przychodzić, żeby obejrzeć pudło. Słowa założycielki widnieją w każdym oknie na ulicy. Wczoraj u Frosty'ego słyszałem dwie kobiety, które zazwyczaj liczą się z każdym centem, jak mówią, że wstydem byłoby pozwolić, by budynek zawalił się wokół tej skrzyni akurat w roku, w którym mamy ją otworzyć. — Podniósł wzrok, pełen nadziei, lecz skrytej pod nieśmiałością. — No więc. Beczka dla Towarzystwa. Postawiona tam, gdzie kręcą się ludzie. Nikt nikogo nie zmusza.</w:t>
+        <w:t xml:space="preserve">— Chodzi o dach i piec naraz — oznajmił. — Miasteczko o tym wie. Nikt nie chce spojrzeć prawdzie w oczy, bo w kasie pustki. Ale… — Puknął palcem w kolumny. — Ludzie zaczęli przychodzić, żeby obejrzeć pudło. Słowa założycielki widnieją w każdym oknie na ulicy. Wczoraj u Frosty'ego słyszałem dwie kobiety, które zazwyczaj liczą się z każdym centem, jak mówią, że wstydem byłoby pozwolić, by budynek zawalił się wokół tej skrzyni akurat w roku, w którym mamy ją otworzyć. — Podniósł wzrok, pełen nadziei, lecz skrytej pod nieśmiałością. — No więc. Beczka dla Towarzystwa. Postawiona tam, gdzie kręcą się ludzie. Nikt nikogo nie zmusza.</w:t>
       </w:r>
     </w:p>
     <w:p/>
@@ -2190,13 +2190,13 @@
     <w:p/>
     <w:p>
       <w:r>
-        <w:t xml:space="preserve">— Zbuduj tę beczkę — powiedziałam. — Ja upiekę coś do niej i zaciągnę Nicka, żeby pomógł ją wnieść. I dam głowę, że Greta też coś upiecze, gdy tylko odzyska swoje piece, bo nie ma na tej ulicy duszy, która trzymałaby jej imię w oknie przez ten cały czas i nie odpłaciła jej tym samym. — Złożyłam jego kartkę równo wzdłuż zgięcia, bo tak właśnie lubił, i oddałam mu ją z powrotem. — Towarzystwo nadal ma poważne kłopoty, Hal. Nie daj się zwieść temu miłemu nastrojowi. Słowa założycielki nie naprawią pieca.</w:t>
-      </w:r>
-    </w:p>
-    <w:p/>
-    <w:p>
-      <w:r>
-        <w:t xml:space="preserve">— Nie — zgodził się, zarazem uradowany i poważny. — Ale przyciągnie ludzi do środka, żeby usłyszeli, jak ten piec stuka. A kiedy już usłyszą to stukanie, stojąc przed tym pudłem, nie będą potrafili o tym zapomnieć. — Schował kartkę do kieszeni płaszcza.</w:t>
+        <w:t xml:space="preserve">— Zbuduj tę beczkę — powiedziałam. — Ja upiekę coś do niej i zaciągnę Nicka, żeby pomógł ją wnieść. I dam głowę, że Greta też coś upiecze, gdy tylko odzyska swoje piece, bo nie ma na tej ulicy duszy, która trzymałaby jej imię w oknie przez ten cały czas a nie mogła liczyć, że Greta odwdzięczy się tym samym. — Złożyłam jego kartkę równo wzdłuż zgięcia, bo tak właśnie lubił, i oddałam mu ją z powrotem. — Towarzystwo nadal ma poważne kłopoty, Hal. Nie daj się zwieść temu miłemu nastrojowi. Słowa założycielki nie naprawią pieca.</w:t>
+      </w:r>
+    </w:p>
+    <w:p/>
+    <w:p>
+      <w:r>
+        <w:t xml:space="preserve">— Nie — zgodził się, zarazem uradowany i poważny. — Ale przyciągną ludzi do środka, żeby usłyszeli, jak ten piec stuka. A kiedy już usłyszą to stukanie, stojąc przed tym pudłem, nie będą potrafili o tym zapomnieć. — Schował kartkę do kieszeni płaszcza.</w:t>
       </w:r>
     </w:p>
     <w:p/>
@@ -2225,13 +2225,13 @@
     <w:p/>
     <w:p>
       <w:r>
-        <w:t>W czwartek, gdy byłam w Towarzystwie — późnym popołudniem, zanim zamknęli — wstąpiłam do sklepu Pete’a Garcii z myślą o pieczeni i z kłopotami Grety w głowie. Pozwoliłam mu wierzyć, że pieczeń to cały cel mojej wizyty.</w:t>
-      </w:r>
-    </w:p>
-    <w:p/>
-    <w:p>
-      <w:r>
-        <w:t xml:space="preserve">Masarnia Pete’a znajdowała się po drugiej stronie skweru, naprzeciw Evergreen Avenue, w rzędzie sklepów zwróconym fasadą ku Parkowi od jego dalszej strony. Przeszłam na drugą stronę odśnieżoną ścieżką obok pomnika weteranów. Mięso dowożono do niego przez podwórko na tyłach sklepów przy Evergreen, to samo, na które wychodziła mąka Grety. Dopóki nie stanęłam na jego wycieraczce ze wciąż kołyszącym się nad głową dzwonkiem, nie uświadomiłam sobie w pełni, jak bardzo to jedno podwórko wiąże jego kłopoty z jej kłopotami. W sklepie było ciepło. Pachniało w nim zimnym, świeżym mięsem i trocinami, a pod tym wszystkim unosił się słaby, żelazny posmak, obecny w każdej masarni bez względu na to, jak dokładnie była wyszorowana. Pete stał za ladą w pasiastym fartuchu, barczysty, ze skroniami przyprószonymi siwizną. Porcjował półtuszę krótkimi, oszczędnymi ruchami człowieka, który robił to już ze czterdzieści tysięcy razy. Spojrzał w górę na dźwięk dzwonka, dostrzegł mnie, a jego twarz stała się ostrożna. Było to spojrzenie kogoś, kto ostatnio zauważył, że ludzie przekraczający jego próg zazwyczaj chcą od niego dokładnie tego samego.</w:t>
+        <w:t>W czwartek, gdy byłam w Towarzystwie — późnym popołudniem, zanim zamknął — wstąpiłam do sklepu Pete’a Garcii z myślą o pieczeni i z kłopotami Grety w głowie. Pozwoliłam mu wierzyć, że pieczeń to cały cel mojej wizyty.</w:t>
+      </w:r>
+    </w:p>
+    <w:p/>
+    <w:p>
+      <w:r>
+        <w:t xml:space="preserve">Masarnia Pete’a znajdowała się po drugiej stronie skweru, naprzeciw Evergreen Avenue, w rzędzie sklepów zwróconym fasadą ku skwerowi od jego dalszej strony. Przeszłam na drugą stronę odśnieżoną ścieżką obok pomnika weteranów. Mięso dowożono do niego przez podwórko na tyłach sklepów przy Evergreen, to samo, przez które dowożono mąkę Grety. Dopóki nie stanęłam na jego wycieraczce ze wciąż kołyszącym się nad głową dzwonkiem, nie uświadomiłam sobie w pełni, jak bardzo to jedno podwórko wiąże jego kłopoty z jej kłopotami. W sklepie było ciepło. Pachniało w nim zimnym, świeżym mięsem i trocinami, a pod tym wszystkim unosił się słaby, żelazny posmak, obecny w każdej masarni bez względu na to, jak dokładnie była wyszorowana. Pete stał za ladą w pasiastym fartuchu, barczysty, ze skroniami przyprószonymi siwizną. Porcjował półtuszę krótkimi, oszczędnymi ruchami człowieka, który robił to już ze czterdzieści tysięcy razy. Spojrzał w górę na dźwięk dzwonka, dostrzegł mnie, a jego twarz stała się ostrożna. Było to spojrzenie kogoś, kto ostatnio zauważył, że ludzie przekraczający jego próg zazwyczaj chcą od niego dokładnie tego samego.</w:t>
       </w:r>
     </w:p>
     <w:p/>
@@ -2243,7 +2243,7 @@
     <w:p/>
     <w:p>
       <w:r>
-        <w:t xml:space="preserve">— Bywam tu częściej, niż się panu wydaje — odparłam. — Przyszedłam po pieczeń. Nick nabrał ochoty na porządny niedzielny obiad, a nie będę karmić go niczym w folii termokurczliwej w mieście, w którym ma pan swój sklep. Co pan ma dla dwóch osób i kucharki, która za dużo mówi, a za mało pilnuje piekarnika?</w:t>
+        <w:t xml:space="preserve">— Bywam tu częściej, niż się panu wydaje — odparłam. — Przyszedłam po pieczeń. Nick nabrał ochoty na porządny niedzielny obiad, a nie będę karmić go niczym w folii termokurczliwej w miasteczku, w którym ma pan swój sklep. Co pan ma dla dwóch osób i kucharki, która za dużo mówi, a za mało pilnuje piekarnika?</w:t>
       </w:r>
     </w:p>
     <w:p/>
@@ -2255,7 +2255,7 @@
     <w:p/>
     <w:p>
       <w:r>
-        <w:t xml:space="preserve">— Ten — rzekł Pete, poklepując łopatę. — Wolny piekarnik, przez całe popołudnie. Zostawi to pani w spokoju, co, jak słyszałem, jest dla pani najtrudniejsze. — Przemknął mu w oczach suchy błysk. — Zwiążę to. Proszę dać mi minutę.</w:t>
+        <w:t xml:space="preserve">— Ta — rzekł Pete, poklepując łopatę. — Wolny piekarnik, przez całe popołudnie. Zostawi to pani w spokoju, co, jak słyszałem, jest dla pani najtrudniejsze. — Przemknął mu w oczach suchy błysk. — Zwiążę to. Proszę dać mi minutę.</w:t>
       </w:r>
     </w:p>
     <w:p/>
@@ -2297,7 +2297,7 @@
     <w:p/>
     <w:p>
       <w:r>
-        <w:t xml:space="preserve">— To więcej, niż zadała sobie trud większość. — Obrócił pieczeń i zaczął nową pętlę. — Nie powiem pani, że Greta i ja jesteśmy przyjaciółmi. Nie jesteśmy i nie pozwolę pani przyłapać mnie na kłamstwie. To podwórko jest zbudowane dla jednej ciężarówki, a chętnych na nie mamy dwoje. I owszem, założyłem łańcuch na bramę w lipcu, i owszem, nasłała na mnie miasto, i owszem — jego szczęka się zacisnęła — powiedziałem coś o jej śmietnikach i szczurach, czego bym już nie powtórzył i czego w ogóle nie powinienem był mówić, i należą jej się przeprosiny, którą dostanie, gdy trochę mi przejdzie, a wcześniej nie. — Pociągnął za węzeł. — Taka jest prawda i jest wystarczająco brzydka. Ale to prawda o rampie załadunkowej. To nie jest prawda o cegle w oknie.</w:t>
+        <w:t xml:space="preserve">— To więcej, niż zadała sobie trud większość. — Obrócił pieczeń i zaczął nową pętlę. — Nie powiem pani, że Greta i ja jesteśmy przyjaciółmi. Nie jesteśmy i nie pozwolę pani przyłapać mnie na kłamstwie. To podwórko jest zbudowane dla jednej ciężarówki, a chętnych na nie mamy dwoje. I owszem, założyłem łańcuch na bramę w lipcu, i owszem, nasłała na mnie gminę, i owszem — jego szczęka się zacisnęła — powiedziałem coś o jej śmietnikach i szczurach, czego bym już nie powtórzył i czego w ogóle nie powinienem był mówić, i należą jej się przeprosiny, które dostanie, gdy trochę mi przejdzie, a wcześniej nie. — Pociągnął za węzeł. — Taka jest prawda i jest wystarczająco brzydka. Ale to prawda o rampie załadunkowej. To nie jest prawda o cegle w oknie.</w:t>
       </w:r>
     </w:p>
     <w:p/>
@@ -2351,7 +2351,7 @@
     <w:p/>
     <w:p>
       <w:r>
-        <w:t xml:space="preserve">— Coś pani powiem — zaczął ciszej, a w jego głosie nie było już żalu — i zrobi pani z tym, co pani zechce, bo sam nie potrafię z tym nic zrobić. Tymi rankami, kiedy jestem na podwórku w ciemnościach, wcale nie bywałem tam sam. — Skierował wzrok ku przedniej szybie i witrynom sklepów przy Evergreen po drugiej stronie skweru, zasłaniającym podwórko. — Ktoś kręcił się z tyłu za jej sklepem. Wcześnie, zanim zrobiło się na tyle jasno, by dostrzec twarz, widać było tylko sylwetkę, która znikała błyskawicznie, gdy tylko światła moich reflektorów skręcały za róg. Widziałem to dwa razy. Może trzy. Ktoś, kogo nie powinno tam być o tej porze, tuż przy jej tylnych drzwiach, a potem uciekał. — Zmarszczył brwi, wpatrując się w swoje dłonie. — Za pierwszym razem wziąłem go za włóczęgę szukającego ciepła uchodzącego z jej wentylacji. Ale włóczęga osiedla się na dłużej, a ten tego nie zrobił. Ten ktoś coś robił. I uciekł, gdy został zauważony. Jednego z tych ranków stał tam nieznany mi van, zaparkowany na samym końcu przy aptece ze zgaszonymi światłami. To nie był wóz dostawcy mięsa. Z rejestracją spoza miasta; nie zapamiętałem numerów.</w:t>
+        <w:t xml:space="preserve">— Coś pani powiem — zaczął ciszej, a w jego głosie nie było już żalu — i zrobi pani z tym, co pani zechce, bo sam nie potrafię z tym nic zrobić. Tymi rankami, kiedy jestem na podwórku w ciemnościach, wcale nie bywałem tam sam. — Skierował wzrok ku przedniej szybie i witrynom sklepów przy Evergreen po drugiej stronie skweru, zasłaniającym podwórko. — Ktoś kręcił się z tyłu za jej sklepem. Wcześnie, zanim zrobiło się na tyle jasno, by dostrzec twarz, widać było tylko sylwetkę, która znikała błyskawicznie, gdy tylko światła moich reflektorów skręcały za róg. Widziałem to dwa razy. Może trzy. Ktoś, kogo nie powinno tam być o tej porze, tuż przy jej tylnych drzwiach, a potem uciekał. — Zmarszczył brwi, wpatrując się w swoje dłonie. — Za pierwszym razem wziąłem go za włóczęgę szukającego ciepła uchodzącego z jej wentylacji. Ale włóczęga osiedla się na dłużej, a ten tego nie zrobił. Ten ktoś coś robił. I uciekł, gdy został zauważony. Jednego z tych ranków stał tam nieznany mi van, zaparkowany na samym końcu przy aptece ze zgaszonymi światłami. To nie był wóz dostawcy mięsa. Z rejestracją spoza miasteczka; nie zapamiętałem numerów.</w:t>
       </w:r>
     </w:p>
     <w:p/>
@@ -2369,7 +2369,7 @@
     <w:p/>
     <w:p>
       <w:r>
-        <w:t xml:space="preserve">— Komu miałbym powiedzieć? — Rozłożył wielkie dłonie w geście goryczy i szczerości. — Miastu, które już mnie skazało? Powiem, że widziałem sylwetkę przy tylnych drzwiach Grety, a pierwszą reakcją każdego będzie: </w:t>
+        <w:t xml:space="preserve">— Komu miałbym powiedzieć? — Rozłożył wielkie dłonie w geście goryczy i szczerości. — Miasteczku, które już mnie skazało? Powiem, że widziałem sylwetkę przy tylnych drzwiach Grety, a pierwszą reakcją każdego będzie: </w:t>
       </w:r>
       <w:r>
         <w:rPr>
@@ -2408,7 +2408,7 @@
     <w:p/>
     <w:p>
       <w:r>
-        <w:t xml:space="preserve">— Niedziela — mruknął Pete, wydając mi resztę, znowu szorstki, gdy trudny temat zszedł na dalszy plan. — Wolny piekarnik. Niech pani zostawi to w spokoju. I — nie uniósł wzroku, poprawiając szpulę ze sznurkiem, która wcale tego nie wymagała — powie jej pani, jeśli nadarzy się okazja, że nigdy nie dotknąłem jej okna. Nie rozmawiamy, bo inaczej sam bym jej to powiedział. Cokolwiek jest między nami w sprawie tej rampy, to tylko łańcuch i parę słów. To nie to. Nie robię rzeczy po ciemku. Jeśli mam z kimś zatarg, dowiaduje się o tym ode mnie prosto w oczy, na tyle głośno, żeby cała ulica mogła się o tym dowiedzieć. — Jego szczęka się napięła. — W tym tkwi mój problem, ludzie pani powiedzą. We mnie nie ma nic cichego.</w:t>
+        <w:t xml:space="preserve">— Niedziela — mruknął Pete, wydając mi resztę, znowu szorstki, gdy trudne słowa miał już za sobą. — Wolny piekarnik. Niech pani zostawi to w spokoju. I — nie uniósł wzroku, poprawiając szpulę ze sznurkiem, która wcale tego nie wymagała — powie jej pani, jeśli nadarzy się okazja, że nigdy nie dotknąłem jej okna. Nie rozmawiamy, bo inaczej sam bym jej to powiedział. Cokolwiek jest między nami w sprawie tej rampy, to tylko łańcuch i parę słów. To nie to. Nie robię rzeczy po ciemku. Jeśli mam z kimś zatarg, dowiaduje się o tym ode mnie prosto w oczy, na tyle głośno, żeby cała ulica mogła się o tym dowiedzieć. — Jego szczęka się napięła. — W tym tkwi mój problem, ludzie pani powiedzą. We mnie nie ma nic cichego.</w:t>
       </w:r>
     </w:p>
     <w:p/>
@@ -2438,7 +2438,7 @@
     <w:p/>
     <w:p>
       <w:r>
-        <w:t xml:space="preserve">Gdybym szukała łatwego nazwiska dla kręgu, miałam go podanego jak na tacy i przewiązanego jego własnym sznurkiem: kłótnia, skład, godziny przed świtem. A jednak, gdyby Pete pracował nad tym, by wykurzyć Gretę z okolicy, chyba nie wyłożyłby całej swojej urazy na ladę bez proszenia, ani nie przyznałby sam z siebie, że kręcił się tam w ciemnościach. W jego sporze nie było nic cichego. Podrzucił mi jednak informację o jakiejś postaci pod jej tylnymi drzwiami, a gdyby zmyślił ją, by ratować skórę, nadałby jej twarz i obarczył nią kogoś, kogo miasto już nie lubiło. Zostawił to po prostu jako sylwetkę, bo sylwetkę właśnie widział.</w:t>
+        <w:t xml:space="preserve">Gdybym szukała łatwego nazwiska dla kręgu, miałam go podanego jak na tacy i przewiązanego jego własnym sznurkiem: kłótnia, skład, godziny przed świtem. A jednak, gdyby Pete pracował nad tym, by wykurzyć Gretę z okolicy, chyba nie wyłożyłby całej swojej urazy na ladę bez proszenia, ani nie przyznałby sam z siebie, że kręcił się tam w ciemnościach. W jego sporze nie było nic cichego. Podrzucił mi jednak informację o jakiejś postaci pod jej tylnymi drzwiami, a gdyby zmyślił ją, by ratować skórę, nadałby jej twarz i obarczył nią kogoś, kogo miasteczko już nie lubiło. Zostawił to po prostu jako sylwetkę, bo sylwetkę właśnie widział.</w:t>
       </w:r>
     </w:p>
     <w:p/>
@@ -2509,7 +2509,7 @@
     </w:p>
     <w:p>
       <w:r>
-        <w:t xml:space="preserve">I nigdzie ani śladu stóp. To właśnie sprawiało, że za każdym razem, gdy nowy człowiek podchodził do bloku i spojrzał, śmiech zamierał mu na ustach. Śnieg leżał czysty i głęboki wokół każdego z nich. Nic w nim nie zapisano. Żadnego wleczonego śladu. Żadnych odcisków butów krążących tam, gdzie mógł stać żartowniś, żeby pchać figurę. Tylko sami bałwani, przestawieni i zgromadzeni, z całkowicie niewinnym wyrazem posągów, które absolutnie nigdzie nie były.</w:t>
+        <w:t xml:space="preserve">I nigdzie ani śladu stóp. To właśnie sprawiało, że za każdym razem, gdy nowy człowiek podchodził do bloku i spoglądał, śmiech zamierał mu na ustach. Śnieg leżał czysty i głęboki wokół każdego z nich. Nic w nim nie zapisano. Żadnego wleczonego śladu. Żadnych odcisków butów krążących tam, gdzie mógł stać żartowniś, żeby pchać figurę. Tylko sami bałwani, przestawieni i zgromadzeni, z całkowicie niewinnym wyrazem posągów, które absolutnie nigdzie nie były.</w:t>
       </w:r>
     </w:p>
     <w:p>
@@ -2519,7 +2519,7 @@
     </w:p>
     <w:p>
       <w:r>
-        <w:t>Ale miasto nie składało się z samych Halów. Ludzie chcieli wiedzieć jak, ponieważ to pozwalało im bezpiecznie się roześmiać i wrócić do środka, więc w ciągu kwadransa wymyślili sobie kilka wyjaśnień.</w:t>
+        <w:t>Ale miasteczko nie składało się z samych Halów. Ludzie chcieli wiedzieć jak, ponieważ to pozwalało im bezpiecznie się roześmiać i wrócić do środka, więc w ciągu kwadransa wymyślili sobie kilka wyjaśnień.</w:t>
       </w:r>
     </w:p>
     <w:p>
@@ -2549,7 +2549,7 @@
     </w:p>
     <w:p>
       <w:r>
-        <w:t>Kelly przyniosła. Nadeszła od strony Starlight z wielkim dzbanem i rozlewała ją jak generał zaopatrujący zszokowaną armię. Całość nabrała charakteru małego festiwalu. Sąsiedzi na mrozie, w płaszczach narzuconych na piżamy.</w:t>
+        <w:t>Kelly przyniosła. Nadeszła od strony Starlight z wielkim dzbanem i rozlewała ją jak generał zaopatrujący zdumioną armię. Całość nabrała charakteru małego festiwalu. Sąsiedzi na mrozie, w płaszczach narzuconych na piżamy.</w:t>
       </w:r>
     </w:p>
     <w:p>
@@ -2564,7 +2564,7 @@
     </w:p>
     <w:p>
       <w:r>
-        <w:t xml:space="preserve">Tłum tego nie zauważył. Będąc tłumem, radosnym i niezatrudnionym w zawodzie liczyciela. Ale kiedy wypiłam już swój kubek, obeszłam powoli skwer z Pip tuż przy pięcie i przyjrzałam się każdemu po kolei. Większość była ze sobą zgodna. Wszystkie pochylały się w jedną stronę, tak jak opiłki żelaza układają się w tym samym kierunku, gdy przesunie się pod papierem magnes. Nie w stronę alei, kościoła ani siebie nawzajem. W stronę Hollyhock Lane i jej dalszego końca, gdzie miasto rzedniało w pola, a Nick trzymał swój warsztat. Każda ślepa węglowa twarz zwróciła się w tamtą stronę i pochyliła. Cierpliwie i z nadzieją. Niczym wędrowcy przyciągani do paleniska, które czują, ale jeszcze go nie widzą. Wiedziałam, czyje to przyciąganie. Wcale mnie to nie przeraziło.</w:t>
+        <w:t xml:space="preserve">Tłum tego nie zauważył. Będąc tłumem, radosnym i niezatrudnionym w zawodzie liczyciela. Ale kiedy wypiłam już swój kubek, obeszłam powoli skwer z Pip tuż przy pięcie i przyjrzałam się każdemu po kolei. Większość była ze sobą zgodna. Wszystkie pochylały się w jedną stronę, tak jak opiłki żelaza układają się w tym samym kierunku, gdy przesunie się pod papierem magnes. Nie w stronę alei, kościoła ani siebie nawzajem. W stronę Hollyhock Lane i jej dalszego końca, gdzie miasteczko rzedniało w pola, a Nick trzymał swój warsztat. Każda ślepa węglowa twarz zwróciła się w tamtą stronę i pochyliła. Cierpliwie i z nadzieją. Niczym wędrowcy przyciągani do paleniska, które czują, ale jeszcze go nie widzą. Wiedziałam, czyje to przyciąganie. Wcale mnie to nie przeraziło.</w:t>
       </w:r>
     </w:p>
     <w:p>
@@ -2611,17 +2611,17 @@
     </w:p>
     <w:p>
       <w:r>
-        <w:t xml:space="preserve">— Wszystkie. Zebrały się na skwerze, pochylone w tę stronę. Żadnych śladów. — Otrzepałam śnieg z butów o jego próg. — Miasto uznało, że to dzieci i odwilż. Piją kawę Kelly i świetnie się bawią, nie myśląc o tym. Nick. One chodziły.</w:t>
-      </w:r>
-    </w:p>
-    <w:p>
-      <w:r>
-        <w:t xml:space="preserve">— Wiem. — Powiedział to łagodnie, bez cienia zaskoczenia, z tą pobłażliwą czułością, jaką człowiek może darzyć dziecko, które zrobiło coś sprawiającego mnóstwo kłopotu, a jednocześnie niemożliwego do potępienia. — Czułem, jak to przeszło w nocy. Jak ciepły powiew pod drzwiami, którego być tam nie powinno. — Pociągnął mnie w stronę paleniska na środku pomieszczenia. — Chodź, stań przy nim. Poczujesz to samo, teraz kiedy już wiesz, czego szukać.</w:t>
-      </w:r>
-    </w:p>
-    <w:p>
-      <w:r>
-        <w:t xml:space="preserve">Stanęłam obok. Wielki kominek z okrągłych polnych kamieni rzucał miękki złoty blask na zimne, puste palenisko, a nad nim wisiała magia w postaci luźnych złotych nici, niżej niż pamiętałam i gęstsza. Była ciepła. Nie ciepłem pieca kaflowego, który gasł powoli w kącie pokoju. Ciepła od wewnątrz, jak kamień, który cały dzień leżał w słońcu. Jej ciepło wyciągało się ku mnie i dalej, w stronę drzwi. Pip podeszła prosto do rusztu i stanęła z uniesionym dziobem, śledząc złote nici tak, jak śledziłaby śledzia na talerzu.</w:t>
+        <w:t xml:space="preserve">— Wszystkie. Zebrały się na skwerze, pochylone w tę stronę. Żadnych śladów. — Otrzepałam śnieg z butów o jego próg. — Miasteczko uznało, że to dzieci i odwilż. Piją kawę Kelly i świetnie się bawią, nie myśląc o tym. Nick. One chodziły.</w:t>
+      </w:r>
+    </w:p>
+    <w:p>
+      <w:r>
+        <w:t xml:space="preserve">— Wiem. — Powiedział to łagodnie, bez cienia zaskoczenia, z tą pobłażliwą czułością, jaką człowiek może darzyć dziecko, które zrobiło coś sprawiającego mnóstwo kłopotu, a jednocześnie takiego, na które nie sposób się długo gniewać. — Czułem, jak to przeszło w nocy. Jak ciepły powiew pod drzwiami, którego być tam nie powinno. — Pociągnął mnie w stronę paleniska na środku pomieszczenia. — Chodź, stań przy nim. Poczujesz to samo, teraz kiedy już wiesz, czego szukać.</w:t>
+      </w:r>
+    </w:p>
+    <w:p>
+      <w:r>
+        <w:t xml:space="preserve">Stanęłam obok. Wielki kominek z okrągłych polnych kamieni rzucał miękki złoty blask na zimne, puste palenisko, a nad nim wisiała magia w postaci luźnych złotych nici, niżej niż pamiętałam i gęstsza. Była ciepła. Nie ciepłem kozy, przygaszonej po drugiej stronie pokoju. Ciepła od wewnątrz, jak kamień, który cały dzień leżał w słońcu. Jej ciepło wyciągało się ku mnie i dalej, w stronę drzwi. Pip podeszła prosto do rusztu i stanęła z uniesionym dziobem, śledząc złote nici tak, jak śledziłaby śledzia na talerzu.</w:t>
       </w:r>
     </w:p>
     <w:p>
@@ -2641,7 +2641,7 @@
     </w:p>
     <w:p>
       <w:r>
-        <w:t xml:space="preserve">— To jest dom, który dla niej buduję, żeby przestała pożyczać bałwany. — Zmęczony, szczery uśmiech. — Nie jest gotowy. Jeszcze lata pracy przed nami, zanim wszystko będzie gotowe. Ale to początek, a dopóki nie skończę, będzie dalej rozgrzewać świecę do złota i przestawiać dziecięce bałwany po ciemku, bo chce tu być, a własnych nóg nie ma. Bram jest wściekły. Uważa to za niegodne — żeby magia urządzała publiczne sztuczki tam, gdzie miasto może ją zobaczyć. Najchętniej zamknąłby ją w zagrodzie razem z reniferami, z takim samym zresztą skutkiem.</w:t>
+        <w:t xml:space="preserve">— To jest dom, który dla niej buduję, żeby przestała pożyczać bałwany. — Zmęczony, szczery uśmiech. — Nie jest gotowy. Jeszcze lata pracy przed nami, zanim wszystko będzie gotowe. Ale to początek, a dopóki nie skończę, będzie dalej złocić świece i przestawiać dziecięce bałwany po ciemku, bo chce tu być, a własnych nóg nie ma. Bram jest wściekły. Uważa to za niegodne — żeby magia urządzała publiczne sztuczki tam, gdzie miasteczko może ją zobaczyć. Najchętniej zamknąłby ją na wybiegu razem z reniferami, z takim samym zresztą skutkiem.</w:t>
       </w:r>
     </w:p>
     <w:p>
@@ -2663,12 +2663,12 @@
     <w:p/>
     <w:p>
       <w:r>
-        <w:t>Wróciłam na daleki koniec alei późnym popołudniem, w towarzystwie samej Pip, gdy tłum już się rozstąpił, ponieważ chciałam stanąć przed tym dziwnym stworzeniem bez świadków.</w:t>
-      </w:r>
-    </w:p>
-    <w:p>
-      <w:r>
-        <w:t>— Masz mi coś do powiedzenia — rzekłam do niego cicho, naiwnie jak stara baba rozmawiająca ze śniegiem. I dodałam to tak czy owak, bo żyłam z tą magią wystarczająco długo, by wiedzieć, że nic nie dzieje się bez przyczyny, nawet jeśli akurat brak jej rozumu, by wyłożyć to wprost. — Sprawiłeś, że cała reszta wzdycha w górę alei, a ty stanąłeś tutaj i wpatrujesz się we wlot zaułka. Dlaczego?</w:t>
+        <w:t>Wróciłam na daleki koniec alei późnym popołudniem, w towarzystwie samej Pip, gdy tłum już się rozszedł, ponieważ chciałam stanąć przed tym dziwnym stworzeniem bez świadków.</w:t>
+      </w:r>
+    </w:p>
+    <w:p>
+      <w:r>
+        <w:t>— Masz mi coś do powiedzenia — rzekłam do niego cicho, naiwnie jak stara baba rozmawiająca ze śniegiem. I dodałam to tak czy owak, bo żyłam z tą magią wystarczająco długo, by wiedzieć, że nic nie dzieje się bez przyczyny, nawet jeśli akurat brak jej rozumu, by wyłożyć to wprost. — Wszystkie pozostałe wzdychają w stronę Hollyhock Lane, a ty stanąłeś tutaj i wpatrujesz się we wlot zaułka. Dlaczego?</w:t>
       </w:r>
     </w:p>
     <w:p>
@@ -2703,7 +2703,7 @@
         <w:t>HOLLY JOLLY BAKERY</w:t>
       </w:r>
       <w:r>
-        <w:t xml:space="preserve"> nad wejściem. Tego samego ranka otworzyła drzwi dla klientów, a ich napływ niemal wycisnął jej łzy z oczu. Piece wróciły do formy równie zagadkowo, jak wcześniej zaczęły kaprysić. Od czasu zdarzenia z cegłą trzymała tylne drzwi zaryglowane na czas wypieków, bez względu na upał w kuchni, a każda kolejna partia wypieków wychodziła słodka i udana. Stała za naprawioną ladą, oprószona mąką i rozpromieniona jak lampka. Sprzedawała pierniczki kolejce stojącej aż na zewnątrz i głośno powtarzała wszystkim, że ani przez chwilę nie wątpiła w magię tego sezonu. To było kłamstwo. Piękne kłamstwo, na które wszyscy na ulicy jej pozwolili.</w:t>
+        <w:t xml:space="preserve"> nad wejściem. Tego samego ranka otworzyła drzwi dla klientów, a ich napływ niemal wycisnął jej łzy z oczu. Piece wróciły do formy równie zagadkowo, jak wcześniej zaczęły kaprysić. Od czasu zdarzenia z cegłą trzymała tylne drzwi zaryglowane na czas wypieków, bez względu na upał w kuchni, a każda kolejna partia wypieków wychodziła słodka i udana. Stała za naprawioną ladą, oprószona mąką i rozpromieniona jak lampka. Sprzedawała pierniczki kolejce stojącej aż na zewnątrz i głośno powtarzała wszystkim, że ani przez chwilę nie wątpiła w ten sezon. To było kłamstwo. Piękne kłamstwo, na które wszyscy na ulicy jej pozwolili.</w:t>
       </w:r>
     </w:p>
     <w:p>
@@ -2728,7 +2728,7 @@
     </w:p>
     <w:p>
       <w:r>
-        <w:t>— Alan Varney. Inspekcja sanitarna. Będę potrzebował pani kuchni na kilka minut i obawiam się, że nie może to czekać na dogodniejszą porę.</w:t>
+        <w:t>— Alan Varney. Inspekcja sanitarna hrabstwa. Będę potrzebował pani kuchni na kilka minut i obawiam się, że nie może to czekać na dogodniejszą porę.</w:t>
       </w:r>
     </w:p>
     <w:p>
@@ -2862,10 +2862,10 @@
         <w:rPr>
           <w:i/>
         </w:rPr>
-        <w:t>Zacytowała podpunkty.</w:t>
-      </w:r>
-      <w:r>
-        <w:t xml:space="preserve"> Nie wściekły sąsiad. Nie przesadnie wrażliwy klient. Nie nudzące się dziecko z puszką farby, które napisało na ścianie </w:t>
+        <w:t>Skarga cytowała podpunkty.</w:t>
+      </w:r>
+      <w:r>
+        <w:t xml:space="preserve"> Nie wściekły sąsiad. Nie przesadnie wrażliwy klient. Nie nudzące się dziecko z puszką farby, które napisałoby na ścianie </w:t>
       </w:r>
       <w:r>
         <w:rPr>
@@ -2874,7 +2874,7 @@
         <w:t xml:space="preserve">BRUDNE</w:t>
       </w:r>
       <w:r>
-        <w:t>, bo tylko tyle potrafiło napisać. To była ręka, która znała dokładne normy temperatury wody w zlewie i fachowe określenie na szczelinę pod drzwiami. Ręka, która odczytała starą, uczciwą kuchnię Grety z listy kontrolnej bez wchodzenia do środka i wiedziała dokładnie, gdzie stuletni budynek stawał się cienki jak papier. To nie była wiedza kogoś, kto tylko jadł chleb. To była wiedza kogoś, kto go wypiekał.</w:t>
+        <w:t>, bo tylko tyle potrafiłoby napisać. To była ręka, która znała dokładne normy temperatury wody w zlewie i fachowe określenie na szczelinę pod drzwiami. Ręka, która odczytała starą, uczciwą kuchnię Grety z listy kontrolnej bez wchodzenia do środka i wiedziała dokładnie, gdzie stuletni budynek stawał się cienki jak papier. To nie była wiedza kogoś, kto tylko jadł chleb. To była wiedza kogoś, kto go wypiekał.</w:t>
       </w:r>
     </w:p>
     <w:p>
@@ -2969,7 +2969,7 @@
     <w:p/>
     <w:p>
       <w:r>
-        <w:t xml:space="preserve">Nazwisko dotarło do mnie z boku i cichaczem. Od kogoś, kto nie chciał być usłyszany i wstydziłby się, gdyby wyszło to na jaw. Następnego ranka byłam u Frosty’ego i wsypywałam do torby mąkę, którą Hal trzymał dla ludzi z zepsutymi piecami, podczas gdy Pip stała przed puszkami z sardynkami w niemym suplikacyjnym geście. Zamierzałam znów upiec w kuchni kruche ciasteczka Grety do beczki. Dwie kobiety stojące przy stoisku z konserwami schyliły głowy nad ceną oleju. Jedna powiedziała nazwisko, którego nie znałam. Druga rzekła: „Cóż, w tym roku są tak daleko w tyle, a zdesperowani ludzie robią zdesperowane rzeczy”. Pierwsza odparła: „Nic nie mówię”. Odeszły w głąb alejki w stronę zup, schowawszy swą małą złośliwość z powrotem z oczu. Nie wiedząc, że ją upuściły. Nie wiedząc, że ja ją podniosłam.</w:t>
+        <w:t xml:space="preserve">Nazwisko dotarło do mnie z boku i cichaczem. Od kogoś, kto nie chciał być usłyszany i wstydziłby się, gdyby wyszło to na jaw. Następnego ranka byłam u Frosty’ego i wsypywałam do torby mąkę, którą Hal trzymał dla ludzi z zepsutymi piecami, podczas gdy Pip stała przed puszkami z sardynkami w niemym suplikacyjnym geście. Zamierzałam znów upiec w kuchni maślane ciasteczka Grety do beczki. Dwie kobiety stojące przy stoisku z konserwami schyliły głowy nad ceną oleju. Jedna powiedziała nazwisko, którego nie znałam. Druga rzekła: „Cóż, w tym roku mają takie zaległości, a zdesperowani ludzie robią zdesperowane rzeczy”. Pierwsza odparła: „Nic nie mówię”. Odeszły w głąb alejki w stronę zup, schowawszy swą małą złośliwość z powrotem z oczu. Nie wiedząc, że ją upuściły. Nie wiedząc, że ja ją podniosłam.</w:t>
       </w:r>
     </w:p>
     <w:p/>
@@ -2993,7 +2993,7 @@
     <w:p/>
     <w:p>
       <w:r>
-        <w:t xml:space="preserve">— Słyszałem. — Hal w życiu w niczym nie udawał. — Marc Doucette stracił robotę w fabryce we wrześniu. W tej od obróbki drewna na Miller’s Creek, od nóg do krzeseł i kołków. Cała zmiana wyleciała, żaden sekret i żaden wstyd. Ale miasto ma na myśli wybite okno, a w tym samym miesiącu rodzina ma zaległości w opłatach za ogrzewanie. Połączyło jedno z drugim, bo łatwiej przetrawić dwójkę niż prawdę. Nic na to nie poradzę. Im bardziej ich bronię, tym bardziej wyglądam, jakby mną kierował powód, dla którego potrzebują obrony.</w:t>
+        <w:t xml:space="preserve">— Słyszałem. — Hal w życiu w niczym nie udawał. — Marc Doucette stracił robotę w fabryce we wrześniu. W tej od obróbki drewna na Miller’s Creek, od nóg do krzeseł i kołków. Cała zmiana wyleciała, żaden sekret i żaden wstyd. Ale miasteczko ma w głowie wybite okno, a w tym samym miesiącu rodzina ma zaległości w opłatach za ogrzewanie. Połączyło jedno z drugim, bo łatwiej przetrawić dwójkę niż prawdę. Nic na to nie poradzę. Im bardziej ich bronię, tym bardziej wyglądam, jakbym znał powód, dla którego trzeba ich bronić.</w:t>
       </w:r>
     </w:p>
     <w:p/>
@@ -3005,7 +3005,7 @@
     <w:p/>
     <w:p>
       <w:r>
-        <w:t xml:space="preserve">— Cicho. — Powiedział to z lekkim ostrzeżeniem, ostrzeżeniem ostrożnego człowieka strzegącego ostrożnej życzliwości. — Cały sens tej beczki polega na tym, że nikt nie musi stawać w świetle i prosić. Ale paczka trafia w tamten koniec miasta raz w tygodniu i niczyim interesem nie jest, na czyim progu ląduje. — Spojrzał na mnie i cała nieśmiałość z niego uleciała. — Ty potrafisz wejść do domów, które pozostają zamknięte przed resztą z nas. Jeśli chcesz się na własne oczy przekonać, jakiej rodzinie ulica postanowiła w tym tygodniu bać się, to tam stoi pudło, które trzeba zanieść, a ja nie mogę. Mnie znają.</w:t>
+        <w:t xml:space="preserve">— Po cichu. — Powiedział to z lekkim ostrzeżeniem, ostrzeżeniem ostrożnego człowieka strzegącego ostrożnej życzliwości. — Cały sens tej beczki polega na tym, że nikt nie musi stawać w świetle i prosić. Ale paczka trafia w tamten koniec miasteczka raz w tygodniu i nikogo nie powinno obchodzić, na czyim progu ląduje. — Spojrzał na mnie i cała nieśmiałość z niego uleciała. — Ty potrafisz wejść do domów, które pozostają zamknięte przed resztą z nas. Jeśli chcesz się na własne oczy przekonać, jakiej rodzinie ulica postanowiła w tym tygodniu bać się, to tam stoi pudło, które trzeba zanieść, a ja nie mogę. Mnie znają.</w:t>
       </w:r>
     </w:p>
     <w:p/>
@@ -3047,7 +3047,7 @@
     <w:p/>
     <w:p>
       <w:r>
-        <w:t>— Jestem pani Claus — powiedziałam. — Hal przysłał mnie z mąką, którą mu jestem dłużna, a nie pozwolił mi wyjść bez reszty, do tego jest ciężka, a ja jestem stara, więc zrobiłabyś mi przysługę, zabierając mi ją z rąk, zanim upuszczę waszą herbatę w śnieg.</w:t>
+        <w:t>— Jestem pani Claus — powiedziałam. — Hal przysłał mnie z mąką, którą mu jestem dłużna, a nie pozwolił mi wyjść bez reszty, do tego to ciężkie, a ja jestem stara, więc zrobiłabyś mi przysługę, zabierając mi to z rąk, zanim upuszczę waszą herbatę w śnieg.</w:t>
       </w:r>
     </w:p>
     <w:p/>
@@ -3059,7 +3059,7 @@
     <w:p/>
     <w:p>
       <w:r>
-        <w:t>Anne Doucette była młodsza, niż się spodziewałam. I bardziej zmęczona, niż jakakolwiek kobieta w jej wieku powinna być. Jej dom lśnił czystością. W pokoju nie było wiele. Każdy kątek błyszczał. Na kominku stała już szopka, chociaż listopad ledwo się zaczął. Małe, wycięte figurki wygładzone od dotyku, z pasterzami pozbawionymi farby. Wystawiona zawczasu.</w:t>
+        <w:t>Anne Doucette była młodsza, niż się spodziewałam. I bardziej zmęczona, niż jakakolwiek kobieta w jej wieku powinna być. Jej dom lśnił czystością. W pokoju nie było wiele. Każdy kątek błyszczał. Na kominku stała już szopka, chociaż listopad ledwo się zaczął. Małe, rzeźbione figurki wygładzone od dotyku, z pasterzami pozbawionymi farby. Wystawiona zawczasu.</w:t>
       </w:r>
     </w:p>
     <w:p/>
@@ -3071,7 +3071,7 @@
     <w:p/>
     <w:p>
       <w:r>
-        <w:t>— Marc szuka pracy — powiedziała, gdy herbata została rozlana, a dziewczynka zabrała swój kubek do drugiego pokoju z książką, rzucając jedno tęskne spojrzenie w stronę Pip, która ułożyła się przy piecu z miną stworzenia, które uznało, że dom nada się w sam raz. — Szuka niemal codziennie. Chodzą słuchy, że po świętach będzie potrzebna ekipa w Bridgton. Ale to po świętach. Kłopot jest z teraźniejszością. — Oplotła dłonie wokół kubka. Nie piła. Rozgrzewała je. — Nie zamierzam płakać z tego powodu przed panią. Ludzie tracą pracę. Nie jesteśmy pierwsi. Nie będziemy ostatni. Mamy zdrowie, dzieci i dach, który w większym stopniu trzyma się kupy. Chodzi tylko o czas. Żeby mieć braki w grudniu, kiedy maluchy liczą dni, a całe miasto świeci jak obietnica. — Powstrzymała się, zacisnęła podbródek i tchnęła w to dokładnie tę żelazną siłę Grety, dumę porządnej kobiety, która trzyma się prosto, by nie wzbudzać litości. — Ale dajemy radę.</w:t>
+        <w:t>— Marc szuka pracy — powiedziała, gdy herbata została rozlana, a dziewczynka zabrała swój kubek do drugiego pokoju z książką, rzucając jedno tęskne spojrzenie w stronę Pip, która ułożyła się przy piecu z miną stworzenia, które uznało, że dom nada się w sam raz. — Szuka niemal codziennie. Chodzą słuchy, że po świętach będzie potrzebna ekipa w Bridgton. Ale to po świętach. Kłopot jest z teraźniejszością. — Oplotła dłonie wokół kubka. Nie piła. Rozgrzewała je. — Nie zamierzam płakać z tego powodu przed panią. Ludzie tracą pracę. Nie jesteśmy pierwsi. Nie będziemy ostatni. Mamy zdrowie, dzieci i dach, który jako tako się trzyma. Chodzi tylko o czas. Żeby mieć braki w grudniu, kiedy maluchy liczą dni, a całe miasteczko świeci jak obietnica. — Powstrzymała się, zacisnęła podbródek i tchnęła w to dokładnie tę żelazną siłę Grety, dumę porządnej kobiety, która trzyma się prosto, by nie wzbudzać litości. — Ale dajemy radę.</w:t>
       </w:r>
     </w:p>
     <w:p/>
@@ -3143,7 +3143,7 @@
     <w:p/>
     <w:p>
       <w:r>
-        <w:t xml:space="preserve">Jakiś mężczyzna, którego znałam przelotnie, stał przy beczce z chłopcem. Wyciągnął dwie puszki zupy ze swoich zakupów i wrzucił je bez słowa, nie oglądając się za siebie, by sprawdzić, czy ktoś patrzy. Hal skonstruował beczkę tak, by dawanie nie kosztowało człowieka nic prócz tych puszek. Nikt nie musiał być podglądany przy tym czynie. A Hal stał za swoją kasą ze swoim rejestrem, ponieważ oczywiście Hal prowadził rejestr, starannie winietowany. Wyniki na stronie nie były imionami, lecz jedynie liczbami. </w:t>
+        <w:t xml:space="preserve">Jakiś mężczyzna, którego znałam przelotnie, stał przy beczce z chłopcem. Wyciągnął dwie puszki zupy ze swoich zakupów i wrzucił je bez słowa, nie oglądając się za siebie, by sprawdzić, czy ktoś patrzy. Hal skonstruował beczkę tak, by dawanie nie kosztowało człowieka nic prócz tych puszek. Nikt nie musiał być podglądany przy tym czynie. A Hal stał za swoją kasą ze swoim rejestrem, ponieważ oczywiście Hal prowadził rejestr, starannie poliniowany. Wyniki na stronie nie były imionami, lecz jedynie liczbami. </w:t>
       </w:r>
       <w:r>
         <w:rPr>
@@ -3152,7 +3152,7 @@
         <w:t>Tyle puszek. Tyle worków. Tyle ciepłych rzeczy.</w:t>
       </w:r>
       <w:r>
-        <w:t xml:space="preserve"> Nie zapisałby żadnej rodziny choćby po to, żeby jej pomóc, a jedynie to, że tutejsi ludzie w tym zimnym, surowym miesiącu wrzucili więcej, niż zdołali zabrać.</w:t>
+        <w:t xml:space="preserve"> Nie zapisałby żadnej rodziny choćby po to, żeby jej pomóc, a jedynie to, że tutejsi ludzie w tym zimnym, surowym miesiącu wrzucili więcej, niż wzięli.</w:t>
       </w:r>
     </w:p>
     <w:p/>
@@ -3164,13 +3164,13 @@
     <w:p/>
     <w:p>
       <w:r>
-        <w:t>— Nigdy w to nie wątpiłem. — Hal skreślił linię pod dziennym bilansem, precyzyjnie. — Nie znalazłaś tam na górze żadnego sabotażysty.</w:t>
-      </w:r>
-    </w:p>
-    <w:p/>
-    <w:p>
-      <w:r>
-        <w:t>— Znalazłam czystą podłogę. I kobietę, która zaparzyła mi herbatę, której nie mogła oszczędzić. — Patrzałam, jak mężczyzna ze swoim chłopcem wychodzą, a puszki z zupą zniknęły w beczce za ich plecami. — Ktokolwiek robi to Grecie, nie robi tego dlatego, że zmarzł. Robi to dlatego, że chciał pustego sklepu dla niej i pełnego dla siebie. To nie jest głodna dłoń. Głód by zagarnął. Ten celuje.</w:t>
+        <w:t>— Nigdy w to nie wątpiłem. — Hal pociągnął kreskę pod dziennym bilansem, precyzyjnie. — Nie znalazłaś tam na górze żadnego sabotażysty.</w:t>
+      </w:r>
+    </w:p>
+    <w:p/>
+    <w:p>
+      <w:r>
+        <w:t>— Znalazłam czystą podłogę. I kobietę, która zaparzyła mi herbatę, której nie mogła oszczędzić. — Patrzałam, jak mężczyzna ze swoim chłopcem wychodzą, a puszki z zupą zniknęły w beczce za ich plecami. — Ktokolwiek robi to Grecie, nie robi tego dlatego, że marznie. Robi to, bo chce, żeby jej sklep opustoszał, a własny się zapełnił. To nie jest głodna dłoń. Głód by zagarnął. Ta dłoń celuje.</w:t>
       </w:r>
     </w:p>
     <w:p/>
@@ -3194,7 +3194,7 @@
     <w:p/>
     <w:p>
       <w:r>
-        <w:t>— Otóż to. — Nie pozwoliłam sobie przejść ostatniego kroku tej drogi tam, w ciepłym zapachu sklepu Frosty’ego z napełniającą się przy drzwiach beczką, ponieważ już wcześniej wymieniłam zbyt szybko imiona i zapłaciłam za to w miastach, z których nie mogłam uciec. Ale pole wokół mnie skurczyło się, gdy tak stałam. Nie chłopak z puszką. Nie rzeźnik, który krzyczy ci w twarz. Nie ojciec liczący swoje ostatnie szczapy. Ktoś z fachem w ręku, dostawcą w rejestrach i powodem, by pragnąć, żeby najstarsza piekarnia w alei pociemniała przed świętami.</w:t>
+        <w:t>— Otóż to. — Nie pozwoliłam sobie przejść ostatniego kroku tej drogi tam, w ciepłym zapachu sklepu Frosty’ego z napełniającą się przy drzwiach beczką, ponieważ już wcześniej wymieniłam zbyt szybko imiona i zapłaciłam za to w miastach, z których nie mogłam uciec. Ale pole wokół mnie skurczyło się, gdy tak stałam. Nie chłopak z puszką. Nie rzeźnik, który krzyczy ci w twarz. Nie ojciec liczący swoje ostatnie szczapy. Ktoś z fachem w ręku, dostawcą w rejestrach i powodem, by pragnąć, żeby w najstarszej piekarni przy alei zgasły światła przed świętami.</w:t>
       </w:r>
     </w:p>
     <w:p/>
@@ -3232,7 +3232,7 @@
     </w:p>
     <w:p>
       <w:r>
-        <w:t xml:space="preserve">Doktor Mitchell był miejscowym specjalistą od zwierząt, co w miejscu tej wielkości czyniło go zarazem miejskim chemikiem. Wiejski weterynarz spędza życie na odróżnianiu czystej paszy od takiej, w którą wdała się pleśń. Przy tylnej ścianie trzymał niski stół roboczy z wagą, palnikiem i półką pełną brązowych butelek, dokąd rolnik przynosił swoje obawy dotyczące ziarna, by szukać odpowiedzi. Weszłam tam ze słoikiem mąki zamiast chorego zwierzęcia i pingwinem, który poszedł prosto do jego pieca. Doktor nawet nie mrugnął. Podawano mu przez tę ladę dziwniejsze rzeczy.</w:t>
+        <w:t xml:space="preserve">Doktor Mitchell był miejscowym specjalistą od zwierząt, co w miejscu tej wielkości czyniło go zarazem miejscowym chemikiem. Wiejski weterynarz spędza życie na odróżnianiu czystej paszy od takiej, w którą wdała się pleśń. Przy tylnej ścianie trzymał niski stół roboczy z wagą, palnikiem i półką pełną brązowych butelek, dokąd rolnik przynosił swoje obawy dotyczące ziarna, by szukać odpowiedzi. Weszłam tam ze słoikiem mąki zamiast chorego zwierzęcia i z Pip, która poszła prosto do jego pieca. Doktor nawet nie mrugnął. Podawano mu przez tę ladę dziwniejsze rzeczy.</w:t>
       </w:r>
     </w:p>
     <w:p>
@@ -3302,7 +3302,7 @@
     </w:p>
     <w:p>
       <w:r>
-        <w:t>— Nie potrafię wejść komuś do głowy, Jessica. Mogę ci powiedzieć, że pojemnik dobrej mąki nie nabiera piekarniczej kwaśnej bazy z dnia na dzień w dawce dziesięciokrotnie większej przez jakikolwiek przypadek, jaki Bóg lub pogoda kiedykolwiek stworzyły. — Zamknął słoik wieczkiem i delikatnie przesunął go z powrotem ku mnie po stole. — Ktoś to tam włożył. I dokładnie wiedział, ile wsypać.</w:t>
+        <w:t>— Nie potrafię wejść komuś do głowy, Jessico. Mogę ci powiedzieć, że pojemnik dobrej mąki nie nabiera piekarniczej kwaśnej bazy z dnia na dzień w dawce dziesięciokrotnie większej przez jakikolwiek przypadek, jaki Bóg lub pogoda kiedykolwiek stworzyły. — Zamknął słoik wieczkiem i delikatnie przesunął go z powrotem ku mnie po stole. — Ktoś to tam włożył. I dokładnie wiedział, ile wsypać.</w:t>
       </w:r>
     </w:p>
     <w:p>
@@ -3327,7 +3327,7 @@
     </w:p>
     <w:p>
       <w:r>
-        <w:t>Nie przypisałam temu żadnej twarzy, chociaż miasto by to zrobiło. Ale grunt pod pytaniem przesunął się, gdy stałam na schodkach doktora. To, co stało się z wypiekami Grety, zostało wyjaśnione w słoiku w moim płaszczu. Zostało tylko pytanie, kto na tej alei mógł dosięgnąć tej mąki i znał dokładną dawkę, żeby ją zepsuć.</w:t>
+        <w:t>Nie przypisałam temu żadnej twarzy, chociaż miasteczko by to zrobiło. Ale grunt pod pytaniem przesunął się, gdy stałam na schodkach doktora. To, co stało się z wypiekami Grety, zostało wyjaśnione w słoiku w moim płaszczu. Zostało tylko pytanie, kto na tej alei mógł dosięgnąć tej mąki i znał dokładną dawkę, żeby ją zepsuć.</w:t>
       </w:r>
     </w:p>
     <w:p>
@@ -3337,7 +3337,7 @@
     </w:p>
     <w:p>
       <w:r>
-        <w:t>A potem to coś wolnego w mieście położyło mi rękę na ramieniu.</w:t>
+        <w:t>A potem to coś wolnego w miasteczku położyło mi rękę na ramieniu.</w:t>
       </w:r>
     </w:p>
     <w:p>
@@ -3352,7 +3352,7 @@
     </w:p>
     <w:p>
       <w:r>
-        <w:t xml:space="preserve">Stałam i patrzyłam tam, gdzie on patrzył — na ciemne tyły sklepów, zasypane schody i zamknięte drzwi. Magia nie potrafiła podać mi imienia. Nigdy nie potrafiła. Mój Nick mówił, że ma więcej serca niż sprytu i że nie potrafi pisać. Stał przez dwa dni, patrząc na tę alejkę, a teraz pochylał się ku tyłom sklepów i nie mogłam pojąć dlaczego.</w:t>
+        <w:t xml:space="preserve">Stałam i patrzyłam tam, gdzie on patrzył — na ciemne tyły sklepów, zasypane schody i zamknięte drzwi. Magia nie potrafiła podać mi imienia. Nigdy nie potrafiła. Mój Nick mówił, że ma więcej serca niż sprytu i że nie potrafi pisać. Bałwan stał przez dwa dni, patrząc na tę alejkę, a teraz pochylał się ku tyłom sklepów i nie mogłam pojąć dlaczego.</w:t>
       </w:r>
     </w:p>
     <w:p>
@@ -3402,7 +3402,7 @@
     </w:p>
     <w:p>
       <w:r>
-        <w:t xml:space="preserve">Tyle to wymagało. Obróciłam filiżankę w dłoni i nie podobało mi się, jakie to było proste. Greta zrywała się na nogi o czwartej, cała w mące, z obiema dłońmi zanurzonymi w rosnącym cieście lub na gorącej blasze, piec huczał, a na zapleczu dusiło od gorąca. Otwierała te drzwi na oścież ku alejce dla świeżego powietrza i jako litościwego chłodnego powiewu dla piekarza, który tkwił przy piecach od ciemnej nocy. To była po prostu rutynowa praca w działającej piekarni. Ale przed wrzuceniem cegły oznaczało to, że przez dwie godziny każdego ciemnego poranka drzwi na tę alejkę stały otworem. Kobieta po ich drugiej stronie, z rękami pełnymi ciasta, odwrócona plecami do chłodu. A między nimi pojemnik mąki, którego nikt absolutnie nie pilnował.</w:t>
+        <w:t xml:space="preserve">Tyle to wymagało. Obróciłam filiżankę w dłoni i nie podobało mi się, jakie to było proste. Greta zrywała się na nogi o czwartej, cała w mące, z obiema dłońmi zanurzonymi w rosnącym cieście lub na gorącej blasze, piec huczał, a na zapleczu dusiło od gorąca. Otwierała te drzwi na oścież ku alejce dla świeżego powietrza i jako litościwego chłodnego powiewu dla piekarki, która tkwiła przy piecach od ciemnej nocy. To była po prostu rutynowa praca w działającej piekarni. Ale przed wrzuceniem cegły oznaczało to, że przez dwie godziny każdego ciemnego poranka drzwi na tę alejkę stały otworem. Kobieta po ich drugiej stronie, z rękami pełnymi ciasta, odwrócona plecami do chłodu. A między nimi pojemnik mąki, którego nikt absolutnie nie pilnował.</w:t>
       </w:r>
     </w:p>
     <w:p>
@@ -3427,7 +3427,7 @@
     </w:p>
     <w:p>
       <w:r>
-        <w:t xml:space="preserve">Alejka za sklepami przy Evergreen ciągnęła się przez całą długość bloku, będąc odśnieżonym pasem pomiędzy zapleczami sklepów a niskim murem posesji z tyłu. Szeroka w sam raz na jedną furgonetkę i ani trochę więcej. Szłam nią powoli w płaskim porannym świetle, Pip dreptała mi przy pięcie, cicha i ostrożna, a ja czytałam z tyłów sklepów tak uważnie, jak nigdy dotąd. Jak z drzwi, a nie ze ścian. Oto były stalowe drzwi apteki, stale zamknięte, z dzwonkiem. I te dwa, które dzieliły rampę. Skład chłodniczy Pete'a, stare pomieszczenie z pustaków z ciężkim skoblem, oraz druga kłódka, którą kupił u Toma, świeża i błyszcząca na bramie. I trzy drzwi dalej — drzwi Grety, niskie i drewniane, wytarte do jasności wokół klamki przez czterdzieści lat dotykania zaprószoną mąką dłonią.</w:t>
+        <w:t xml:space="preserve">Alejka za sklepami przy Evergreen ciągnęła się przez całą długość bloku, będąc odśnieżonym pasem pomiędzy zapleczami sklepów a niskim murem posesji z tyłu. Szeroka w sam raz na jedną furgonetkę i ani trochę więcej. Szłam nią powoli w płaskim porannym świetle, Pip dreptała mi przy pięcie, cicha i ostrożna, a ja czytałam z tyłów sklepów tak uważnie, jak nigdy dotąd. Jak z drzwi, a nie ze ścian. Oto były stalowe drzwi apteki, stale zamknięte, z dzwonkiem. I te dwoje drzwi, które dzieliły rampę. Skład chłodniczy Pete'a, stare pomieszczenie z pustaków z ciężkim skoblem, oraz druga kłódka, którą kupił u Toma, świeża i błyszcząca na bramie. I trzy drzwi dalej — drzwi Grety, niskie i drewniane, wytarte do jasności wokół klamki przez czterdzieści lat dotykania zaprószoną mąką dłonią.</w:t>
       </w:r>
     </w:p>
     <w:p>
@@ -3452,7 +3452,7 @@
     </w:p>
     <w:p>
       <w:r>
-        <w:t>Próbowałam tego uniknąć.</w:t>
+        <w:t>Starałam się tam nie patrzeć.</w:t>
       </w:r>
     </w:p>
     <w:p>
@@ -3467,7 +3467,7 @@
     </w:p>
     <w:p>
       <w:r>
-        <w:t>Pete Garcia miał rampę i dwadzieścia zim rozładunku za sobą w miejscu, gdzie nikt w całym Frost Falls nie spojrzałby dwa razy na jego furgonetkę. Posiadał klucz do wspólnej bramy, teraz nawet dwa, świeżo dorobione z warsztatu Toma. Nosił w sobie głośną, obnoszoną na pokaz urazę właśnie o tę rampę. I, jak sam twierdził, był jedynym człowiekiem, który dostrzegł jakąś postać przy tylnych drzwiach Grety w ciemnościach.</w:t>
+        <w:t>Pete Garcia miał rampę i dwadzieścia zim rozładunku za sobą w miejscu, gdzie nikt w całym Frost Falls nie spojrzałby dwa razy na jego furgonetkę. Posiadał klucz do wspólnej bramy, teraz nawet dwa, nowiutkie, prosto z półki u Toma. Nosił w sobie głośną, obnoszoną na pokaz urazę właśnie o tę rampę. I, jak sam twierdził, był jedynym człowiekiem, który dostrzegł jakąś postać przy tylnych drzwiach Grety w ciemnościach.</w:t>
       </w:r>
     </w:p>
     <w:p>
@@ -3512,7 +3512,7 @@
     </w:p>
     <w:p>
       <w:r>
-        <w:t>Na samym początku alejki Pip spojrzała wstecz w dół zdeptanego białego korytarza w stronę dwojga wspólnych drzwi — tych zużytych drewnianych i tych z nową, lśniącą kłódką — po czym spojrzała w górę na mnie. Nie powiedziała mi, że wszystko w porządku. Nie było, a ona była uczciwym zwierzakiem.</w:t>
+        <w:t>Na samym początku alejki Pip spojrzała wstecz w dół zdeptanego białego korytarza w stronę dwojga wspólnych drzwi — tych zużytych drewnianych i tych z nową, lśniącą kłódką — po czym spojrzała w górę na mnie. Nie powiedziała mi, że wszystko w porządku. Nie było, a ona była uczciwym ptakiem.</w:t>
       </w:r>
     </w:p>
     <w:p>
@@ -3625,7 +3625,7 @@
     <w:p/>
     <w:p>
       <w:r>
-        <w:t xml:space="preserve">— Nie będę panu przerywać pracy — rzekłam. — Przyszłam panu powiedzieć, że brałam pana pod uwagę. Z powodu kłopotów Grety. Z tego prostego faktu, że o świcie jest pan na tym podwórku i nikt inny nie ma prawa tam przebywać. — Przekonałam się, że najlepiej jest wyłożyć człowiekowi całą tę brzydką sprawę od razu i pozwolić mu się jej przyjrzeć. — Oraz przyszłam panu powiedzieć, że skreśliłam pana z tej listy. Cokolwiek za tym stoi, wymagało usposobienia do działania po ciemku i piekarskiego fachu do proszku, a pan nie ma ani jednego, ani drugiego. Kłóci się pan w samo południe i rąbie mięso. To do pana nie pasuje.</w:t>
+        <w:t xml:space="preserve">— Nie będę panu przerywać pracy — rzekłam. — Przyszłam panu powiedzieć, że miałam pana na liście podejrzanych. Z powodu kłopotów Grety. Z tego prostego faktu, że przed świtem jest pan na tym podwórku i nikt inny nie ma prawa tam przebywać. — Przekonałam się, że najlepiej jest wyłożyć człowiekowi całą tę brzydką sprawę od razu i pozwolić mu się jej przyjrzeć. — Oraz przyszłam panu powiedzieć, że skreśliłam pana z tej listy. Cokolwiek za tym stoi, wymagało usposobienia do działania po ciemku i piekarskiego fachu do proszku, a pan nie ma ani jednego, ani drugiego. Kłóci się pan w samo południe i rąbie mięso. To do pana nie pasuje.</w:t>
       </w:r>
     </w:p>
     <w:p/>
@@ -3667,7 +3667,7 @@
     <w:p/>
     <w:p>
       <w:r>
-        <w:t xml:space="preserve">— Ta sylwetka, o której pani mówiłem — zaczął, pakując kotlet, o który nie prosiłam. — Przy jej tylnych drzwiach w ciemności. Pewnie będzie pani chciała wiedzieć o tym wszystko, skoro mi pani uwierzyła. — Oparł swoje wielkie dłonie płasko na pniaku i spojrzał przez okno na sklepiki Evergreen rozciągające się po drugiej stronie skweru, jakby mógł wzrokiem przebić ich mury i dostrzec podwórko. — Dorosły człowiek. Żaden gówniarz, bez względu na to, co miasto chciałoby przypisać jakiemuś chłopakowi z puszką farby. Wyższy od Grety i poruszający się z wyraźnym celem. Żadnego ociągania się. Żadnego ogrzewania rąk. Wiedział, po co tam przyszedł. I okryty. Długi płaszcz albo fartuch, luźny, taki, w jakim pracuje się, żeby się nie pobrudzić, blady wręcz, powiedziałbym, choć ciemność odjęła mu barwę. Trzymał się blisko jej ściany, tam, gdzie idą dostawy, a żaden uczciwy interes nie prowadzi. A kiedy moje reflektory padły na to miejsce, zniknął — szybko i cicho, nie uciekał w popłochu, po prostu sobie poszedł. Bez pośpiechu. Zrobione i po wszystkim. — Pokręcił siwą głową. — Bez twarzy. Nigdy nie było tam twarzy. Tylko robocza sylwetka, uważająca, by jej nie widziano, która znała godziny Grety lepiej, niż powinien to robić obcy. — Związał sznurkiem papier. — Tamta furgonetka, znowu pewnego ranka. Zaparkowana przy aptece, silnik tykał. Wysoka w dachu, wyższa niż potrzeba furgonetce, z paskiem czerwonej taśmy odblaskowej na tylnych drzwiach. Rozświetlona jak choinka, kiedy trafiły ją moje reflektory.</w:t>
+        <w:t xml:space="preserve">— Ta sylwetka, o której pani mówiłem — zaczął, pakując kotlet, o który nie prosiłam. — Przy jej tylnych drzwiach w ciemności. Pewnie będzie pani chciała wiedzieć o tym wszystko, skoro mi pani uwierzyła. — Oparł swoje wielkie dłonie płasko na pniaku i spojrzał przez okno na sklepiki Evergreen rozciągające się po drugiej stronie skweru, jakby mógł wzrokiem przebić ich mury i dostrzec podwórko. — Dorosły człowiek. Żaden gówniarz, bez względu na to, co miasteczko chciałoby przypisać jakiemuś chłopakowi z puszką farby. Wyższy od Grety i poruszający się z wyraźnym celem. Żadnego ociągania się. Żadnego ogrzewania rąk. Wiedział, po co tam przyszedł. I okryty. Długi płaszcz albo fartuch, luźny, taki, w jakim pracuje się, żeby się nie pobrudzić, blady wręcz, powiedziałbym, choć ciemność odjęła mu barwę. Trzymał się blisko jej ściany, tam, gdzie idą dostawy, a żaden uczciwy interes nie prowadzi. A kiedy moje reflektory padły na to miejsce, zniknął — szybko i cicho, nie uciekał w popłochu, po prostu sobie poszedł. Bez pośpiechu. Zrobione i po wszystkim. — Pokręcił siwą głową. — Bez twarzy. Nigdy nie było tam twarzy. Tylko robocza sylwetka, uważająca, by jej nie widziano, która znała godziny Grety lepiej, niż powinien to robić obcy. — Związał sznurkiem papier. — Tamta furgonetka, znowu pewnego ranka. Zaparkowana przy aptece, silnik tykał. Wysoka w dachu, wyższa niż potrzeba furgonetce, z paskiem czerwonej taśmy odblaskowej na tylnych drzwiach. Rozświetlona jak choinka, kiedy trafiły ją moje reflektory.</w:t>
       </w:r>
     </w:p>
     <w:p/>
@@ -3738,12 +3738,12 @@
     <w:p/>
     <w:p>
       <w:r>
-        <w:t>Miasteczko znalazło winnego szybciej ode mnie i padł on na chłopaka.</w:t>
-      </w:r>
-    </w:p>
-    <w:p>
-      <w:r>
-        <w:t xml:space="preserve">Dowiedziałam się o tym od Claire, która tego ranka szła pod górę do mojego domu niedługo po tym, jak wróciłam, niosąc swój notatnik — jak na złość zamknięty — i zaciśnięte usta. Usłyszała o tym w aptece. Ludzie stojący tam w kolejce dowiedzieli się od dzieciaków ze skweru, a dzieciaki od samej nocnej ekipy, która miała po czternaście lat i nie potrafiła utrzymać sekretu przez noc. Po miasteczku krążyło nazwisko sprawcy, który napisał coś na ścianie Grety. Tym chłopakiem był Danny Ott.</w:t>
+        <w:t>Miasteczko znalazło winnego szybciej ode mnie — i był nim chłopak.</w:t>
+      </w:r>
+    </w:p>
+    <w:p>
+      <w:r>
+        <w:t xml:space="preserve">Dowiedziałam się o tym od Claire, która tego ranka szła pod górę do mojego domu niedługo po tym, jak wróciłam, niosąc swój notatnik — wyjątkowo zamknięty — i z zaciśniętymi ustami. Usłyszała o tym w aptece. Ludzie stojący tam w kolejce dowiedzieli się od dzieciaków ze skweru, a dzieciaki od samej nocnej ekipy, która miała po czternaście lat i nie potrafiła utrzymać sekretu przez noc. Po miasteczku krążyło nazwisko tego, kto rzekomo pomalował ścianę Grety. Brzmiało ono: Danny Ott.</w:t>
       </w:r>
     </w:p>
     <w:p>
@@ -3768,7 +3768,7 @@
     </w:p>
     <w:p>
       <w:r>
-        <w:t xml:space="preserve">— Danny. — Wytarła ręce w fartuch. — Mówią, że to był Danny. Usłyszałam o tym wczoraj i od tamtej pory nie spałam ani minuty. — Wyszła zza lady. — Jessica, zwolniłam tego chłopaka z najprostszego powodu na świecie i wcale nie była to jego wina. Obroty tej jesieni były słabe i nie mogłam utrzymać weekendowego chłopaka na etacie. Posadziłam go i powiedziałam wszystko prosto w oczy, dając mu odprawę za dwa tygodnie pracy, której jeszcze nie wykonał, oraz pudełko wczorajszych wypieków dla jego matki. Wziął to cicho, wstydząc się łez w oczach, i wybiegł za drzwi, zanim zdążyłam powiedzieć połowę tego, co chciałam. — Jej głos stał się ciężki. — Dobry pracownik. Powoli się rozkręcał, ale jak już zaczął, był niezawodny. A teraz mówią, że namalował słowo BRUDNE na mojej ścianie i nijak mi to nie pasuje do chłopaka, który kiedyś równo układał moje poranne pudełka, bo nie znosił, gdy stały krzywo.</w:t>
+        <w:t xml:space="preserve">— Danny. — Wytarła ręce w fartuch. — Mówią, że to był Danny. Usłyszałam o tym wczoraj i od tamtej pory nie spałam ani minuty. — Wyszła zza lady. — Jessico, zwolniłam tego chłopaka z najprostszego powodu na świecie i wcale nie była to jego wina. Obroty tej jesieni były słabe i nie mogłam utrzymać weekendowego chłopaka na etacie. Posadziłam go i powiedziałam wszystko prosto w oczy, dając mu odprawę za dwa tygodnie pracy, której jeszcze nie wykonał, oraz pudełko wczorajszych wypieków dla jego matki. Wziął to cicho, wstydząc się łez w oczach, i wybiegł za drzwi, zanim zdążyłam powiedzieć połowę tego, co chciałam. — Jej głos stał się ciężki. — Dobry pracownik. Powoli się rozkręcał, ale jak już zaczął, był niezawodny. A teraz mówią, że namalował słowo BRUDNE na mojej ścianie i nijak mi to nie pasuje do chłopaka, który kiedyś równo układał moje poranne pudełka, bo nie znosił, gdy stały krzywo.</w:t>
       </w:r>
     </w:p>
     <w:p>
@@ -3828,7 +3828,7 @@
     </w:p>
     <w:p>
       <w:r>
-        <w:t xml:space="preserve">— Niech jej pani zapyta. — Spojrzał na swoje dłonie. — Niech pani zapyta państwa Petersenów dwa domy dalej. Zajmowali się moimi siostrami przez tę godzinę, kiedy pobiegłem do apteki przed zamknięciem. Nie mogę być w dwóch miejscach naraz. Próbuję to ludziom wbić do głowy, a oni już podjęli decyzję. — Gorycz odezwała się w nim surowo i młodzieńczo. — Bo Greta mnie zwolniła. Jakbym mógł coś takiego namalować na jej ścianie, ze wszystkich sklepów. Była dla mnie dobra. To jedyna osoba w tej okolicy, która zawsze płaciła mi co do grosza i nigdy nic nie urwała.</w:t>
+        <w:t xml:space="preserve">— Niech ją pani zapyta. — Spojrzał na swoje dłonie. — Niech pani zapyta państwa Petersenów dwa domy dalej. Zajmowali się moimi siostrami przez tę godzinę, kiedy pobiegłem do apteki przed zamknięciem. Nie mogę być w dwóch miejscach naraz. Próbuję to ludziom wbić do głowy, a oni już podjęli decyzję. — Gorycz odezwała się w nim surowo i młodzieńczo. — Bo Greta mnie zwolniła. Jakbym mógł coś takiego namalować na jej ścianie, ze wszystkich sklepów. Była dla mnie dobra. To jedyna osoba w tej okolicy, która zawsze płaciła mi co do grosza i nigdy nic nie urwała.</w:t>
       </w:r>
     </w:p>
     <w:p>
@@ -3838,7 +3838,7 @@
     </w:p>
     <w:p>
       <w:r>
-        <w:t>Ta ściana była tylko echem. Plotki o Holly Jolly Bakery rozniosły się po całej alei i ktoś młody sięgnął po najprostszy sposób, żeby do nich dołączyć. To stało się po wiadomościach. Narosło na problem, który ktoś inny zapoczątkował.</w:t>
+        <w:t>Ta ściana była tylko echem. Plotki o Holly Jolly Bakery rozniosły się po całej alei i ktoś młody sięgnął po najprostszy sposób, żeby do nich dołączyć. Pojawiło się dopiero, gdy rozeszły się wieści. Dołożyło się do kłopotu, który zaczął ktoś inny.</w:t>
       </w:r>
     </w:p>
     <w:p>
@@ -3883,7 +3883,7 @@
     </w:p>
     <w:p>
       <w:r>
-        <w:t xml:space="preserve">— Pani Danny nie malował tej ściany, pani Ott. Siedział z siostrami w nocy, kiedy to zrobiono, i powtórzę to każdemu, kto o to zapyta.</w:t>
+        <w:t xml:space="preserve">— Pani syn, Danny, nie malował tej ściany, pani Ott. Siedział z siostrami w nocy, kiedy to zrobiono, i powtórzę to każdemu, kto o to zapyta.</w:t>
       </w:r>
     </w:p>
     <w:p>
@@ -3893,7 +3893,7 @@
     </w:p>
     <w:p>
       <w:r>
-        <w:t>Nie było tu publicznego poniżania do odkręcenia, a jedynie szept. Claire rozniesie tę wieść tam, gdzie to miało znaczenie.</w:t>
+        <w:t>Nie było tu publicznego poniżania do odkręcenia, a jedynie szept. Claire rozniesie tę wieść tam, gdzie to ma znaczenie.</w:t>
       </w:r>
     </w:p>
     <w:p>
@@ -3903,7 +3903,7 @@
     </w:p>
     <w:p>
       <w:r>
-        <w:t xml:space="preserve">Krąg spotkał się tego wieczoru bez żadnych wianków. Olivia obdzwoniła wszystkich po południu: tylko druty, ponieważ beczkę Hala na ciepłe ubrania opróżniono dwa razy w ciągu tygodnia, a rodziny mieszkające wyżej na wzgórzu potrzebowały czapek. Stelaże pozostały więc na zapleczu, a nasza siódemka przysunęła krzesła blisko pieca, uzbrojona w druty i każdy możliwy kłębek wełny, jaki był w sklepie.</w:t>
+        <w:t xml:space="preserve">Krąg spotkał się tego wieczoru bez żadnych wieńców. Olivia obdzwoniła wszystkich po południu: tylko druty, ponieważ beczkę Hala na ciepłe ubrania opróżniono dwa razy w ciągu tygodnia, a rodziny mieszkające wyżej na wzgórzu potrzebowały czapek. Stelaże pozostały więc na zapleczu, a nasza siódemka przysunęła krzesła blisko pieca, uzbrojona w druty i każdy możliwy kłębek wełny, jaki był w sklepie.</w:t>
       </w:r>
     </w:p>
     <w:p>
@@ -3933,7 +3933,7 @@
     </w:p>
     <w:p>
       <w:r>
-        <w:t>— Tak czułam — powiedziała Claire i podkreśliła coś dwukrotnie. — Rano zacznę od apteki, skoro tam to wszystko się zaczęło.</w:t>
+        <w:t>— Wiedziałam — powiedziała Claire i podkreśliła coś dwukrotnie. — Rano zacznę od apteki, skoro tam to wszystko się zaczęło.</w:t>
       </w:r>
     </w:p>
     <w:p>
@@ -3948,7 +3948,7 @@
     </w:p>
     <w:p>
       <w:r>
-        <w:t xml:space="preserve">— Jego matka karmiła obiadem każde dziecko w tym miasteczku od dwudziestu lat — powiedziała Dot. — Ktoś mógł o tym pomyśleć, zanim zaczął paplać.</w:t>
+        <w:t xml:space="preserve">— Jego matka od dwudziestu lat karmi obiadem każde dziecko w tym miasteczku — powiedziała Dot. — Ktoś mógł o tym pomyśleć, zanim zaczął paplać.</w:t>
       </w:r>
     </w:p>
     <w:p>
@@ -3998,12 +3998,12 @@
     </w:p>
     <w:p>
       <w:r>
-        <w:t>Dot nie podniosła wzroku ze swojej ściągaczowej robótki. — Powinny być dobre w sklepie ze złotem. Ktoś musi przecież zapłacić za to całe złoto na oknach.</w:t>
-      </w:r>
-    </w:p>
-    <w:p>
-      <w:r>
-        <w:t>— Jeszcze nie wstąpiła po wianek — zauważyła Olivia. — Każde drzwi sklepu przy Evergreen mają jeden z naszych, tylko nie jej.</w:t>
+        <w:t>Dot nie podniosła wzroku ze swojej ściągaczowej robótki. — Powinny być dobre w tym złotym sklepie. Ktoś musi przecież zapłacić za to całe złoto na oknach.</w:t>
+      </w:r>
+    </w:p>
+    <w:p>
+      <w:r>
+        <w:t>— Jeszcze nie wstąpiła po wieniec — zauważyła Olivia. — Każde drzwi sklepu przy Evergreen mają jeden z naszych, tylko nie jej.</w:t>
       </w:r>
     </w:p>
     <w:p>
@@ -4098,7 +4098,7 @@
     </w:p>
     <w:p>
       <w:r>
-        <w:t xml:space="preserve">— Weź dwie. Tam, skąd to przyszło, jest tego więcej. — Odwróciła się i znalazła mnie u swego boku. — Jessica. Jak ona się trzyma?</w:t>
+        <w:t xml:space="preserve">— Weź dwie. Tam, skąd to przyszło, jest tego więcej. — Odwróciła się i znalazła mnie u swego boku. — Jessico. Jak ona się trzyma?</w:t>
       </w:r>
     </w:p>
     <w:p>
@@ -4137,7 +4137,7 @@
         <w:t xml:space="preserve">Co im wyślemy za sto lat? Do zapieczętowania, gdy stara zostanie otwarta, w nowym roku.</w:t>
       </w:r>
       <w:r>
-        <w:t xml:space="preserve"> A teraz miasto przyszło, żeby dołożyć coś od siebie. Każdy przyniósł skrawek teraźniejszości, żeby go tam włożyć, żeby leżał w ciemności przez wiek dla tego, kto go odkopie.</w:t>
+        <w:t xml:space="preserve"> A teraz miasteczko przyszło, żeby dołożyć coś od siebie. Każdy przyniósł skrawek teraźniejszości, żeby go tam włożyć, żeby leżał w ciemności przez wiek dla tego, kto go odkopie.</w:t>
       </w:r>
     </w:p>
     <w:p>
@@ -4157,12 +4157,12 @@
     </w:p>
     <w:p>
       <w:r>
-        <w:t>— To wystarczy — powiedział cicho, ledwo wierząc w te słowa. — Towarzystwo. Nikt nie poprosił o dolara, a deklaracje i tak napływają. Stary Ferris, emeryt z fabryki, twierdzi, że sfinansuje cały kocioł, jeśli miasto zrobi dach. Uratują to miejsce, Jessica. Własnymi rękoma. Nie myślałem, że dożyję chwili, kiedy będą tego tak mocno pragnąć.</w:t>
-      </w:r>
-    </w:p>
-    <w:p>
-      <w:r>
-        <w:t>— Czuję to — powiedziałam, i tak było. Unosiło się to z tej sali jak ciepło z polnego kominka Nicka. I przez jedną czystą godzinę pozwoliłam sobie stanąć w samym jej środku i zapomniałam, że na mojej alei jest ktoś, kto życzy Grecie źle.</w:t>
+        <w:t>— To wystarczy — powiedział cicho, ledwo wierząc w te słowa. — Towarzystwo. Nikt nie poprosił o dolara, a deklaracje i tak napływają. Stary Ferris, emeryt z fabryki, twierdzi, że sfinansuje cały kocioł, jeśli miasteczko zrobi dach. Uratują to miejsce, Jessico. Własnymi rękoma. Nie myślałem, że dożyję chwili, kiedy będą tego tak mocno pragnąć.</w:t>
+      </w:r>
+    </w:p>
+    <w:p>
+      <w:r>
+        <w:t>— Czuję to — powiedziałam, i tak było. Unosiło się to z tej sali jak ciepło z kominka Nicka z polnych kamieni. I przez jedną czystą godzinę pozwoliłam sobie stanąć w samym jej środku i zapomniałam, że na mojej alei jest ktoś, kto życzy Grecie źle.</w:t>
       </w:r>
     </w:p>
     <w:p>
@@ -4194,7 +4194,7 @@
     </w:p>
     <w:p>
       <w:r>
-        <w:t xml:space="preserve">Znałam ten tydzień. Wszyscy znali. Drzwi otworzyły się wczoraj, a Ivy stała w kolejce. To, co mnie zatrzymało, znajdowało się w rogu, gdzie sekretarka świetlicy ostemplowała kartkę fioletowym tuszem, tak jak stemplowała wszystko, co wypuszczała na swoją tablicę. Zdjęłam ją, żeby się upewnić. WYWIESZONO i data. 30 października.</w:t>
+        <w:t xml:space="preserve">Znałam ten tydzień. Wszyscy znali. Drzwi otworzyły się wczoraj, a Ivy stała w kolejce. To, co mnie zatrzymało, znajdowało się w rogu, gdzie sekretarka świetlicy ostemplowała kartkę fioletowym tuszem, tak jak stemplowała wszystko, co dopuszczała do swojej tablicy. Zdjęłam ją, żeby się upewnić. WYWIESZONO i data. 30 października.</w:t>
       </w:r>
     </w:p>
     <w:p>
@@ -4223,12 +4223,12 @@
     </w:p>
     <w:p>
       <w:r>
-        <w:t xml:space="preserve">Nie tydzień wcześniej, żeby zbudować klientelę przed gorączką. Nie tydzień później, kiedy handel się uspokoił. Dokładnie ten tydzień. Ten jeden ciemny tydzień w roku Grety, kiedy cały świąteczny handel słodyczami w mieście nie miałby dokąd pójść, a tam na samym końcu alei błyszcząca nowa cukiernia z szeroko otwartymi, oświetlonymi na złoto drzwiami, by schwytać każdą duszę. Wydrukowana, przypięta i opłacona na pełny tydzień przed tym, jak człowiek z hrabstwa po raz pierwszy postawił stopę w kuchni Grety.</w:t>
-      </w:r>
-    </w:p>
-    <w:p>
-      <w:r>
-        <w:t>Nie dało się zaplanować wielkiego otwarcia na zamknięcie, które jeszcze się nie wydarzyło. Nie przez przypadek. Chyba że wiedziałaś, że nadchodzi, ponieważ to ty byłaś tą, która je przyniosła.</w:t>
+        <w:t xml:space="preserve">Nie tydzień wcześniej, żeby zbudować klientelę przed gorączką. Nie tydzień później, kiedy ruch by się już uspokoił. Dokładnie ten tydzień. Ten jeden ciemny tydzień w roku Grety, kiedy cały świąteczny handel słodyczami w miasteczku nie miałby dokąd pójść, a tam na samym końcu alei błyszcząca nowa cukiernia z szeroko otwartymi, oświetlonymi na złoto drzwiami, by schwytać każdą duszę. A ulotkę wydrukowano, przypięto i opłacono na pełny tydzień przed tym, jak człowiek z hrabstwa po raz pierwszy postawił stopę w kuchni Grety.</w:t>
+      </w:r>
+    </w:p>
+    <w:p>
+      <w:r>
+        <w:t>Nie dało się zaplanować wielkiego otwarcia na zamknięcie, które jeszcze się nie wydarzyło. Nie przez przypadek. Chyba że się wiedziało, że nadchodzi, bo samemu się je sprowadzało.</w:t>
       </w:r>
     </w:p>
     <w:p>
@@ -4292,7 +4292,7 @@
         <w:t xml:space="preserve">Suszony kwas. Ktoś to tam włożył. I dokładnie wiedział, ile wsypać.</w:t>
       </w:r>
       <w:r>
-        <w:t xml:space="preserve"> Kwas, powiedziała, ot tak, jak pogodę, do kręgu kobiet przy beczce z jedzeniem. Proszek wmieszany do jej mąki na jej zamówienie przez dostawcę, który wrzuciłby wszystko, o co by poprosiła. Kobieta, która wiedziała z dokładnością do szeptu, ile ciasto zniesie, a więc wiedziała, ile go zepsuje.</w:t>
+        <w:t xml:space="preserve"> Kwas, powiedziała, lekko, jakby mówiła o pogodzie, do kręgu kobiet przy beczce z jedzeniem. Proszek wmieszany do jej mąki na jej zamówienie przez dostawcę, który wrzuciłby wszystko, o co by poprosiła. Kobieta, która wiedziała z dokładnością do szeptu, ile ciasto zniesie, a więc wiedziała, ile go zepsuje.</w:t>
       </w:r>
     </w:p>
     <w:p>
@@ -4321,7 +4321,7 @@
     </w:p>
     <w:p>
       <w:r>
-        <w:t>Nie przeszłam przez salę ani nie uniosłam ulotki. Przypięłam ją z powrotem do tablicy, tam gdzie ją znalazłam, i wyszłam zaczerpnąć powietrza, bo nie mogłam myśleć w takim upale.</w:t>
+        <w:t>Nie przeszłam przez salę ani nie uniosłam ulotki. Przypięłam ją z powrotem do tablicy, tam gdzie ją znalazłam, i wyszłam zaczerpnąć powietrza, bo nie mogłam myśleć w takim cieple.</w:t>
       </w:r>
     </w:p>
     <w:p>
@@ -4336,12 +4336,12 @@
     </w:p>
     <w:p>
       <w:r>
-        <w:t>Byłam powolna. Nie powolna w obrabianiu mąki czy alejki. To wszystko odczytałam poprawnie. Powolna w tej jednej rzeczy. Przez cały tydzień brałam ją w myśli i odkładałam z powrotem, podczas gdy polowałam na krzywdę u skrzywdzonego chłopaka, obolałego rzeźnika, rodziny liczącej metry drzewa. Ponieważ była nowa, urocza i nakarmiła mnie.</w:t>
-      </w:r>
-    </w:p>
-    <w:p>
-      <w:r>
-        <w:t>Nie wypowiedziałam jej imienia. Ani w sali, ani na schodach, nawet przed Pip. Rzecz powiedziana głośno w tym mieście była już wszędzie do kolacji, a ja miałam fioletowy stempel z datą i kilka słów o fachu i nic, co utrzymałoby się gdziekolwiek poza moim pewnym sercem.</w:t>
+        <w:t>Byłam powolna. Nie w rozpracowaniu mąki czy alejki. To wszystko odczytałam poprawnie. Powolna w tej jednej rzeczy. Przez cały tydzień brałam ją w myśli i odkładałam z powrotem, podczas gdy polowałam na krzywdę u skrzywdzonego chłopaka, obolałego rzeźnika, rodziny liczącej szczapy drewna. Ponieważ była nowa, urocza i nakarmiła mnie.</w:t>
+      </w:r>
+    </w:p>
+    <w:p>
+      <w:r>
+        <w:t>Nie wypowiedziałam jej imienia. Ani w sali, ani na schodach, nawet przed Pip. Rzecz powiedziana głośno w tym miasteczku była już wszędzie do kolacji, a ja miałam fioletowy stempel z datą i kilka słów o fachu i nic, co utrzymałoby się gdziekolwiek poza moim pewnym sercem.</w:t>
       </w:r>
     </w:p>
     <w:p>
@@ -4373,7 +4373,7 @@
     <w:p/>
     <w:p>
       <w:r>
-        <w:t xml:space="preserve">Zdecydowałam się na wieniec w ciemności, kiedy Nick spał; był to jedyny pretekst, który pozwoliłby mi przejść przez jej złote drzwi bez fałszywej nuty, ponieważ sam wieniec nie był fałszywy. Kobiety z kręgu przyozdabiały na sezon całą aleję, każde sklepowe drzwi przy niej, a nowy sklep to nowe drzwi. Niezaproponowanie Sugarplum wieńca w tygodniu otwarcia uchodziłoby za coś podejrzanego. Kiedy więc moje dłonie zajmowały się jodłą, zrobiłam też tę drugą rzecz, po którą przyszłam. Przyjrzałam się jej uważnie. Na tyle blisko, by wyłapać, co kryło się pod tym urokiem. Zrobiłam to samo z Petem nad jego pniem do rąbania.</w:t>
+        <w:t xml:space="preserve">Zdecydowałam się na wieniec w ciemności, kiedy Nick spał; był to jedyny pretekst, który pozwoliłby mi przejść przez jej złote drzwi bez fałszywej nuty, ponieważ sam wieniec nie był fałszywy. Kobiety z kręgu przyozdabiały na sezon całą aleję, każde sklepowe drzwi przy niej, a nowy sklep to nowe drzwi. Niezaproponowanie Sugarplum wieńca w tygodniu otwarcia uchodziłoby za coś podejrzanego. Kiedy więc moje dłonie będą zajęte jodłą, zajmę się tą drugą sprawą, dla której tam szłam. Przyjrzę się jej z bliska. Na tyle blisko, by wyłapać, co kryło się pod tym urokiem. Zrobiłam to samo z Petem nad jego pniem do rąbania.</w:t>
       </w:r>
     </w:p>
     <w:p/>
@@ -4427,7 +4427,7 @@
     <w:p/>
     <w:p>
       <w:r>
-        <w:t xml:space="preserve">— Nie widziała pani na tej ulicy takiego grudnia, jaki nadchodzi — rzuciła swobodnie, stawiając przede mną filiżankę. — Sprawdziłam statystyki. Populację, kolacje parafialne, szkołę, cały prowadzony przez was kalendarz świąteczny. W to Boże Narodzenie w tym miasteczku jest więcej słodkiego utargu, niż kiedykolwiek dało się gdziekolwiek zarobić, ponieważ zawsze był tu tylko ten jeden stary sklep z wypiekami, u którego można było go zostawić. Po wiejskich cenach. Za wiejskie towary. — Określenie „ten jeden stary sklep z wypiekami” przeszło jej przez gardło miło, jakby mówiła o czymś, co należało już do przeszłości. — Cały ten ruch szuka teraz miejsca, dokąd mógłby pójść. I oto jestem.</w:t>
+        <w:t xml:space="preserve">— Nie widziała pani na tej ulicy takiego grudnia, jaki nadchodzi — rzuciła swobodnie, stawiając przede mną filiżankę. — Sprawdziłam statystyki. Populację, kolacje parafialne, szkołę, cały prowadzony przez was kalendarz świąteczny. W tym miasteczku jest na Boże Narodzenie więcej słodkiego utargu, niż kiedykolwiek miało gdzie go wydać, ponieważ zawsze była tu tylko ta jedna stara piekarnia, w której można było go zostawić. Po wiejskich cenach. Za wiejskie towary. — Określenie „ta jedna stara piekarnia” przeszło jej przez gardło miło, jakby mówiła o czymś, co należało już do przeszłości. — Cały ten ruch szuka teraz miejsca, dokąd mógłby pójść. I oto jestem.</w:t>
       </w:r>
     </w:p>
     <w:p/>
@@ -4511,7 +4511,7 @@
     <w:p/>
     <w:p>
       <w:r>
-        <w:t>— Jodła i złota kokarda, jeśli można prosić. — Odprowadziła mnie do drzwi, uprzejma do samego końca. — Żeby stanąć wśród innych. Tak, jakbym była tu od zawsze. — I znowu to padło. A kiedy to powiedziała, w jej oczach przemknął błysk. Właścicielski. Kobieta spoglądająca w dół swojej alei na rynek, który już zdążyła uznać za swój. Potem zniknął, schowany z powrotem pod warstwą ciepła, i była już tylko gospodynią żegnającą starą sąsiadkę.</w:t>
+        <w:t>— Jodła i złota kokarda, jeśli można prosić. — Odprowadziła mnie do drzwi, uprzejma do samego końca. — Żeby wisiał wśród innych. Tak, jakbym była tu od zawsze. — I znowu to padło. A kiedy to powiedziała, w jej oczach przemknął błysk. Właścicielski. Kobieta spoglądająca w dół swojej alei na rynek, który już zdążyła uznać za swój. Potem zniknął, schowany z powrotem pod warstwą ciepła, i była już tylko gospodynią żegnającą starą sąsiadkę.</w:t>
       </w:r>
     </w:p>
     <w:p/>
@@ -4551,12 +4551,12 @@
     </w:p>
     <w:p>
       <w:r>
-        <w:t xml:space="preserve">Wianek dla Sugarplum leżał w połowie ułożony na moim stole w kuchni, gałązki jodły balsamowej oplotły jedną trzecią okręgu, a drut zwisał ze stelaża, podczas gdy obok czekała złota wstążka, którą ucięłam na kokardę. Pracowałam nad nim od godziny, odkąd wróciłam z jej sklepu, i przy każdej gałązce myślałam o fudze. Potem z powrotem włożyłam płaszcz. Dwa dni temu na ławce na skwerze Danny Ott sięgnął po wspomnienie, którego nie mógł do końca schwytać, a ja powiedziałam mu, żeby mi je przyniósł, gdy stanie się wyraźne. Nie chciałam dłużej na niego czekać.</w:t>
-      </w:r>
-    </w:p>
-    <w:p>
-      <w:r>
-        <w:t xml:space="preserve">Znalazłam go przy ladzie w aptece chwilę przed południem. W liceum była skrócona lekcja i kupował syrop na kaszel oraz krople miodowe — takie, jakie dom pełen chorych sióstr zużywa w zły tydzień. Jego ramiona wciąż były spięte w ten sam czujny sposób. Rozluźniły się, gdy zobaczył, kto to, i rozluźniły się znowu, gdy Pip wyszła zza rogu alejki i przyjrzała mu się z głową przechyloną na bok, zupełnie jak na skwerze.</w:t>
+        <w:t xml:space="preserve">Wieniec dla Sugarplum leżał w połowie ułożony na moim stole w kuchni, gałązki jodły balsamowej oplotły jedną trzecią okręgu, a drut zwisał ze stelaża, podczas gdy obok czekała złota wstążka, którą ucięłam na kokardę. Pracowałam nad nim od godziny, odkąd wróciłam z jej sklepu, i przy każdej gałązce myślałam o fudze. Potem z powrotem włożyłam płaszcz. Dwa dni temu na ławce na skwerze Danny Ott sięgnął po wspomnienie, którego nie mógł do końca schwytać, a ja powiedziałam mu, żeby mi je przyniósł, gdy stanie się wyraźne. Nie chciałam dłużej na niego czekać.</w:t>
+      </w:r>
+    </w:p>
+    <w:p>
+      <w:r>
+        <w:t xml:space="preserve">Znalazłam go przy ladzie w aptece chwilę przed południem. W liceum był skrócony dzień zajęć i kupował syrop na kaszel oraz krople miodowe — takie, jakie dom pełen chorych sióstr zużywa w zły tydzień. Jego ramiona wciąż były spięte w ten sam czujny sposób. Rozluźniły się, gdy zobaczył, kto to, i rozluźniły się znowu, gdy Pip wyszła zza rogu alejki i przyjrzała mu się z głową przechyloną na bok, zupełnie jak na skwerze.</w:t>
       </w:r>
     </w:p>
     <w:p>
@@ -4566,7 +4566,7 @@
     </w:p>
     <w:p>
       <w:r>
-        <w:t>— To była prawda — powiedziałam. — Ja to tylko przyniosłam. Masz pół godziny? Stawiam ci kakao.</w:t>
+        <w:t>— To była prawda — powiedziałam. — Ja ją tylko rozniosłam. Masz pół godziny? Stawiam ci kakao.</w:t>
       </w:r>
     </w:p>
     <w:p>
@@ -4586,7 +4586,7 @@
     </w:p>
     <w:p>
       <w:r>
-        <w:t>— Nikt tego nie planował — powiedział w końcu. — Kyle Reardon i młodszy dzieciak Ferrisów. Rzucili sobie wyzwanie, gdy rozeszły się wieści o mące Grety. Kyle wziął puszkę z szopy swojego brata i wyszli o północy, żeby zrobić to dla śmiechu, a potem uciekli. — Spojrzał szybko w górę. — Powiedziałbym o tym wcześniej, gdyby ktoś mnie zapytał zamiast samemu decydować. Oni są głupi, a nie wredni. Słyszeli, jak całe miasto mówi, że jest z nią coś nie tak, i wymalowali na jej ścianie najgorsze słowo, jakie przyszło im do głowy.</w:t>
+        <w:t>— Nikt tego nie planował — powiedział w końcu. — Kyle Reardon i młodszy dzieciak Ferrisów. Rzucili sobie wyzwanie, gdy rozeszły się wieści o mące Grety. Kyle wziął puszkę z szopy swojego brata i wyszli o północy, żeby zrobić to dla śmiechu, a potem uciekli. — Spojrzał szybko w górę. — Powiedziałbym o tym wcześniej, gdyby ktoś mnie zapytał, zamiast z góry przesądzać. Oni są głupi, a nie wredni. Słyszeli, jak całe miasteczko mówi, że jest z nią coś nie tak, i wymalowali na jej ścianie najgorsze słowo, jakie przyszło im do głowy.</w:t>
       </w:r>
     </w:p>
     <w:p>
@@ -4611,7 +4611,7 @@
     </w:p>
     <w:p>
       <w:r>
-        <w:t xml:space="preserve">— Był taki poranek, kiedy widziałem kogoś z tyłu u Grety. Zupełnie ciemno, zanim jej piece zaczęły działać, jeszcze bez światła w oknie. Dorosły, w fartuchu piekarskim. Nie Greta. Greta jest barczysta, a ta osoba była szczupła. Szybka i zwinna, nie jak ktoś zaczynający zmianę. Długi fartuch, taki sięgający do piszczeli, blady, z płaszczem pod spodem. Stała przy jej tylnych schodkach przez chwilę, a potem ruszyła alejką w stronę drugiego końca. Nigdzie nie weszła. Zgubiłem ją za światłem przy aptece. — Zmarszczył brwi. — Myślałem, że to dostawa.</w:t>
+        <w:t xml:space="preserve">— Był taki poranek, kiedy widziałem kogoś z tyłu u Grety. Zupełnie ciemno, zanim jej piece zaczęły działać, jeszcze bez światła w oknie. Ktoś dorosły, w fartuchu piekarskim. Nie Greta. Greta jest barczysta, a ta osoba była szczupła. Szybka i zwinna, nie jak ktoś zaczynający zmianę. Długi fartuch, taki sięgający do piszczeli, blady, z płaszczem pod spodem. To stało przy jej tylnych schodkach przez chwilę, a potem ruszyło alejką w stronę drugiego końca. Nigdzie nie weszło. Zgubiłem to za światłem przy aptece. — Zmarszczył brwi. — Myślałem, że to dostawa.</w:t>
       </w:r>
     </w:p>
     <w:p>
@@ -4621,7 +4621,7 @@
     </w:p>
     <w:p>
       <w:r>
-        <w:t xml:space="preserve">— Było pudełko. Innego ranka. Leżało na zewnątrz tylnych drzwi Grety i to nie było jedno z jej worków na mąkę. To był karton z nadrukiem i pamiętam go, ponieważ miał na sobie złoto. Złoty napis z boku. Nie mogłem go odczytać z naszego okna. — Wtedy na mnie spojrzał. — Kiedy spojrzałem ponownie, już go nie było. Powiedziała pani, żebym to przyniósł, gdy stanie się wyraźne.</w:t>
+        <w:t xml:space="preserve">— Było pudełko. Innego ranka. Leżało na zewnątrz tylnych drzwi Grety i to nie był żaden z jej worków na mąkę. To był karton z nadrukiem i pamiętam go, ponieważ miał na sobie złoto. Złoty napis z boku. Nie mogłem go odczytać z naszego okna. — Wtedy na mnie spojrzał. — Kiedy spojrzałem ponownie, już go nie było. Powiedziała pani, żebym to przyniósł, gdy stanie się wyraźne.</w:t>
       </w:r>
     </w:p>
     <w:p>
@@ -4646,7 +4646,7 @@
     </w:p>
     <w:p>
       <w:r>
-        <w:t>Zapiął płaszcz pod sam podbródek i podniósł papierową torbę. Pip odprowadziła ją wzrokiem bez większego wdzięku.</w:t>
+        <w:t>Zapiął płaszcz pod sam podbródek i podniósł papierową torbę. Pip niechętnie odprowadziła ją wzrokiem.</w:t>
       </w:r>
     </w:p>
     <w:p>
@@ -4696,7 +4696,7 @@
     </w:p>
     <w:p>
       <w:r>
-        <w:t xml:space="preserve">— Jestem weterynarzem, Jessica — rzekł, kiedy skończyłam. — Nie policjantem, a ona nie musi ci niczego pokazywać.</w:t>
+        <w:t xml:space="preserve">— Jestem weterynarzem, Jessico — rzekł, kiedy skończyłam. — Nie policjantem, a ona nie musi ci niczego pokazywać.</w:t>
       </w:r>
     </w:p>
     <w:p>
@@ -4786,7 +4786,7 @@
     </w:p>
     <w:p>
       <w:r>
-        <w:t xml:space="preserve">— Kwas askorbinowy i enzymy — powiedział. — Szczypta na dwadzieścia trzy kilogramy. Polepszacz do ciasta. — Z powrotem założył wieczko. — To nie to, co było w mące Grety. Wiadro kwaśnej bazy poczułoby się w tej samej chwili, kiedy zdejmuje się pokrywkę. Ostry, jak ocet. Nic w tym pomieszczeniu tak nie pachnie.</w:t>
+        <w:t xml:space="preserve">— Kwas askorbinowy i enzymy — powiedział. — Szczypta na dwadzieścia trzy kilogramy. Polepszacz do ciasta. — Z powrotem założył wieczko. — To nie to, co było w mące Grety. Wiadro kwaśnej bazy poczułoby się w tej samej chwili, kiedy zdejmuje się pokrywkę. Ostry zapach, jak ocet. Nic w tym pomieszczeniu tak nie pachnie.</w:t>
       </w:r>
     </w:p>
     <w:p>
@@ -4846,7 +4846,7 @@
     </w:p>
     <w:p>
       <w:r>
-        <w:t xml:space="preserve">— I tak przyniesie pani ten wianek, domyślam się — stwierdziła. — Gałązki jodły i złota wstążka. — Przytrzymała nam kotarę tak samo, jak wtedy, gdy wchodziliśmy.</w:t>
+        <w:t xml:space="preserve">— I tak przyniesie pani ten wieniec, domyślam się — stwierdziła. — Jodła i złota kokarda. — Przytrzymała nam kotarę tak samo, jak wtedy, gdy wchodziliśmy.</w:t>
       </w:r>
     </w:p>
     <w:p>
@@ -4866,7 +4866,7 @@
     </w:p>
     <w:p>
       <w:r>
-        <w:t>— Zostaje to ze mną, Jessica — powiedział. — Wszystko.</w:t>
+        <w:t>— To zostanie między nami, Jessico — powiedział. — Wszystko.</w:t>
       </w:r>
     </w:p>
     <w:p>
@@ -4951,7 +4951,7 @@
     </w:p>
     <w:p>
       <w:r>
-        <w:t>Poszłam. Oczywiście, że poszłam. Pip szła tuż za mną po skrzypiącym śniegu i tym razem nie zatrzymała się przy żadnym progu. Wcisnęła się przez przedsionek przede mną w zimno, które w środku było gorsze niż na zewnątrz. Zamrożone zimno budynku, którego piec przestawał grzać.</w:t>
+        <w:t>Poszłam. Oczywiście, że poszłam. Pip szła tuż za mną po skrzypiącym śniegu i tym razem nie zatrzymała się przy żadnym progu. Wcisnęła się przez przedsionek przede mną w zimno, które w środku było gorsze niż na zewnątrz. Zamrożone zimno budynku, którego piec przestał grzać.</w:t>
       </w:r>
     </w:p>
     <w:p>
@@ -4961,7 +4961,7 @@
     </w:p>
     <w:p>
       <w:r>
-        <w:t xml:space="preserve">— Ferris zamierzał sfinansować piec — powiedział Hal cicho, do nikogo lub do mnie. — Cały koszt, jeśli miasto zrobi dach. Tak to miało wyglądać. Ale dach też już przepadł, a dach to suma o połowę większa, i Ferris postawi piec w dobrym sezonie, ale liczy pieniądze w złym. — Potarł twarz. — Nie powie wprost nie. Powie: zaczekajmy do wiosny. Aż zobaczymy. Do wiosny mróz przeżre cały sufit. Chodzi o zbiory, Jessica. O budynek i wszystko, co w nim jest.</w:t>
+        <w:t xml:space="preserve">— Ferris zamierzał sfinansować piec — powiedział Hal cicho, do nikogo lub do mnie. — Cały koszt, jeśli miasteczko zrobi dach. Tak to miało wyglądać. Ale dach też już przepadł, a dach to suma o połowę większa, i Ferris postawi piec w dobrym sezonie, ale liczy pieniądze w złym. — Potarł twarz. — Nie powie wprost nie. Powie: zaczekajmy do wiosny. Aż zobaczymy. Do wiosny mróz przeżre cały sufit. Chodzi o zbiory, Jessico. O budynek i wszystko, co w nim jest.</w:t>
       </w:r>
     </w:p>
     <w:p>
@@ -4971,12 +4971,12 @@
     </w:p>
     <w:p>
       <w:r>
-        <w:t xml:space="preserve">Dobre samopoczucie związane z akcją, pudło z cedru zapełniające się w świetlicy, słowa założycielki w każdym oknie i troskliwe kobiety mówiące, że to byłby grzech i hańba. To nie zniknęło. Nie było aż tak tanie. Ale opadło. Obserwowałam, jak opada w tym pokoju, patrzyłam, jak nadzieja staje się trudniejsza do utrzymania w ludziach, którzy pozwolili sobie uwierzyć, że Towarzystwo jest niemal ocalone, ponieważ tak bardzo pragnęli jego ocalenia. Pomyślałam o panu Worthingtonie, najstarszym dobroczyńcy Towarzystwa, który tygodnie temu powiedział mi, że wypisze całą sumę na jednym czeku, jeśli do tego dojdzie. Prosiłam go, żeby zachował go w rezerwie, i tam go zostawiłam. Miasto najpierw musiało wyciągnąć rękę.</w:t>
-      </w:r>
-    </w:p>
-    <w:p>
-      <w:r>
-        <w:t xml:space="preserve">Nie zostałam tam przez cały dzień. Trzeba było zająć się Gretą i komuś należał się wianuszek. I niosłam wczorajszy dzień przez to wszystko, nie mogłam go nie nieść: zapasy Renée otwarte dla Doca półka po półce bez ani grama kwaśnej bazy w żadnej z nich, moja pewność siebie usunięta spod nóg i pamięć o tym, jak bardzo pragnęłam, żeby to była ona. Dwa rodzaje kłopotów na jednej ulicy. Pęknięty piec, co nie było niczyją winą. Zaprawiony pojemnik z mąką i wydrukowana skarga, które były czyjąś winą, a ja już nie wiedziałam czyją. Wróciłam do domu z obiema tymi rzeczami w głowie.</w:t>
+        <w:t xml:space="preserve">Dobre samopoczucie związane z akcją, pudło z cedru zapełniające się w świetlicy, słowa założycielki w każdym oknie i troskliwe kobiety mówiące, że to byłby grzech i hańba. To nie zniknęło. Nie było aż tak tanie. Ale opadło. Obserwowałam, jak opada w tym pokoju, patrzyłam, jak nadzieja staje się trudniejsza do utrzymania w ludziach, którzy pozwolili sobie uwierzyć, że Towarzystwo jest niemal ocalone, ponieważ tak bardzo pragnęli jego ocalenia. Pomyślałam o panu Worthingtonie, najstarszym dobroczyńcy Towarzystwa, który tygodnie temu powiedział mi, że wypisze całą sumę na jednym czeku, jeśli do tego dojdzie. Prosiłam go, żeby zachował go w rezerwie, i tam go zostawiłam. Miasteczko najpierw musiało wyciągnąć rękę.</w:t>
+      </w:r>
+    </w:p>
+    <w:p>
+      <w:r>
+        <w:t xml:space="preserve">Nie zostałam tam przez cały dzień. Trzeba było zająć się Gretą i komuś należał się wieniec. I niosłam wczorajszy dzień przez to wszystko, nie mogłam go nie nieść: zapasy Renée otwarte dla Doca półka po półce bez ani grama kwaśnej bazy w żadnej z nich, moja pewność, która usunęła mi się spod nóg i pamięć o tym, jak bardzo pragnęłam, żeby to była ona. Dwa rodzaje kłopotów na jednej ulicy. Pęknięty piec, co nie było niczyją winą. Zaprawiony pojemnik z mąką i wydrukowana skarga, które były czyjąś winą, a ja już nie wiedziałam czyją. Wróciłam do domu z obiema tymi rzeczami w głowie.</w:t>
       </w:r>
     </w:p>
     <w:p>
@@ -5021,17 +5021,17 @@
     </w:p>
     <w:p>
       <w:r>
-        <w:t>Znałam ten zegarek. Nosił go każdego dnia, odkąd go znałam, stary złoty zegarek kieszonkowy na znoszonym łańcuszku, należący do jego ojca lub dziadka, jedyną piękną rzecz u prostego, ostrożnego człowieka. Leżał teraz obok złożonej kartki papieru i nie musiałam jej czytać, żeby pojąć sens tego, co zamierzał. Dwa miasta stąd był jubiler, który skupował takie rzeczy. Złoty zegarek kieszonkowy w dobrym stanie osiągał ładną sumę. Nie dach. Nie połowę dachu. Ale początek. Prace nad roztopami, zapas bibuły, ludzie do uszczelnienia szwu przed kolejnymi mrozami. Te małe, natychmiastowe potrzeby, którym żaden miejski komitet nie potrafił sprostać w ciągu jednego trudnego tygodnia.</w:t>
-      </w:r>
-    </w:p>
-    <w:p>
-      <w:r>
-        <w:t>Nikomu nie powiedział. Zamierzał sprzedać jedyną piękną rzecz, jaką posiadał, i przeznaczyć te pieniądze po cichu na miejsce, z którego zrezygnował. Żeby znaleziono to w księgach rachunkowych jako anonimowy dar, nie brać za to zasług, nie być przez nikogo dziękowanym. Bycie dziękowanym było właśnie tym, czemu się sprzeciwił i zamierzał sprzeciwiać, bez względu na to, ile go to kosztowało.</w:t>
-      </w:r>
-    </w:p>
-    <w:p>
-      <w:r>
-        <w:t>Wtedy uniósł wzrok i mnie zobaczył. Utkwił w bezruchu między mokrą stroną w dłoniach a zegarkiem na stole i nie sięgnął po to, by cokolwiek schować. Po prostu znieruchomiał. Zadbał o to, by nigdy nie zostać przy tym przyłapanym, a jednak został.</w:t>
+        <w:t>Znałam ten zegarek. Nosił go każdego dnia, odkąd go znałam, stary złoty zegarek kieszonkowy na znoszonym łańcuszku, należący do jego ojca lub dziadka, jedyna piękna rzecz u prostego, ostrożnego człowieka. Leżał teraz obok złożonej kartki papieru i nie musiałam jej czytać, żeby pojąć sens tego, co zamierzał. Dwa miasta stąd był jubiler, który skupował takie rzeczy. Złoty zegarek kieszonkowy w dobrym stanie osiągał ładną sumę. Nie dach. Nie połowę dachu. Ale początek. Prace nad roztopami, zapas bibuły, ludzie do uszczelnienia szwu przed kolejnymi mrozami. Te małe, natychmiastowe potrzeby, którym żaden miejski komitet nie potrafił sprostać w ciągu jednego trudnego tygodnia.</w:t>
+      </w:r>
+    </w:p>
+    <w:p>
+      <w:r>
+        <w:t>Nikomu nie powiedział. Zamierzał sprzedać jedyną piękną rzecz, jaką posiadał, i przeznaczyć te pieniądze po cichu na miejsce, z którego zrezygnował. Żeby znaleziono to w księgach rachunkowych jako anonimowy dar, nie brać za to zasług i nie przyjmować od nikogo podziękowań. Przed podziękowaniami właśnie się wzbraniał i zamierzał się wzbraniać, bez względu na to, ile go to kosztowało.</w:t>
+      </w:r>
+    </w:p>
+    <w:p>
+      <w:r>
+        <w:t>Wtedy uniósł wzrok i mnie zobaczył. Zastygł między mokrą stroną w dłoniach a zegarkiem na stole i nie sięgnął po to, by cokolwiek schować. Po prostu znieruchomiał. Zadbał o to, by nigdy nie zostać przy tym przyłapanym, a jednak został.</w:t>
       </w:r>
     </w:p>
     <w:p>
@@ -5127,7 +5127,7 @@
     <w:p/>
     <w:p>
       <w:r>
-        <w:t xml:space="preserve">— Cegła — zaczęłam. — Miała starą, szarą zaprawę na jednym licu, więc pochodziła ze ściany. W Evergreen leży śnieg od Halloween. Nikt nie podnosił luźnej cegły z tej ulicy. Na całym bloku jest tylko jedna kupka starej cegły. — Postawiłam pokrywkę od cukiernicy za pieprzniczką. — W kontenerze za dawnym lokalem Fenwicków, gdzie wypruła wnętrze, żeby wstawić piece.</w:t>
+        <w:t xml:space="preserve">— Cegła — zaczęłam. — Miała starą, szarą zaprawę na jednym licu, więc pochodziła ze ściany. Na Evergreen leży śnieg od Halloween. Nikt nie podniósł luźnej cegły z tej ulicy. Na całym bloku jest tylko jedna kupka starej cegły. — Postawiłam pokrywkę od cukiernicy za pieprzniczką. — W kontenerze za dawnym lokalem Fenwicków, gdzie wypruła wnętrze, żeby wstawić piece.</w:t>
       </w:r>
     </w:p>
     <w:p/>
@@ -5139,7 +5139,7 @@
     <w:p/>
     <w:p>
       <w:r>
-        <w:t>— Wypadła z jej ściany. Tylko tyle mogę przysiąc. — Położyłam palec na łyżce, w miejscu, gdzie zaułek biegł za sklepami. — Ten kontener stoi otwarty w publicznym zaułku. Bez wieka, bez zamku. Pete obok przechodzi. Dostawcy podjeżdżają pod niego tyłem. Dziecko mogłoby z niego wyciągnąć cegłę. Widziałam gruz na tej cegle i przeczytałam jej nazwisko. Obróćmy to. Gdybyś chciał, żeby miasto patrzyło na Sugarplum, gdzie byś pojechał po cegłę?</w:t>
+        <w:t>— Wypadła z jej ściany. Tylko tyle mogę przysiąc. — Położyłam palec na łyżce, w miejscu, gdzie zaułek biegł za sklepami. — Ten kontener stoi otwarty w publicznym zaułku. Bez wieka, bez zamku. Pete obok przechodzi. Dostawcy podjeżdżają pod niego tyłem. Dziecko mogłoby z niego wyciągnąć cegłę. Widziałam na tej cegle jej gruz i wyczytałam z niego jej nazwisko. Obróćmy to. Gdybyś chciał, żeby miasteczko patrzyło na Sugarplum, gdzie byś poszedł po cegłę?</w:t>
       </w:r>
     </w:p>
     <w:p/>
@@ -5151,7 +5151,7 @@
     <w:p/>
     <w:p>
       <w:r>
-        <w:t xml:space="preserve">— Ktokolwiek rzucił tę cegłę, nie był w gniewie. Przeszła przez złote litery imienia Grety w noc, kiedy na ulicy nie było żywej duszy. A Renée posadziła mnie i wyliczyła mi kolacje parafialne tego miasta. Ona nie chwyta tego, co najbliżej.</w:t>
+        <w:t xml:space="preserve">— Ktokolwiek rzucił tę cegłę, nie był w gniewie. Przeszła przez złote litery imienia Grety w noc, kiedy na ulicy nie było żywej duszy. A Renée posadziła mnie i wyliczyła mi kolacje parafialne tego miasteczka. Ona nie chwyta tego, co najbliżej.</w:t>
       </w:r>
     </w:p>
     <w:p/>
@@ -5163,7 +5163,7 @@
     <w:p/>
     <w:p>
       <w:r>
-        <w:t>— Spojrzałam dwa razy — powiedziałam — i zobaczyłam jej imię, bo poszłam go poszukać.</w:t>
+        <w:t>— Spojrzałam dwa razy — powiedziałam — i zobaczyłam jej nazwisko, bo go szukałam.</w:t>
       </w:r>
     </w:p>
     <w:p/>
@@ -5241,7 +5241,7 @@
     <w:p/>
     <w:p>
       <w:r>
-        <w:t xml:space="preserve">— Mogłaby być. Ale po co jej w ogóle furgonetka? Jej tylne schodki wychodzą na ten zaułek. Mogłaby wyjść przez drzwi, zejść pod próg Grety i z powrotem do domu, nie pokazując się na alei. — Zostawiłam palec na pieprzniczce. — Furgonetka ze zgaszonymi światłami jest dla kogoś, kto musi skądś przyjechać i wrócić tam przed świtem.</w:t>
+        <w:t xml:space="preserve">— Może i tak. Ale po co jej w ogóle furgonetka? Jej tylne schodki wychodzą na ten zaułek. Mogłaby wyjść przez drzwi, zejść pod próg Grety i z powrotem do domu, nie pokazując się na alei. — Zostawiłam palec na pieprzniczce. — Furgonetka ze zgaszonymi światłami jest dla kogoś, kto musi skądś przyjechać i wrócić tam przed świtem.</w:t>
       </w:r>
     </w:p>
     <w:p/>
@@ -5337,7 +5337,7 @@
     <w:p/>
     <w:p>
       <w:r>
-        <w:t xml:space="preserve">— W to wierzyłam. Wtedy Doktor przeszukał w czwartek jej magazyn i nie było tam ani śladu kwaśnej bazy, a ona mi powiedziała, kto jej opowiadał o fugach Grety. — Nie szłam dalej w tym kierunku, skoro zarzekałam się, że dzisiejszej nocy odcinam się od twarzy. — Więc zostaje mi papier. Ulotka leży jako próbny wydruk na czyjejś ladzie na długo przed tym, jak zawiśnie na tablicy. Ktoś ją tam widział. Ktoś wyczytał z niej ten tydzień i napisał skargę do hrabstwa, żeby w niego uderzyła.</w:t>
+        <w:t xml:space="preserve">— W to wierzyłam. Wtedy doktor przeszukał w czwartek jej magazyn i nie było tam ani śladu kwaśnej bazy, a ona mi powiedziała, kto jej opowiadał o fugach Grety. — Nie szłam dalej w tym kierunku, skoro zarzekałam się, że dzisiejszej nocy odcinam się od twarzy. — Więc zostaje mi papier. Ulotka leży jako próbny wydruk na czyjejś ladzie na długo przed tym, jak zawiśnie na tablicy. Ktoś ją tam widział. Ktoś wyczytał z niej ten tydzień i napisał skargę do hrabstwa, żeby w niego uderzyła.</w:t>
       </w:r>
     </w:p>
     <w:p/>
@@ -5384,13 +5384,13 @@
     <w:p/>
     <w:p>
       <w:r>
-        <w:t>— Jessica. Bardzo dobrze — powiedziała Olivia. — Chodź i powiedz Marcie, że nie wariuje.</w:t>
-      </w:r>
-    </w:p>
-    <w:p/>
-    <w:p>
-      <w:r>
-        <w:t xml:space="preserve">— Wcale nie powiedziałam, że wariuję — odparła Martha. — Powiedziałam, że to osobliwe. — Obróciła telefon w moją stronę, żebym mogła zobaczyć rejestr połączeń na podświetlonym ekranie. — Jakaś kobieta dzwoniła do mnie wczoraj, w porze kolacji. Miła. Biznesowa. Powiedziała, że dzwoni z Wendt's Bakehouse z Bridgton i że skoro Holly Jolly jest zamknięte, z przyjemnością zrealizują moje zamówienie z Holly Jolly. Dwa placki czekoladowo-orzechowe i tuzin bułek, gotowe w środę przed Świętem Dziękczynienia. — Opuściła telefon. — To moje zamówienie. Co do jednej bułki.</w:t>
+        <w:t>— Jessico. Dobrze, że jesteś — powiedziała Olivia. — Chodź i powiedz Marcie, że nie wariuje.</w:t>
+      </w:r>
+    </w:p>
+    <w:p/>
+    <w:p>
+      <w:r>
+        <w:t xml:space="preserve">— Wcale nie powiedziałam, że wariuję — odparła Martha. — Powiedziałam, że to osobliwe. — Obróciła telefon w moją stronę, żebym mogła zobaczyć rejestr połączeń na podświetlonym ekranie. — Jakaś kobieta dzwoniła do mnie wczoraj, w porze kolacji. Miła. Biznesowa. Powiedziała, że dzwoni z Wendt's Bakehouse z Bridgton i że skoro Holly Jolly jest zamknięta, z przyjemnością zrealizują moje zamówienie z Holly Jolly. Dwa placki czekoladowo-orzechowe i tuzin bułek, gotowe w środę przed Świętem Dziękczynienia. — Opuściła telefon. — To moje zamówienie. Co do jednej bułki.</w:t>
       </w:r>
     </w:p>
     <w:p/>
@@ -5450,7 +5450,7 @@
     <w:p/>
     <w:p>
       <w:r>
-        <w:t>— Jessica? — odezwała się Olivia.</w:t>
+        <w:t>— Jessico? — odezwała się Olivia.</w:t>
       </w:r>
     </w:p>
     <w:p/>
@@ -5498,7 +5498,7 @@
     <w:p/>
     <w:p>
       <w:r>
-        <w:t xml:space="preserve">— Część do zlewu jeszcze nie dotarła — powiedziała, zanim zdążyłam się przywitać. — Tom założył uszczelki w czwartek. Sama uszczelniłam fugi. A urząd hrabstwa nie przyjdzie, dopóki zlew nie będzie w porządku. — Weszła za ladę. — Usiądź. Wstawię czajnik. Nie mam ci nic do tego podać.</w:t>
+        <w:t xml:space="preserve">— Część do zlewu jeszcze nie dotarła — powiedziała, zanim zdążyłam się przywitać. — Tom założył uszczelki w czwartek. Sama uszczelniłam fugi. A urząd hrabstwa nie przyjdzie ponownie, dopóki zlew nie będzie w porządku. — Weszła za ladę. — Usiądź. Wstawię czajnik. Nie mam ci nic do tego podać.</w:t>
       </w:r>
     </w:p>
     <w:p/>
@@ -5534,7 +5534,7 @@
     <w:p/>
     <w:p>
       <w:r>
-        <w:t>Greta odwróciła się od pieca i spojrzała na mnie ponuro. — Nikt nie dotyka tego zeszytu oprócz mnie.</w:t>
+        <w:t>Greta odwróciła się od pieca i zmarszczyła brwi. — Nikt nie dotyka tego zeszytu oprócz mnie.</w:t>
       </w:r>
     </w:p>
     <w:p/>
@@ -5757,7 +5757,7 @@
     </w:p>
     <w:p>
       <w:r>
-        <w:t>— Wylądował w koszu, Jessica. — Głos Grety był płaski i zmęczony, a po chwili dodała: — Stillwater. Stillwater coś tam. Zapamiętałam, bo brzmiało jak dom pogrzebowy, i tak też powiedziałam koszowi na śmieci.</w:t>
+        <w:t>— Wylądował w koszu, Jessico. — Głos Grety był płaski i zmęczony, a po chwili dodała: — Stillwater. Stillwater coś tam. Zapamiętałam, bo brzmiało jak dom pogrzebowy, i tak też powiedziałam koszowi na śmieci.</w:t>
       </w:r>
     </w:p>
     <w:p>
@@ -5846,7 +5846,7 @@
     </w:p>
     <w:p>
       <w:r>
-        <w:t>— Jessica — powiedziała. — To ta Joyce od Grety.</w:t>
+        <w:t>— Jessico — powiedziała. — To ta Joyce od Grety.</w:t>
       </w:r>
     </w:p>
     <w:p>
@@ -6000,7 +6000,7 @@
     </w:p>
     <w:p>
       <w:r>
-        <w:t>Oddzwoniła po kolacji, kiedy miski po zupie stały już w zlewie, a Nick rozsiadł się w fotelu przy piecu, z drzemiącą u jego stóp Pip leżącą na furgonetce.</w:t>
+        <w:t>Oddzwoniła po kolacji, kiedy miski po zupie stały już w zlewie, a Nick rozsiadł się w fotelu przy piecu, z Pip drzemiącą u jego stóp na kartce z furgonetką.</w:t>
       </w:r>
     </w:p>
     <w:p>
@@ -6024,7 +6024,7 @@
     </w:p>
     <w:p>
       <w:r>
-        <w:t>— Już wysłał mi maila ze specyfikacją produktu, a ja przekazałam ją doktorowi — dodała. — Doktor mówi, żebyś wpadła dzisiaj wieczorem, jeśli chcesz popatrzeć. Dobranoc, Jessica.</w:t>
+        <w:t>— Już wysłał mi maila ze specyfikacją produktu, a ja przekazałam ją doktorowi — dodała. — Doktor mówi, żebyś wpadła dzisiaj wieczorem, jeśli chcesz popatrzeć. Dobranoc, Jessico.</w:t>
       </w:r>
     </w:p>
     <w:p>
@@ -6100,7 +6100,7 @@
     </w:p>
     <w:p>
       <w:r>
-        <w:t>Sprawa trafiła więc w ręce wymiaru sprawiedliwości — na biurko kobiety, której praca polegała na weryfikowaniu tego, pod czym ludzie przysięgali. Jeśli chociaż jeden element był błędny, znalazłaby to, zanim zdążyłoby komukolwiek zaszkodzić. Jeśli wszystko było spójne, znajdzie się to na papierze, a nazwisko Grety zostanie jej zwrócone na piśmie, którego nikt nie zdoła podważyć po drugiej stronie lady.</w:t>
+        <w:t>Sprawa miała więc trafić w ręce wymiaru sprawiedliwości — na biurko kobiety, której praca polegała na weryfikowaniu tego, pod czym ludzie przysięgali. Jeśli chociaż jeden element był błędny, znalazłaby to, zanim zdążyłoby komukolwiek zaszkodzić. Jeśli wszystko było spójne, znajdzie się to na papierze, a nazwisko Grety zostanie jej zwrócone na piśmie, którego nikt nie zdoła podważyć po drugiej stronie lady.</w:t>
       </w:r>
     </w:p>
     <w:p>
@@ -6145,7 +6145,7 @@
     </w:p>
     <w:p>
       <w:r>
-        <w:t>— Jessica — odezwała się Tanaka. — Usiądź.</w:t>
+        <w:t>— Jessico — odezwała się Tanaka. — Usiądź.</w:t>
       </w:r>
     </w:p>
     <w:p>
@@ -6170,7 +6170,7 @@
     </w:p>
     <w:p>
       <w:r>
-        <w:t xml:space="preserve">— W skardze chłodnię nazwano zimnym pokojem, a zlew umywalkowy zlewem Hobarta. Greta twierdzi, że nikt tak na nie nie mówił od czasów Joyce. Kłódki na bramie podwórka nigdy nie wymieniono, a Pete twierdzi, że ciągle spada z łańcucha. I kwaszenie ustało dokładnie tego ranka, kiedy Greta zaczęła ryglować tylne drzwi po incydencie z cegłą, więc sprawca wchodził właśnie tędy. Pete widział furgonetkę koło apteki przed świtem, bez włączonych świateł, i nie należała ona do dostawcy mięsa. Wczoraj spojrzał na wydruk przesłany przez Claire z furgonetką Wendt's Bakehouse i powiedział: „To ta”.</w:t>
+        <w:t xml:space="preserve">— W skardze chłodnię nazwano zimnym pokojem, a zlew umywalkowy zlewem Hobarta. Greta twierdzi, że nikt tak na nie nie mówił od czasów Joyce. Kłódki na bramie podwórka nigdy nie wymieniono, a Pete twierdzi, że ciągle spada z łańcucha. I kwaszenie ustało dokładnie tego ranka, kiedy Greta zaczęła ryglować tylne drzwi po incydencie z cegłą, więc sprawca wchodził właśnie tędy. Pete widział furgonetkę koło apteki przed świtem, bez włączonych świateł, i nie należała ona do dostawcy mięsa. Wczoraj spojrzał na wydruk od Claire z furgonetką Wendt's Bakehouse i powiedział: „To ta”.</w:t>
       </w:r>
     </w:p>
     <w:p>
@@ -6225,7 +6225,7 @@
     </w:p>
     <w:p>
       <w:r>
-        <w:t xml:space="preserve">— Będę jej chcieć. Skąd się wzięła, jest prawdopodobne, nie udowodnione. — Napisała linijkę i podkreśliła ją. — I ten karton, który widział chłopak. Ze złotem na etykiecie, tak mówiłaś.</w:t>
+        <w:t xml:space="preserve">— Będę jej potrzebować. Skąd się wzięła, jest prawdopodobne, nie udowodnione. — Napisała linijkę i podkreśliła ją. — I ten karton, który widział chłopak. Ze złotem na etykiecie, tak mówiłaś.</w:t>
       </w:r>
     </w:p>
     <w:p>
@@ -6245,7 +6245,7 @@
     </w:p>
     <w:p>
       <w:r>
-        <w:t xml:space="preserve">— Tak samo jak ostatnio. Żadnych zasadzek. — Stuknęła raz w faktury. — Nikt nie siedzi w zaułku w ciemności, czekając, aż ona wróci z workiem. Nie muszę jej na tym przyłapać. Poproszę ją, żeby przyszła po południu, wyłożę jej wszystko prosto w oczy a ona będzie mogła na to odpowiedzieć.</w:t>
+        <w:t xml:space="preserve">— Tak samo jak ostatnio. Żadnych zasadzek. — Stuknęła raz w faktury. — Nikt nie siedzi w zaułku w ciemności, czekając, aż ona wróci z workiem. Nie muszę jej na tym przyłapać. Poproszę ją, żeby przyszła po południu, wyłożę jej wszystko prosto w oczy, a ona będzie mogła na to odpowiedzieć.</w:t>
       </w:r>
     </w:p>
     <w:p>
@@ -6255,7 +6255,7 @@
     </w:p>
     <w:p>
       <w:r>
-        <w:t>— A potem postawienie zarzutów to moja robota, i to następuje później. — Na kąciku jej ust pojawił się i zniknął suchy, ciepły uśmiech. — Siedziałam z tobą w salonie Fiony w zeszłym miesiącu. Wiem, jak lubisz, żeby to było załatwiane. Lubię, żeby robiono to w ten sam sposób.</w:t>
+        <w:t>— A potem postawienie zarzutów to moja robota, i to następuje później. — Na kąciku jej ust pojawił się i zniknął suchy, ciepły uśmiech. — Siedziałam z tobą w salonie Fiony w zeszłym miesiącu. Wiem, jak lubisz, żeby to było załatwiane. Ja też wolę to robić w ten sposób.</w:t>
       </w:r>
     </w:p>
     <w:p>
@@ -6365,7 +6365,7 @@
     </w:p>
     <w:p>
       <w:r>
-        <w:t>— Pani Wendt, z tej strony Noriko Tanaka, szefowa policji w Frost Falls. Rozmawiam z kilkoma osobami na temat tego, co stało się w Holly Jolly, i chciałabym, żeby wpadła pani na posterunek dziś po południu. O drugiej?</w:t>
+        <w:t>— Pani Wendt, z tej strony Noriko Tanaka, szefowa policji we Frost Falls. Rozmawiam z kilkoma osobami na temat tego, co stało się w Holly Jolly, i chciałabym, żeby wpadła pani na posterunek dziś po południu. O drugiej?</w:t>
       </w:r>
     </w:p>
     <w:p>
@@ -6431,7 +6431,7 @@
     <w:p/>
     <w:p>
       <w:r>
-        <w:t>Pip wyszła spod stołu na tyle, by podnieść głowę na wysokość jego krawędzi, i spojrzała na leżący obok papierowego worka ciężki pęk kluczy z tym ponurym, chciwym zainteresowaniem, z jakim traktowała każdą błyskotkę, którą ktoś położył i zapomniał.</w:t>
+        <w:t>Pip wyszła spod stołu na tyle, by podnieść głowę na wysokość jego krawędzi, i spojrzała na leżący obok papierowego worka ciężki pęk kluczy z tym poważnym, chciwym zainteresowaniem, z jakim traktowała każdą błyskotkę, którą ktoś położył i zapomniał.</w:t>
       </w:r>
     </w:p>
     <w:p/>
@@ -6635,7 +6635,7 @@
     <w:p/>
     <w:p>
       <w:r>
-        <w:t xml:space="preserve">— Pozwoliłam ci odejść — odezwała się w końcu Greta, a z jej głosu zniknęła ostrość. — To prawda. Przyznaję ci to. Kłóciłyśmy się o piece, kłóciłyśmy się o szyld, kłóciłyśmy się o otwieranie w niedziele, a kiedy powiedziałaś, że chcesz odejść, cieszyłam się, Bóg mi świadkiem, cieszyłam się, że będę miała jedną kuchnię i jeden sposób robienia w niej rzeczy. Powinnam była walczyć, żebyś została. Nie zrobiłam tego. To moja wina. — Wzięła oddech. — A ta kartka to był Theo, który prosił mnie o coś do włożenia do środka, a ja pisałam to przy ladzie między klientami, nawet o tym nie myśląc. Nie pomyślałam o tobie. To też moja wina.</w:t>
+        <w:t xml:space="preserve">— Pozwoliłam ci odejść — odezwała się w końcu Greta, a z jej głosu zniknęła ostrość. — To prawda. Przyznaję ci to. Kłóciłyśmy się o piece, kłóciłyśmy się o szyld, kłóciłyśmy się o otwieranie w niedziele, a kiedy powiedziałaś, że chcesz odejść, cieszyłam się, niech mi Bóg wybaczy, cieszyłam się, że będę miała jedną kuchnię i jeden sposób robienia w niej rzeczy. Powinnam była walczyć, żebyś została. Nie zrobiłam tego. To moja wina. — Wzięła oddech. — A ta kartka to był Theo, który prosił mnie o coś do włożenia do środka, a ja pisałam to przy ladzie między klientami, nawet o tym nie myśląc. Nie pomyślałam o tobie. To też moja wina.</w:t>
       </w:r>
     </w:p>
     <w:p/>
@@ -6898,7 +6898,7 @@
     <w:p/>
     <w:p>
       <w:r>
-        <w:t>Wracając Evergreen, minęłam Holly Jolly. Wciąż było zamknięte, żółte zawiadomienie hrabstwa wisiało na szybie, dopóki Varney nie przyszedł go zdjąć, ale z tyłu paliło się światło i przy drzwiach czuć było zapach wypieków, mimo że nie miała jeszcze nikomu nic do sprzedania. Nie pukałam. Przekazanie wyliczeń należało do szefowej.</w:t>
+        <w:t>Wracając Evergreen, minęłam Holly Jolly. Wciąż była zamknięta, żółte zawiadomienie hrabstwa miało wisieć na szybie, dopóki Varney nie przyjdzie go zdjąć, ale z tyłu paliło się światło i przy drzwiach czuć było zapach wypieków, mimo że nie miała jeszcze nikomu nic do sprzedania. Nie pukałam. Przekazanie wyliczeń należało do szefowej.</w:t>
       </w:r>
     </w:p>
     <w:p/>
@@ -7036,7 +7036,7 @@
     <w:p/>
     <w:p>
       <w:r>
-        <w:t>— I co?</w:t>
+        <w:t>— A było?</w:t>
       </w:r>
     </w:p>
     <w:p/>
@@ -7137,7 +7137,7 @@
     </w:p>
     <w:p>
       <w:r>
-        <w:t xml:space="preserve">Hal przyszedł po pudło do beczki z żywnością, po którą zawsze przychodził, i kupił w dodatku trzy kolejne.</w:t>
+        <w:t xml:space="preserve">Hal przyszedł po pudło do beczki z żywnością, po które zawsze przychodził, i kupił w dodatku trzy kolejne.</w:t>
       </w:r>
     </w:p>
     <w:p>
@@ -7224,7 +7224,7 @@
     </w:p>
     <w:p>
       <w:r>
-        <w:t>— Jedno popołudnie, Jessica. A na dokładkę będą pieniądze z sądu, co do centa za to, co zmarnowała. Szefowa odczytała mi kwotę, o jaką wystąpią. — Nacisnęła szufladę nasadą dłoni i w końcu dała za wygraną. — Byłam na minusie. Nie będę udawać, że nie. Leżałam po nocach i robiłam rachunki, a miasteczko oddało mi to w jedno popołudnie i nikt nie nazywał tego charytatywną pomocą. Nazywali to poniedziałkiem. — Spojrzała przez zaparowaną szybę na kolejkę, która wciąż tupała w zimnie po cynamonowe bułeczki, a ona już zagniatała kolejne ciasto.</w:t>
+        <w:t>— Jedno popołudnie, Jessico. A na dokładkę będą pieniądze z sądu, co do centa za wszystko, co ona zepsuła. Szefowa odczytała mi kwotę, o jaką wystąpią. — Nacisnęła szufladę nasadą dłoni i w końcu dała za wygraną. — Byłam na minusie. Nie będę udawać, że nie. Leżałam po nocach i robiłam rachunki, a miasteczko oddało mi to w jedno popołudnie i nikt nie nazywał tego charytatywną pomocą. Nazywali to poniedziałkiem. — Spojrzała przez zaparowaną szybę na kolejkę, która wciąż tupała w zimnie po cynamonowe bułeczki, a ona już zagniatała kolejne ciasto.</w:t>
       </w:r>
     </w:p>
     <w:p>
@@ -7251,7 +7251,7 @@
     </w:p>
     <w:p>
       <w:r>
-        <w:t>— Nie pozwoliłaś im zrobić z tego mojej mąki — oświadczyła.</w:t>
+        <w:t>— Nie pozwoliłaś, żeby zwalili to na moją mąkę — oświadczyła.</w:t>
       </w:r>
     </w:p>
     <w:p>
@@ -7291,7 +7291,7 @@
     </w:p>
     <w:p>
       <w:r>
-        <w:t xml:space="preserve">Była prostsza droga. Kilka tygodni temu pan Worthington oferował pokrycie całej sumy jednym czekiem. Poprosiłam go, żeby te pieniądze zatrzymał, i podczas zimnego spaceru do domu zastanawiałam się, czy postąpiłam mądrze, czy tylko uparcie. Teraz już wiedziałam. Stałam na ubitym śniegu na rynku o wczesnej, szarej godzinie, z obłoczkami pary ulatniającymi się z ust, podczas gdy pierwsze sanki i dwukołówki jechały aleją w stronę zielonych drzwi Towarzystwa. Jego oferta nadal była aktualna, gdyby miastu zabrakło funduszy, ale nie zamierzałam po nią sięgać, chyba że nie mielibyśmy innego wyjścia. Jeśli miasto zapłaci za własny dach, budynek będzie należał do miasta, aż po jego zmrożone fundamenty. To był poranek, w którym płaciliśmy.</w:t>
+        <w:t xml:space="preserve">Była prostsza droga. Kilka tygodni temu pan Worthington oferował pokrycie całej sumy jednym czekiem. Poprosiłam go, żeby te pieniądze zatrzymał, i podczas zimnego spaceru do domu zastanawiałam się, czy postąpiłam mądrze, czy tylko uparcie. Teraz już wiedziałam. Stałam na ubitym śniegu na rynku o wczesnej, szarej godzinie, z obłoczkami pary ulatniającymi się z ust, podczas gdy pierwsze sanki i dwukołówki jechały aleją w stronę zielonych drzwi Towarzystwa. Jego oferta nadal była aktualna, gdyby miasteczku zabrakło funduszy, ale nie zamierzałam po nią sięgać, chyba że nie mielibyśmy innego wyjścia. Jeśli miasteczko zapłaci za własny dach, budynek będzie należał do miasteczka, aż po jego zmrożone fundamenty. To był poranek, w którym płaciliśmy.</w:t>
       </w:r>
     </w:p>
     <w:p>
@@ -7306,7 +7306,7 @@
     </w:p>
     <w:p>
       <w:r>
-        <w:t>— Ekipa od dachu na górę, ekipa od pieca na dół — zawołał Hal. Nie musiał mówić głośno. Wszyscy już zgodzili się na tę pracę i potrzebowali tylko informacji, gdzie stanąć. — Uważajcie na drabiny, są oblodzone. Kelly cały dzień parzy kawę w Starlight. Przyniosą wam ją. Nie odchodzicie od pracy, żeby po nią iść.</w:t>
+        <w:t>— Ekipa od dachu na górę, ekipa od pieca na dół — zawołał Hal. Nie musiał mówić głośno. Wszyscy już zgodzili się na tę pracę i potrzebowali tylko informacji, gdzie stanąć. — Uważajcie na drabiny, są oblodzone. Kelly cały dzień parzy kawę w Starlight. Przyniosą wam ją. Nie odchodźcie od pracy, żeby po nią iść.</w:t>
       </w:r>
     </w:p>
     <w:p>
@@ -7386,7 +7386,7 @@
     </w:p>
     <w:p>
       <w:r>
-        <w:t>Wnosił gonty po oblodzonej drabinie, podawał je mężczyznom na kalenicy i schodził po następne. Nigdy nie mówił, jak należy to robić, chociaż znał ten budynek lepiej niż ktokolwiek na dachu i każdy obecny o tym wiedział. Nie przywrócono mu dawnego stanowiska. I nie nastąpiłoby to tej zimy; przyjął to równie cicho, jak wtedy, gdy z kolanami oblepionymi bibułą pracował nad renowacją w zimnym tylnym pokoju. Nikt nie zapomniał ubiegłego miesiąca, a on najmniej ze wszystkich. Pozwolono mu jednak nosić gonty i nosił je. Kiedy myślał, że nikt na niego nie patrzy, jego twarz była spokojniejsza niż kiedykolwiek od Halloween.</w:t>
+        <w:t>Wnosił gonty po oblodzonej drabinie, podawał je mężczyznom na kalenicy i schodził po następne. Nigdy nie mówił, jak należy to robić, chociaż znał ten budynek lepiej niż ktokolwiek na dachu i każdy obecny o tym wiedział. Nie przywrócono mu dawnego stanowiska. I nie nastąpiłoby to tej zimy; przyjął to równie cicho, jak wtedy, gdy na kolanach osuszał bibułą papiery w zimnym tylnym pokoju. Nikt nie zapomniał ubiegłego miesiąca, a on najmniej ze wszystkich. Pozwolono mu jednak nosić gonty i nosił je. Kiedy myślał, że nikt na niego nie patrzy, jego twarz była spokojniejsza niż kiedykolwiek od Halloween.</w:t>
       </w:r>
     </w:p>
     <w:p>
@@ -7459,7 +7459,7 @@
     </w:p>
     <w:p>
       <w:r>
-        <w:t xml:space="preserve">W przednim oknie, bezpieczne w gablocie za czystą szybą, stara skrzynka stała zapieczętowana. Niczyja dłoń go nie dotknęła. Jego kartka się nie zmieniła i nie zmieni się przed Nowym Rokiem.</w:t>
+        <w:t xml:space="preserve">W przednim oknie, bezpieczna w gablocie za czystą szybą, stara skrzynka stała zapieczętowana. Niczyja dłoń jej nie dotknęła. Jej kartka się nie zmieniła i nie zmieni się przed Nowym Rokiem.</w:t>
       </w:r>
     </w:p>
     <w:p>
@@ -7519,7 +7519,7 @@
     </w:p>
     <w:p>
       <w:r>
-        <w:t xml:space="preserve">Kobiety z kręgu włożyły mały wieniec, który uplotłyśmy z suszonej jodły i jagód; ten sam zielony stroisz, jaki powiesiliśmy w każdym oknie.</w:t>
+        <w:t xml:space="preserve">Kobiety z kręgu włożyły mały wieniec, który uplotłyśmy z suszonej jodły i jagód; ten sam zielony stroisz, jaki powiesiłyśmy w każdym oknie.</w:t>
       </w:r>
     </w:p>
     <w:p>
@@ -7604,7 +7604,7 @@
     </w:p>
     <w:p>
       <w:r>
-        <w:t xml:space="preserve">Nie były to jej kakaowe bułeczki. Miasto znało je już na pamięć. Wypisała na porządnej kartce przepis na piernik, który jej babcia przywiozła ze starych stron, ten sam, o którym mawiała, że nie dała go żywej duszy i nie zamierza zaczynać. Potem złożyła kartkę na pół i wsunęła do cedrowego pudełka.</w:t>
+        <w:t xml:space="preserve">Nie były to jej kakaowe bułeczki. Miasteczko znało je już na pamięć. Wypisała na porządnej kartce przepis na piernik, który jej babcia przywiozła ze starych stron, ten sam, o którym mawiała, że nie dała go żywej duszy i nie zamierza zaczynać. Potem złożyła kartkę na pół i wsunęła do cedrowego pudełka.</w:t>
       </w:r>
     </w:p>
     <w:p>
@@ -7848,7 +7848,7 @@
     <w:p/>
     <w:p>
       <w:r>
-        <w:t>— Nie, ty mały żebraku. Wiem, co dla mnie zrobiłaś, i nie pozwolę nikomu mówić, że jestem niewdzięczna, ale odpowiedź nadal brzmi: nie. — Sięgnęła jednak pod ladę, wyciągnęła sardynkę zawiniętą w kawałek woskowanego papieru i upuściła ją. — To. Tylko to. Kupiłam dla ciebie puszkę i ani mi się waź mówić inspektorowi sanitarnemu, że karmię ptaki z podłogi. Mam dość inspektorów jak na jedną jesień.</w:t>
+        <w:t>— Nie, ty mała żebraczko. Wiem, co dla mnie zrobiłaś, i nie pozwolę nikomu mówić, że jestem niewdzięczna, ale odpowiedź nadal brzmi: nie. — Sięgnęła jednak pod ladę, wyciągnęła sardynkę zawiniętą w kawałek woskowanego papieru i upuściła ją. — To. Tylko to. Kupiłam dla ciebie puszkę i ani mi się waź mówić inspektorowi sanitarnemu, że karmię ptaki z podłogi. Mam dość inspektorów jak na jedną jesień.</w:t>
       </w:r>
     </w:p>
     <w:p/>

</xml_diff>